<commit_message>
SPAGETTI CODE DO NOT USE
</commit_message>
<xml_diff>
--- a/server/assets/templates/offer.docx
+++ b/server/assets/templates/offer.docx
@@ -15,7 +15,7 @@
           <w:bottom w:w="0" w:type="dxa"/>
           <w:end w:w="70" w:type="dxa"/>
         </w:tblCellMar>
-        <w:tblLook w:val="0000" w:noHBand="0" w:noVBand="0" w:firstColumn="0" w:lastRow="0" w:lastColumn="0" w:firstRow="0"/>
+        <w:tblLook w:val="0000" w:noVBand="0" w:noHBand="0" w:lastColumn="0" w:firstColumn="0" w:lastRow="0" w:firstRow="0"/>
       </w:tblPr>
       <w:tblGrid>
         <w:gridCol w:w="2055"/>
@@ -552,7 +552,7 @@
           <w:bottom w:w="0" w:type="dxa"/>
           <w:end w:w="108" w:type="dxa"/>
         </w:tblCellMar>
-        <w:tblLook w:val="01e0" w:noHBand="0" w:noVBand="0" w:firstColumn="1" w:lastRow="1" w:lastColumn="1" w:firstRow="1"/>
+        <w:tblLook w:val="01e0" w:noVBand="0" w:noHBand="0" w:lastColumn="1" w:firstColumn="1" w:lastRow="1" w:firstRow="1"/>
       </w:tblPr>
       <w:tblGrid>
         <w:gridCol w:w="4593"/>
@@ -1006,7 +1006,7 @@
           <w:b/>
           <w:bCs/>
         </w:rPr>
-        <w:t>{duration} Jahr(e)</w:t>
+        <w:t>{duration}</w:t>
       </w:r>
     </w:p>
     <w:p>
@@ -1098,7 +1098,21 @@
           <w:b/>
           <w:bCs/>
         </w:rPr>
-        <w:t>Keepit für {products}</w:t>
+        <w:t>Keepit für {</w:t>
+      </w:r>
+      <w:r>
+        <w:rPr>
+          <w:b/>
+          <w:bCs/>
+        </w:rPr>
+        <w:t>names</w:t>
+      </w:r>
+      <w:r>
+        <w:rPr>
+          <w:b/>
+          <w:bCs/>
+        </w:rPr>
+        <w:t>}</w:t>
       </w:r>
     </w:p>
     <w:p>
@@ -1217,7 +1231,7 @@
           <w:b/>
           <w:bCs/>
         </w:rPr>
-        <w:t xml:space="preserve"> {duration} Jahr(e)</w:t>
+        <w:t xml:space="preserve"> {duration}</w:t>
       </w:r>
     </w:p>
     <w:p>
@@ -1449,15 +1463,15 @@
           <w:bottom w:w="0" w:type="dxa"/>
           <w:end w:w="70" w:type="dxa"/>
         </w:tblCellMar>
-        <w:tblLook w:val="0000" w:noHBand="0" w:noVBand="0" w:firstColumn="0" w:lastRow="0" w:lastColumn="0" w:firstRow="0"/>
+        <w:tblLook w:val="0000" w:noVBand="0" w:noHBand="0" w:lastColumn="0" w:firstColumn="0" w:lastRow="0" w:firstRow="0"/>
       </w:tblPr>
       <w:tblGrid>
-        <w:gridCol w:w="610"/>
+        <w:gridCol w:w="305"/>
+        <w:gridCol w:w="305"/>
         <w:gridCol w:w="4667"/>
         <w:gridCol w:w="1099"/>
-        <w:gridCol w:w="990"/>
-        <w:gridCol w:w="992"/>
-        <w:gridCol w:w="1207"/>
+        <w:gridCol w:w="1535"/>
+        <w:gridCol w:w="1654"/>
       </w:tblGrid>
       <w:tr>
         <w:trPr>
@@ -1466,6 +1480,7 @@
         <w:tc>
           <w:tcPr>
             <w:tcW w:w="610" w:type="dxa"/>
+            <w:gridSpan w:val="2"/>
             <w:tcBorders>
               <w:top w:val="single" w:sz="4" w:space="0" w:color="000000"/>
               <w:bottom w:val="single" w:sz="4" w:space="0" w:color="000000"/>
@@ -1547,7 +1562,7 @@
         </w:tc>
         <w:tc>
           <w:tcPr>
-            <w:tcW w:w="990" w:type="dxa"/>
+            <w:tcW w:w="1535" w:type="dxa"/>
             <w:tcBorders>
               <w:top w:val="single" w:sz="4" w:space="0" w:color="000000"/>
               <w:bottom w:val="single" w:sz="4" w:space="0" w:color="000000"/>
@@ -1593,53 +1608,7 @@
         </w:tc>
         <w:tc>
           <w:tcPr>
-            <w:tcW w:w="992" w:type="dxa"/>
-            <w:tcBorders>
-              <w:top w:val="single" w:sz="4" w:space="0" w:color="000000"/>
-              <w:bottom w:val="single" w:sz="4" w:space="0" w:color="000000"/>
-            </w:tcBorders>
-            <w:vAlign w:val="center"/>
-          </w:tcPr>
-          <w:p>
-            <w:pPr>
-              <w:pStyle w:val="Tabellenberschrift"/>
-              <w:spacing w:before="80" w:after="80"/>
-              <w:jc w:val="center"/>
-              <w:rPr>
-                <w:sz w:val="16"/>
-                <w:szCs w:val="16"/>
-              </w:rPr>
-            </w:pPr>
-            <w:r>
-              <w:rPr>
-                <w:sz w:val="16"/>
-                <w:szCs w:val="16"/>
-              </w:rPr>
-              <w:t>Summe</w:t>
-            </w:r>
-          </w:p>
-          <w:p>
-            <w:pPr>
-              <w:pStyle w:val="Tabellenberschrift"/>
-              <w:spacing w:before="80" w:after="80"/>
-              <w:jc w:val="center"/>
-              <w:rPr>
-                <w:sz w:val="16"/>
-                <w:szCs w:val="16"/>
-              </w:rPr>
-            </w:pPr>
-            <w:r>
-              <w:rPr>
-                <w:sz w:val="16"/>
-                <w:szCs w:val="16"/>
-              </w:rPr>
-              <w:t>12 Monate</w:t>
-            </w:r>
-          </w:p>
-        </w:tc>
-        <w:tc>
-          <w:tcPr>
-            <w:tcW w:w="1207" w:type="dxa"/>
+            <w:tcW w:w="1654" w:type="dxa"/>
             <w:tcBorders>
               <w:top w:val="single" w:sz="4" w:space="0" w:color="000000"/>
               <w:bottom w:val="single" w:sz="4" w:space="0" w:color="000000"/>
@@ -1690,7 +1659,37 @@
         </w:trPr>
         <w:tc>
           <w:tcPr>
-            <w:tcW w:w="610" w:type="dxa"/>
+            <w:tcW w:w="305" w:type="dxa"/>
+            <w:tcBorders>
+              <w:top w:val="single" w:sz="4" w:space="0" w:color="7F7F7F"/>
+              <w:bottom w:val="single" w:sz="4" w:space="0" w:color="7F7F7F"/>
+            </w:tcBorders>
+            <w:shd w:color="auto" w:fill="BFBFBF" w:themeFill="background1" w:themeFillShade="bf" w:val="clear"/>
+          </w:tcPr>
+          <w:p>
+            <w:pPr>
+              <w:pStyle w:val="Normal"/>
+              <w:spacing w:lineRule="auto" w:line="240" w:before="60" w:after="60"/>
+              <w:ind w:start="288"/>
+              <w:jc w:val="center"/>
+              <w:rPr>
+                <w:color w:val="000000"/>
+                <w:sz w:val="16"/>
+                <w:szCs w:val="16"/>
+              </w:rPr>
+            </w:pPr>
+            <w:r>
+              <w:rPr>
+                <w:color w:val="000000"/>
+                <w:sz w:val="16"/>
+                <w:szCs w:val="16"/>
+              </w:rPr>
+            </w:r>
+          </w:p>
+        </w:tc>
+        <w:tc>
+          <w:tcPr>
+            <w:tcW w:w="305" w:type="dxa"/>
             <w:tcBorders>
               <w:top w:val="single" w:sz="4" w:space="0" w:color="7F7F7F"/>
               <w:bottom w:val="single" w:sz="4" w:space="0" w:color="7F7F7F"/>
@@ -1721,7 +1720,7 @@
         <w:tc>
           <w:tcPr>
             <w:tcW w:w="8955" w:type="dxa"/>
-            <w:gridSpan w:val="5"/>
+            <w:gridSpan w:val="4"/>
             <w:tcBorders>
               <w:top w:val="single" w:sz="4" w:space="0" w:color="7F7F7F"/>
               <w:bottom w:val="single" w:sz="4" w:space="0" w:color="7F7F7F"/>
@@ -1742,15 +1741,7 @@
                 <w:b/>
                 <w:lang w:val="en-US"/>
               </w:rPr>
-              <w:t>Keepit - Backup {names} Advanced</w:t>
-            </w:r>
-            <w:r>
-              <w:rPr>
-                <w:color w:themeColor="background1" w:themeShade="bf" w:val="BFBFBF"/>
-                <w:sz w:val="16"/>
-                <w:szCs w:val="16"/>
-              </w:rPr>
-              <w:t>0,00</w:t>
+              <w:t xml:space="preserve">Keepit - Backup {names} </w:t>
             </w:r>
           </w:p>
         </w:tc>
@@ -1762,6 +1753,7 @@
         <w:tc>
           <w:tcPr>
             <w:tcW w:w="610" w:type="dxa"/>
+            <w:gridSpan w:val="2"/>
             <w:tcBorders>
               <w:top w:val="single" w:sz="4" w:space="0" w:color="7F7F7F"/>
               <w:bottom w:val="single" w:sz="4" w:space="0" w:color="7F7F7F"/>
@@ -1821,7 +1813,27 @@
                 <w:szCs w:val="16"/>
                 <w:lang w:val="en-US"/>
               </w:rPr>
-              <w:t>{#products}{name}</w:t>
+              <w:t>{#products}{</w:t>
+            </w:r>
+            <w:r>
+              <w:rPr>
+                <w:rFonts w:cs="Arial"/>
+                <w:b/>
+                <w:sz w:val="16"/>
+                <w:szCs w:val="16"/>
+                <w:lang w:val="en-US"/>
+              </w:rPr>
+              <w:t>name</w:t>
+            </w:r>
+            <w:r>
+              <w:rPr>
+                <w:rFonts w:cs="Arial"/>
+                <w:b/>
+                <w:sz w:val="16"/>
+                <w:szCs w:val="16"/>
+                <w:lang w:val="en-US"/>
+              </w:rPr>
+              <w:t>}</w:t>
             </w:r>
           </w:p>
           <w:p>
@@ -1880,7 +1892,7 @@
         </w:tc>
         <w:tc>
           <w:tcPr>
-            <w:tcW w:w="990" w:type="dxa"/>
+            <w:tcW w:w="1535" w:type="dxa"/>
             <w:tcBorders>
               <w:top w:val="single" w:sz="4" w:space="0" w:color="7F7F7F"/>
               <w:bottom w:val="single" w:sz="4" w:space="0" w:color="7F7F7F"/>
@@ -1906,41 +1918,13 @@
                 <w:szCs w:val="16"/>
                 <w:lang w:val="en-US"/>
               </w:rPr>
+              <w:t>{prices.price_1}</w:t>
             </w:r>
           </w:p>
         </w:tc>
         <w:tc>
           <w:tcPr>
-            <w:tcW w:w="992" w:type="dxa"/>
-            <w:tcBorders>
-              <w:top w:val="single" w:sz="4" w:space="0" w:color="7F7F7F"/>
-              <w:bottom w:val="single" w:sz="4" w:space="0" w:color="7F7F7F"/>
-            </w:tcBorders>
-            <w:vAlign w:val="center"/>
-          </w:tcPr>
-          <w:p>
-            <w:pPr>
-              <w:pStyle w:val="Normal"/>
-              <w:spacing w:lineRule="auto" w:line="240" w:before="60" w:after="60"/>
-              <w:jc w:val="end"/>
-              <w:rPr>
-                <w:color w:val="000000"/>
-                <w:sz w:val="16"/>
-                <w:szCs w:val="16"/>
-              </w:rPr>
-            </w:pPr>
-            <w:r>
-              <w:rPr>
-                <w:color w:val="000000"/>
-                <w:sz w:val="16"/>
-                <w:szCs w:val="16"/>
-              </w:rPr>
-            </w:r>
-          </w:p>
-        </w:tc>
-        <w:tc>
-          <w:tcPr>
-            <w:tcW w:w="1207" w:type="dxa"/>
+            <w:tcW w:w="1654" w:type="dxa"/>
             <w:tcBorders>
               <w:top w:val="single" w:sz="4" w:space="0" w:color="7F7F7F"/>
               <w:bottom w:val="single" w:sz="4" w:space="0" w:color="7F7F7F"/>
@@ -2002,6 +1986,7 @@
         <w:tc>
           <w:tcPr>
             <w:tcW w:w="610" w:type="dxa"/>
+            <w:gridSpan w:val="2"/>
             <w:tcBorders>
               <w:bottom w:val="single" w:sz="4" w:space="0" w:color="7F7F7F"/>
             </w:tcBorders>
@@ -2137,7 +2122,7 @@
         </w:tc>
         <w:tc>
           <w:tcPr>
-            <w:tcW w:w="990" w:type="dxa"/>
+            <w:tcW w:w="1535" w:type="dxa"/>
             <w:tcBorders>
               <w:bottom w:val="single" w:sz="4" w:space="0" w:color="7F7F7F"/>
             </w:tcBorders>
@@ -2167,35 +2152,7 @@
         </w:tc>
         <w:tc>
           <w:tcPr>
-            <w:tcW w:w="992" w:type="dxa"/>
-            <w:tcBorders>
-              <w:bottom w:val="single" w:sz="4" w:space="0" w:color="7F7F7F"/>
-            </w:tcBorders>
-            <w:vAlign w:val="center"/>
-          </w:tcPr>
-          <w:p>
-            <w:pPr>
-              <w:pStyle w:val="Normal"/>
-              <w:spacing w:lineRule="auto" w:line="240" w:before="60" w:after="60"/>
-              <w:jc w:val="end"/>
-              <w:rPr>
-                <w:color w:val="000000"/>
-                <w:sz w:val="16"/>
-                <w:szCs w:val="16"/>
-              </w:rPr>
-            </w:pPr>
-            <w:r>
-              <w:rPr>
-                <w:color w:val="000000"/>
-                <w:sz w:val="16"/>
-                <w:szCs w:val="16"/>
-              </w:rPr>
-            </w:r>
-          </w:p>
-        </w:tc>
-        <w:tc>
-          <w:tcPr>
-            <w:tcW w:w="1207" w:type="dxa"/>
+            <w:tcW w:w="1654" w:type="dxa"/>
             <w:tcBorders>
               <w:bottom w:val="single" w:sz="4" w:space="0" w:color="7F7F7F"/>
             </w:tcBorders>
@@ -2230,7 +2187,7 @@
         <w:tc>
           <w:tcPr>
             <w:tcW w:w="5277" w:type="dxa"/>
-            <w:gridSpan w:val="2"/>
+            <w:gridSpan w:val="3"/>
             <w:tcBorders>
               <w:top w:val="single" w:sz="4" w:space="0" w:color="7F7F7F"/>
             </w:tcBorders>
@@ -2258,7 +2215,7 @@
         </w:tc>
         <w:tc>
           <w:tcPr>
-            <w:tcW w:w="2089" w:type="dxa"/>
+            <w:tcW w:w="2634" w:type="dxa"/>
             <w:gridSpan w:val="2"/>
             <w:tcBorders>
               <w:top w:val="single" w:sz="4" w:space="0" w:color="7F7F7F"/>
@@ -2293,40 +2250,7 @@
         </w:tc>
         <w:tc>
           <w:tcPr>
-            <w:tcW w:w="992" w:type="dxa"/>
-            <w:tcBorders>
-              <w:top w:val="single" w:sz="4" w:space="0" w:color="7F7F7F"/>
-              <w:bottom w:val="single" w:sz="4" w:space="0" w:color="7F7F7F"/>
-            </w:tcBorders>
-            <w:vAlign w:val="center"/>
-          </w:tcPr>
-          <w:p>
-            <w:pPr>
-              <w:pStyle w:val="Tabelle"/>
-              <w:spacing w:lineRule="auto" w:line="240" w:before="60" w:after="60"/>
-              <w:jc w:val="start"/>
-              <w:rPr>
-                <w:b/>
-                <w:color w:val="000000"/>
-                <w:sz w:val="16"/>
-                <w:szCs w:val="16"/>
-                <w:lang w:val="de-DE" w:eastAsia="de-DE"/>
-              </w:rPr>
-            </w:pPr>
-            <w:r>
-              <w:rPr>
-                <w:b/>
-                <w:color w:val="000000"/>
-                <w:sz w:val="16"/>
-                <w:szCs w:val="16"/>
-                <w:lang w:val="de-DE" w:eastAsia="de-DE"/>
-              </w:rPr>
-            </w:r>
-          </w:p>
-        </w:tc>
-        <w:tc>
-          <w:tcPr>
-            <w:tcW w:w="1207" w:type="dxa"/>
+            <w:tcW w:w="1654" w:type="dxa"/>
             <w:tcBorders>
               <w:top w:val="single" w:sz="4" w:space="0" w:color="7F7F7F"/>
               <w:bottom w:val="single" w:sz="4" w:space="0" w:color="7F7F7F"/>
@@ -2463,12 +2387,12 @@
         <w:bottom w:w="0" w:type="dxa"/>
         <w:end w:w="108" w:type="dxa"/>
       </w:tblCellMar>
-      <w:tblLook w:val="01e0" w:noHBand="0" w:noVBand="0" w:firstColumn="1" w:lastRow="1" w:lastColumn="1" w:firstRow="1"/>
+      <w:tblLook w:val="01e0" w:noVBand="0" w:noHBand="0" w:lastColumn="1" w:firstColumn="1" w:lastRow="1" w:firstRow="1"/>
     </w:tblPr>
     <w:tblGrid>
       <w:gridCol w:w="3012"/>
-      <w:gridCol w:w="2967"/>
-      <w:gridCol w:w="4086"/>
+      <w:gridCol w:w="2966"/>
+      <w:gridCol w:w="4087"/>
     </w:tblGrid>
     <w:tr>
       <w:trPr>
@@ -2530,7 +2454,7 @@
       </w:tc>
       <w:tc>
         <w:tcPr>
-          <w:tcW w:w="2967" w:type="dxa"/>
+          <w:tcW w:w="2966" w:type="dxa"/>
           <w:tcBorders>
             <w:start w:val="single" w:sz="4" w:space="0" w:color="7F7F7F"/>
             <w:end w:val="single" w:sz="4" w:space="0" w:color="7F7F7F"/>
@@ -2589,7 +2513,7 @@
       </w:tc>
       <w:tc>
         <w:tcPr>
-          <w:tcW w:w="4086" w:type="dxa"/>
+          <w:tcW w:w="4087" w:type="dxa"/>
           <w:tcBorders>
             <w:start w:val="single" w:sz="4" w:space="0" w:color="7F7F7F"/>
           </w:tcBorders>
@@ -2704,7 +2628,7 @@
       </w:tc>
       <w:tc>
         <w:tcPr>
-          <w:tcW w:w="2967" w:type="dxa"/>
+          <w:tcW w:w="2966" w:type="dxa"/>
           <w:tcBorders>
             <w:start w:val="single" w:sz="4" w:space="0" w:color="7F7F7F"/>
             <w:end w:val="single" w:sz="4" w:space="0" w:color="7F7F7F"/>
@@ -2763,7 +2687,7 @@
       </w:tc>
       <w:tc>
         <w:tcPr>
-          <w:tcW w:w="4086" w:type="dxa"/>
+          <w:tcW w:w="4087" w:type="dxa"/>
           <w:tcBorders>
             <w:start w:val="single" w:sz="4" w:space="0" w:color="7F7F7F"/>
           </w:tcBorders>
@@ -2883,7 +2807,7 @@
       </w:tc>
       <w:tc>
         <w:tcPr>
-          <w:tcW w:w="2967" w:type="dxa"/>
+          <w:tcW w:w="2966" w:type="dxa"/>
           <w:tcBorders>
             <w:start w:val="single" w:sz="4" w:space="0" w:color="7F7F7F"/>
             <w:end w:val="single" w:sz="4" w:space="0" w:color="7F7F7F"/>
@@ -2942,7 +2866,7 @@
       </w:tc>
       <w:tc>
         <w:tcPr>
-          <w:tcW w:w="4086" w:type="dxa"/>
+          <w:tcW w:w="4087" w:type="dxa"/>
           <w:tcBorders>
             <w:start w:val="single" w:sz="4" w:space="0" w:color="7F7F7F"/>
           </w:tcBorders>
@@ -3071,7 +2995,7 @@
       </w:tc>
       <w:tc>
         <w:tcPr>
-          <w:tcW w:w="2967" w:type="dxa"/>
+          <w:tcW w:w="2966" w:type="dxa"/>
           <w:tcBorders>
             <w:start w:val="single" w:sz="4" w:space="0" w:color="7F7F7F"/>
             <w:end w:val="single" w:sz="4" w:space="0" w:color="7F7F7F"/>
@@ -3130,7 +3054,7 @@
       </w:tc>
       <w:tc>
         <w:tcPr>
-          <w:tcW w:w="4086" w:type="dxa"/>
+          <w:tcW w:w="4087" w:type="dxa"/>
           <w:tcBorders>
             <w:start w:val="single" w:sz="4" w:space="0" w:color="7F7F7F"/>
           </w:tcBorders>
@@ -3191,12 +3115,12 @@
         <w:bottom w:w="0" w:type="dxa"/>
         <w:end w:w="108" w:type="dxa"/>
       </w:tblCellMar>
-      <w:tblLook w:val="01e0" w:noHBand="0" w:noVBand="0" w:firstColumn="1" w:lastRow="1" w:lastColumn="1" w:firstRow="1"/>
+      <w:tblLook w:val="01e0" w:noVBand="0" w:noHBand="0" w:lastColumn="1" w:firstColumn="1" w:lastRow="1" w:firstRow="1"/>
     </w:tblPr>
     <w:tblGrid>
       <w:gridCol w:w="3012"/>
-      <w:gridCol w:w="2967"/>
-      <w:gridCol w:w="4086"/>
+      <w:gridCol w:w="2966"/>
+      <w:gridCol w:w="4087"/>
     </w:tblGrid>
     <w:tr>
       <w:trPr>
@@ -3258,7 +3182,7 @@
       </w:tc>
       <w:tc>
         <w:tcPr>
-          <w:tcW w:w="2967" w:type="dxa"/>
+          <w:tcW w:w="2966" w:type="dxa"/>
           <w:tcBorders>
             <w:start w:val="single" w:sz="4" w:space="0" w:color="7F7F7F"/>
             <w:end w:val="single" w:sz="4" w:space="0" w:color="7F7F7F"/>
@@ -3317,7 +3241,7 @@
       </w:tc>
       <w:tc>
         <w:tcPr>
-          <w:tcW w:w="4086" w:type="dxa"/>
+          <w:tcW w:w="4087" w:type="dxa"/>
           <w:tcBorders>
             <w:start w:val="single" w:sz="4" w:space="0" w:color="7F7F7F"/>
           </w:tcBorders>
@@ -3432,7 +3356,7 @@
       </w:tc>
       <w:tc>
         <w:tcPr>
-          <w:tcW w:w="2967" w:type="dxa"/>
+          <w:tcW w:w="2966" w:type="dxa"/>
           <w:tcBorders>
             <w:start w:val="single" w:sz="4" w:space="0" w:color="7F7F7F"/>
             <w:end w:val="single" w:sz="4" w:space="0" w:color="7F7F7F"/>
@@ -3491,7 +3415,7 @@
       </w:tc>
       <w:tc>
         <w:tcPr>
-          <w:tcW w:w="4086" w:type="dxa"/>
+          <w:tcW w:w="4087" w:type="dxa"/>
           <w:tcBorders>
             <w:start w:val="single" w:sz="4" w:space="0" w:color="7F7F7F"/>
           </w:tcBorders>
@@ -3611,7 +3535,7 @@
       </w:tc>
       <w:tc>
         <w:tcPr>
-          <w:tcW w:w="2967" w:type="dxa"/>
+          <w:tcW w:w="2966" w:type="dxa"/>
           <w:tcBorders>
             <w:start w:val="single" w:sz="4" w:space="0" w:color="7F7F7F"/>
             <w:end w:val="single" w:sz="4" w:space="0" w:color="7F7F7F"/>
@@ -3670,7 +3594,7 @@
       </w:tc>
       <w:tc>
         <w:tcPr>
-          <w:tcW w:w="4086" w:type="dxa"/>
+          <w:tcW w:w="4087" w:type="dxa"/>
           <w:tcBorders>
             <w:start w:val="single" w:sz="4" w:space="0" w:color="7F7F7F"/>
           </w:tcBorders>
@@ -3799,7 +3723,7 @@
       </w:tc>
       <w:tc>
         <w:tcPr>
-          <w:tcW w:w="2967" w:type="dxa"/>
+          <w:tcW w:w="2966" w:type="dxa"/>
           <w:tcBorders>
             <w:start w:val="single" w:sz="4" w:space="0" w:color="7F7F7F"/>
             <w:end w:val="single" w:sz="4" w:space="0" w:color="7F7F7F"/>
@@ -3858,7 +3782,7 @@
       </w:tc>
       <w:tc>
         <w:tcPr>
-          <w:tcW w:w="4086" w:type="dxa"/>
+          <w:tcW w:w="4087" w:type="dxa"/>
           <w:tcBorders>
             <w:start w:val="single" w:sz="4" w:space="0" w:color="7F7F7F"/>
           </w:tcBorders>
@@ -6316,20 +6240,20 @@
       <w:shd w:fill="E1DFDD" w:val="clear"/>
     </w:rPr>
   </w:style>
-  <w:style w:type="character" w:styleId="Quelltextuser">
-    <w:name w:val="Quelltext (user)"/>
+  <w:style w:type="character" w:styleId="Quelltext">
+    <w:name w:val="Quelltext"/>
     <w:qFormat/>
     <w:rPr>
       <w:rFonts w:ascii="Liberation Mono" w:hAnsi="Liberation Mono" w:eastAsia="Liberation Mono" w:cs="Liberation Mono"/>
     </w:rPr>
   </w:style>
-  <w:style w:type="character" w:styleId="Nummerierungszeichenuser">
-    <w:name w:val="Nummerierungszeichen (user)"/>
+  <w:style w:type="character" w:styleId="Nummerierungszeichen">
+    <w:name w:val="Nummerierungszeichen"/>
     <w:qFormat/>
     <w:rPr/>
   </w:style>
-  <w:style w:type="character" w:styleId="Bullets">
-    <w:name w:val="Bullets"/>
+  <w:style w:type="character" w:styleId="Bulletsuser">
+    <w:name w:val="Bullets (user)"/>
     <w:qFormat/>
     <w:rPr>
       <w:rFonts w:ascii="OpenSymbol" w:hAnsi="OpenSymbol" w:eastAsia="OpenSymbol" w:cs="OpenSymbol"/>
@@ -6343,8 +6267,8 @@
       <w:iCs/>
     </w:rPr>
   </w:style>
-  <w:style w:type="paragraph" w:styleId="berschrift">
-    <w:name w:val="Überschrift"/>
+  <w:style w:type="paragraph" w:styleId="Heading">
+    <w:name w:val="Heading"/>
     <w:basedOn w:val="Normal"/>
     <w:next w:val="BodyText"/>
     <w:qFormat/>
@@ -6353,7 +6277,7 @@
       <w:spacing w:before="240" w:after="120"/>
     </w:pPr>
     <w:rPr>
-      <w:rFonts w:ascii="Liberation Sans" w:hAnsi="Liberation Sans" w:eastAsia="Nimbus Sans" w:cs="FreeSans"/>
+      <w:rFonts w:ascii="Liberation Sans" w:hAnsi="Liberation Sans" w:eastAsia="Arial Unicode MS" w:cs="Arial Unicode MS"/>
       <w:sz w:val="28"/>
       <w:szCs w:val="28"/>
     </w:rPr>
@@ -6390,19 +6314,19 @@
       <w:szCs w:val="24"/>
     </w:rPr>
   </w:style>
-  <w:style w:type="paragraph" w:styleId="Verzeichnis">
-    <w:name w:val="Verzeichnis"/>
+  <w:style w:type="paragraph" w:styleId="Index">
+    <w:name w:val="Index"/>
     <w:basedOn w:val="Normal"/>
     <w:qFormat/>
     <w:pPr>
       <w:suppressLineNumbers/>
     </w:pPr>
     <w:rPr>
-      <w:rFonts w:cs="FreeSans"/>
+      <w:rFonts w:cs="Arial Unicode MS"/>
     </w:rPr>
   </w:style>
-  <w:style w:type="paragraph" w:styleId="berschriftuser">
-    <w:name w:val="Überschrift (user)"/>
+  <w:style w:type="paragraph" w:styleId="berschrift">
+    <w:name w:val="Überschrift"/>
     <w:basedOn w:val="Normal"/>
     <w:next w:val="BodyText"/>
     <w:qFormat/>
@@ -6416,8 +6340,8 @@
       <w:szCs w:val="28"/>
     </w:rPr>
   </w:style>
-  <w:style w:type="paragraph" w:styleId="Verzeichnisuser">
-    <w:name w:val="Verzeichnis (user)"/>
+  <w:style w:type="paragraph" w:styleId="Verzeichnis">
+    <w:name w:val="Verzeichnis"/>
     <w:basedOn w:val="Normal"/>
     <w:qFormat/>
     <w:pPr>
@@ -6611,15 +6535,15 @@
       <w:szCs w:val="18"/>
     </w:rPr>
   </w:style>
-  <w:style w:type="paragraph" w:styleId="Kopf-Fuzeileuser">
-    <w:name w:val="Kopf-/Fußzeile (user)"/>
+  <w:style w:type="paragraph" w:styleId="Kopf-Fuzeile">
+    <w:name w:val="Kopf-/Fußzeile"/>
     <w:basedOn w:val="Normal"/>
     <w:qFormat/>
     <w:pPr/>
     <w:rPr/>
   </w:style>
-  <w:style w:type="paragraph" w:styleId="Kopf-Fuzeile">
-    <w:name w:val="Kopf-/Fußzeile"/>
+  <w:style w:type="paragraph" w:styleId="HeaderandFooter">
+    <w:name w:val="Header and Footer"/>
     <w:basedOn w:val="Normal"/>
     <w:qFormat/>
     <w:pPr/>
@@ -6657,43 +6581,37 @@
       <w:lang w:val="x-none" w:eastAsia="ja-JP"/>
     </w:rPr>
   </w:style>
-  <w:style w:type="paragraph" w:styleId="Tabelle" w:customStyle="1">
+  <w:style w:type="paragraph" w:styleId="Tabelle">
     <w:name w:val="Tabelle"/>
-    <w:basedOn w:val="Normal"/>
+    <w:basedOn w:val="Caption"/>
     <w:next w:val="Normal"/>
     <w:link w:val="TabelleZchn"/>
     <w:qFormat/>
-    <w:rsid w:val="00cf1891"/>
-    <w:pPr>
-      <w:keepLines/>
-      <w:spacing w:lineRule="auto" w:line="264" w:before="80" w:after="80"/>
-      <w:jc w:val="both"/>
-    </w:pPr>
-    <w:rPr>
-      <w:lang w:val="x-none" w:eastAsia="x-none"/>
-    </w:rPr>
+    <w:pPr/>
+    <w:rPr/>
   </w:style>
   <w:style w:type="paragraph" w:styleId="Tabelleninhalt">
     <w:name w:val="Tabelleninhalt"/>
     <w:basedOn w:val="Normal"/>
     <w:qFormat/>
-    <w:pPr/>
+    <w:pPr>
+      <w:widowControl w:val="false"/>
+      <w:suppressLineNumbers/>
+    </w:pPr>
     <w:rPr/>
   </w:style>
-  <w:style w:type="paragraph" w:styleId="Tabellenberschrift" w:customStyle="1">
+  <w:style w:type="paragraph" w:styleId="Tabellenberschrift">
     <w:name w:val="Tabellenüberschrift"/>
-    <w:basedOn w:val="Tabelle"/>
+    <w:basedOn w:val="Tabelleninhalt"/>
     <w:autoRedefine/>
     <w:qFormat/>
-    <w:rsid w:val="00cf1891"/>
     <w:pPr>
-      <w:jc w:val="start"/>
+      <w:suppressLineNumbers/>
+      <w:jc w:val="center"/>
     </w:pPr>
     <w:rPr>
-      <w:rFonts w:cs="Arial"/>
       <w:b/>
       <w:bCs/>
-      <w:lang w:val="fr-FR"/>
     </w:rPr>
   </w:style>
   <w:style w:type="paragraph" w:styleId="NoteHeading">
@@ -6931,15 +6849,15 @@
     </w:pPr>
     <w:rPr/>
   </w:style>
-  <w:style w:type="paragraph" w:styleId="FrameContents">
-    <w:name w:val="Frame Contents"/>
+  <w:style w:type="paragraph" w:styleId="FrameContentsuser">
+    <w:name w:val="Frame Contents (user)"/>
     <w:basedOn w:val="Normal"/>
     <w:qFormat/>
     <w:pPr/>
     <w:rPr/>
   </w:style>
-  <w:style w:type="paragraph" w:styleId="VorformatierterTextuser">
-    <w:name w:val="Vorformatierter Text (user)"/>
+  <w:style w:type="paragraph" w:styleId="VorformatierterText">
+    <w:name w:val="Vorformatierter Text"/>
     <w:basedOn w:val="Normal"/>
     <w:qFormat/>
     <w:pPr>
@@ -6951,43 +6869,6 @@
       <w:szCs w:val="20"/>
     </w:rPr>
   </w:style>
-  <w:style w:type="paragraph" w:styleId="Tabelleninhaltuser">
-    <w:name w:val="Tabelleninhalt (user)"/>
-    <w:basedOn w:val="Normal"/>
-    <w:qFormat/>
-    <w:pPr>
-      <w:widowControl w:val="false"/>
-      <w:suppressLineNumbers/>
-    </w:pPr>
-    <w:rPr/>
-  </w:style>
-  <w:style w:type="paragraph" w:styleId="Tabellenberschriftuser">
-    <w:name w:val="Tabellenüberschrift (user)"/>
-    <w:basedOn w:val="Tabelleninhaltuser"/>
-    <w:qFormat/>
-    <w:pPr>
-      <w:suppressLineNumbers/>
-      <w:jc w:val="center"/>
-    </w:pPr>
-    <w:rPr>
-      <w:b/>
-      <w:bCs/>
-    </w:rPr>
-  </w:style>
-  <w:style w:type="paragraph" w:styleId="Tabelleuser">
-    <w:name w:val="Tabelle (user)"/>
-    <w:basedOn w:val="Caption"/>
-    <w:qFormat/>
-    <w:pPr/>
-    <w:rPr/>
-  </w:style>
-  <w:style w:type="paragraph" w:styleId="Rahmeninhaltuser">
-    <w:name w:val="Rahmeninhalt (user)"/>
-    <w:basedOn w:val="Normal"/>
-    <w:qFormat/>
-    <w:pPr/>
-    <w:rPr/>
-  </w:style>
   <w:style w:type="paragraph" w:styleId="Rahmeninhalt">
     <w:name w:val="Rahmeninhalt"/>
     <w:basedOn w:val="Normal"/>
@@ -6995,19 +6876,26 @@
     <w:pPr/>
     <w:rPr/>
   </w:style>
-  <w:style w:type="numbering" w:styleId="KeineListeuser" w:default="1">
-    <w:name w:val="Keine Liste (user)"/>
+  <w:style w:type="paragraph" w:styleId="FrameContents">
+    <w:name w:val="Frame Contents"/>
+    <w:basedOn w:val="Normal"/>
+    <w:qFormat/>
+    <w:pPr/>
+    <w:rPr/>
+  </w:style>
+  <w:style w:type="numbering" w:styleId="KeineListe" w:default="1">
+    <w:name w:val="Keine Liste"/>
     <w:uiPriority w:val="99"/>
     <w:semiHidden/>
     <w:unhideWhenUsed/>
     <w:qFormat/>
   </w:style>
-  <w:style w:type="numbering" w:styleId="Nummerierung123user">
-    <w:name w:val="Nummerierung 123 (user)"/>
+  <w:style w:type="numbering" w:styleId="Nummerierung123">
+    <w:name w:val="Nummerierung 123"/>
     <w:qFormat/>
   </w:style>
-  <w:style w:type="numbering" w:styleId="Bullet">
-    <w:name w:val="Bullet •"/>
+  <w:style w:type="numbering" w:styleId="Bulletuser">
+    <w:name w:val="Bullet • (user)"/>
     <w:qFormat/>
   </w:style>
   <w:style w:type="table" w:default="1" w:styleId="NormaleTabelle">
@@ -7035,37 +6923,37 @@
         <a:srgbClr val="000000"/>
       </a:dk1>
       <a:lt1>
-        <a:srgbClr val="ffffff"/>
+        <a:srgbClr val="FFFFFF"/>
       </a:lt1>
       <a:dk2>
-        <a:srgbClr val="44546a"/>
+        <a:srgbClr val="44546A"/>
       </a:dk2>
       <a:lt2>
-        <a:srgbClr val="e7e6e6"/>
+        <a:srgbClr val="E7E6E6"/>
       </a:lt2>
       <a:accent1>
-        <a:srgbClr val="5b9bd5"/>
+        <a:srgbClr val="5B9BD5"/>
       </a:accent1>
       <a:accent2>
-        <a:srgbClr val="ed7d31"/>
+        <a:srgbClr val="ED7D31"/>
       </a:accent2>
       <a:accent3>
-        <a:srgbClr val="a5a5a5"/>
+        <a:srgbClr val="A5A5A5"/>
       </a:accent3>
       <a:accent4>
-        <a:srgbClr val="ffc000"/>
+        <a:srgbClr val="FFC000"/>
       </a:accent4>
       <a:accent5>
-        <a:srgbClr val="4472c4"/>
+        <a:srgbClr val="4472C4"/>
       </a:accent5>
       <a:accent6>
-        <a:srgbClr val="70ad47"/>
+        <a:srgbClr val="70AD47"/>
       </a:accent6>
       <a:hlink>
-        <a:srgbClr val="0563c1"/>
+        <a:srgbClr val="0563C1"/>
       </a:hlink>
       <a:folHlink>
-        <a:srgbClr val="954f72"/>
+        <a:srgbClr val="954F72"/>
       </a:folHlink>
     </a:clrScheme>
     <a:fontScheme name="Office">

</xml_diff>

<commit_message>
removed Link from produkt
</commit_message>
<xml_diff>
--- a/server/assets/templates/offer.docx
+++ b/server/assets/templates/offer.docx
@@ -1098,21 +1098,7 @@
           <w:b/>
           <w:bCs/>
         </w:rPr>
-        <w:t>Keepit für {</w:t>
-      </w:r>
-      <w:r>
-        <w:rPr>
-          <w:b/>
-          <w:bCs/>
-        </w:rPr>
-        <w:t>names</w:t>
-      </w:r>
-      <w:r>
-        <w:rPr>
-          <w:b/>
-          <w:bCs/>
-        </w:rPr>
-        <w:t>}</w:t>
+        <w:t>Keepit für {names}</w:t>
       </w:r>
     </w:p>
     <w:p>
@@ -1813,27 +1799,7 @@
                 <w:szCs w:val="16"/>
                 <w:lang w:val="en-US"/>
               </w:rPr>
-              <w:t>{#products}{</w:t>
-            </w:r>
-            <w:r>
-              <w:rPr>
-                <w:rFonts w:cs="Arial"/>
-                <w:b/>
-                <w:sz w:val="16"/>
-                <w:szCs w:val="16"/>
-                <w:lang w:val="en-US"/>
-              </w:rPr>
-              <w:t>name</w:t>
-            </w:r>
-            <w:r>
-              <w:rPr>
-                <w:rFonts w:cs="Arial"/>
-                <w:b/>
-                <w:sz w:val="16"/>
-                <w:szCs w:val="16"/>
-                <w:lang w:val="en-US"/>
-              </w:rPr>
-              <w:t>}</w:t>
+              <w:t>{#products}{name}</w:t>
             </w:r>
           </w:p>
           <w:p>
@@ -2337,6 +2303,879 @@
       </w:pPr>
       <w:r>
         <w:rPr/>
+        <w:t>{^positions.includesOptionals}</w:t>
+      </w:r>
+    </w:p>
+    <w:p>
+      <w:pPr>
+        <w:pStyle w:val="dignumStandardvor0nach0"/>
+        <w:rPr>
+          <w:b/>
+          <w:bCs/>
+        </w:rPr>
+      </w:pPr>
+      <w:r>
+        <w:rPr/>
+        <w:t>{#positions.products}</w:t>
+      </w:r>
+    </w:p>
+    <w:p>
+      <w:pPr>
+        <w:pStyle w:val="dignumStandardvor0nach0"/>
+        <w:rPr/>
+      </w:pPr>
+      <w:r>
+        <w:rPr/>
+      </w:r>
+    </w:p>
+    <w:tbl>
+      <w:tblPr>
+        <w:tblW w:w="9565" w:type="dxa"/>
+        <w:jc w:val="start"/>
+        <w:tblInd w:w="0" w:type="dxa"/>
+        <w:tblLayout w:type="fixed"/>
+        <w:tblCellMar>
+          <w:top w:w="0" w:type="dxa"/>
+          <w:start w:w="70" w:type="dxa"/>
+          <w:bottom w:w="0" w:type="dxa"/>
+          <w:end w:w="70" w:type="dxa"/>
+        </w:tblCellMar>
+        <w:tblLook w:val="0000" w:noVBand="0" w:noHBand="0" w:lastColumn="0" w:firstColumn="0" w:lastRow="0" w:firstRow="0"/>
+      </w:tblPr>
+      <w:tblGrid>
+        <w:gridCol w:w="305"/>
+        <w:gridCol w:w="305"/>
+        <w:gridCol w:w="4667"/>
+        <w:gridCol w:w="1099"/>
+        <w:gridCol w:w="1535"/>
+        <w:gridCol w:w="1654"/>
+      </w:tblGrid>
+      <w:tr>
+        <w:trPr>
+          <w:trHeight w:val="389" w:hRule="atLeast"/>
+        </w:trPr>
+        <w:tc>
+          <w:tcPr>
+            <w:tcW w:w="610" w:type="dxa"/>
+            <w:gridSpan w:val="2"/>
+            <w:tcBorders>
+              <w:top w:val="single" w:sz="4" w:space="0" w:color="000000"/>
+              <w:bottom w:val="single" w:sz="4" w:space="0" w:color="000000"/>
+            </w:tcBorders>
+            <w:vAlign w:val="center"/>
+          </w:tcPr>
+          <w:p>
+            <w:pPr>
+              <w:pStyle w:val="Tabellenberschrift"/>
+              <w:spacing w:before="80" w:after="80"/>
+              <w:rPr>
+                <w:sz w:val="16"/>
+                <w:szCs w:val="16"/>
+              </w:rPr>
+            </w:pPr>
+            <w:r>
+              <w:rPr>
+                <w:sz w:val="16"/>
+                <w:szCs w:val="16"/>
+              </w:rPr>
+              <w:t>Pos.</w:t>
+            </w:r>
+          </w:p>
+        </w:tc>
+        <w:tc>
+          <w:tcPr>
+            <w:tcW w:w="4667" w:type="dxa"/>
+            <w:tcBorders>
+              <w:top w:val="single" w:sz="4" w:space="0" w:color="000000"/>
+              <w:bottom w:val="single" w:sz="4" w:space="0" w:color="000000"/>
+            </w:tcBorders>
+            <w:vAlign w:val="center"/>
+          </w:tcPr>
+          <w:p>
+            <w:pPr>
+              <w:pStyle w:val="Tabellenberschrift"/>
+              <w:spacing w:before="80" w:after="80"/>
+              <w:rPr>
+                <w:sz w:val="16"/>
+                <w:szCs w:val="16"/>
+              </w:rPr>
+            </w:pPr>
+            <w:r>
+              <w:rPr>
+                <w:sz w:val="16"/>
+                <w:szCs w:val="16"/>
+              </w:rPr>
+              <w:t>Artikel / Leistung</w:t>
+            </w:r>
+          </w:p>
+        </w:tc>
+        <w:tc>
+          <w:tcPr>
+            <w:tcW w:w="1099" w:type="dxa"/>
+            <w:tcBorders>
+              <w:top w:val="single" w:sz="4" w:space="0" w:color="000000"/>
+              <w:bottom w:val="single" w:sz="4" w:space="0" w:color="000000"/>
+            </w:tcBorders>
+            <w:vAlign w:val="center"/>
+          </w:tcPr>
+          <w:p>
+            <w:pPr>
+              <w:pStyle w:val="Tabellenberschrift"/>
+              <w:spacing w:before="80" w:after="80"/>
+              <w:jc w:val="center"/>
+              <w:rPr>
+                <w:sz w:val="16"/>
+                <w:szCs w:val="16"/>
+              </w:rPr>
+            </w:pPr>
+            <w:r>
+              <w:rPr>
+                <w:sz w:val="16"/>
+                <w:szCs w:val="16"/>
+              </w:rPr>
+              <w:t>Anz.</w:t>
+            </w:r>
+          </w:p>
+        </w:tc>
+        <w:tc>
+          <w:tcPr>
+            <w:tcW w:w="1535" w:type="dxa"/>
+            <w:tcBorders>
+              <w:top w:val="single" w:sz="4" w:space="0" w:color="000000"/>
+              <w:bottom w:val="single" w:sz="4" w:space="0" w:color="000000"/>
+            </w:tcBorders>
+            <w:vAlign w:val="center"/>
+          </w:tcPr>
+          <w:p>
+            <w:pPr>
+              <w:pStyle w:val="Tabellenberschrift"/>
+              <w:spacing w:before="80" w:after="80"/>
+              <w:jc w:val="center"/>
+              <w:rPr>
+                <w:sz w:val="16"/>
+                <w:szCs w:val="16"/>
+              </w:rPr>
+            </w:pPr>
+            <w:r>
+              <w:rPr>
+                <w:sz w:val="16"/>
+                <w:szCs w:val="16"/>
+              </w:rPr>
+              <w:t>Preis User</w:t>
+            </w:r>
+          </w:p>
+          <w:p>
+            <w:pPr>
+              <w:pStyle w:val="Tabellenberschrift"/>
+              <w:spacing w:before="80" w:after="80"/>
+              <w:jc w:val="center"/>
+              <w:rPr>
+                <w:sz w:val="16"/>
+                <w:szCs w:val="16"/>
+              </w:rPr>
+            </w:pPr>
+            <w:r>
+              <w:rPr>
+                <w:sz w:val="16"/>
+                <w:szCs w:val="16"/>
+              </w:rPr>
+              <w:t>/ Monat</w:t>
+            </w:r>
+          </w:p>
+        </w:tc>
+        <w:tc>
+          <w:tcPr>
+            <w:tcW w:w="1654" w:type="dxa"/>
+            <w:tcBorders>
+              <w:top w:val="single" w:sz="4" w:space="0" w:color="000000"/>
+              <w:bottom w:val="single" w:sz="4" w:space="0" w:color="000000"/>
+            </w:tcBorders>
+            <w:vAlign w:val="center"/>
+          </w:tcPr>
+          <w:p>
+            <w:pPr>
+              <w:pStyle w:val="Tabellenberschrift"/>
+              <w:spacing w:before="80" w:after="80"/>
+              <w:jc w:val="center"/>
+              <w:rPr>
+                <w:sz w:val="16"/>
+                <w:szCs w:val="16"/>
+              </w:rPr>
+            </w:pPr>
+            <w:r>
+              <w:rPr>
+                <w:sz w:val="16"/>
+                <w:szCs w:val="16"/>
+              </w:rPr>
+              <w:t>Gesamt EUR</w:t>
+            </w:r>
+          </w:p>
+          <w:p>
+            <w:pPr>
+              <w:pStyle w:val="Tabellenberschrift"/>
+              <w:spacing w:before="80" w:after="80"/>
+              <w:jc w:val="center"/>
+              <w:rPr>
+                <w:sz w:val="16"/>
+                <w:szCs w:val="16"/>
+              </w:rPr>
+            </w:pPr>
+            <w:r>
+              <w:rPr>
+                <w:sz w:val="16"/>
+                <w:szCs w:val="16"/>
+              </w:rPr>
+              <w:t>(36 Monate)</w:t>
+            </w:r>
+          </w:p>
+        </w:tc>
+      </w:tr>
+      <w:tr>
+        <w:trPr>
+          <w:cantSplit w:val="true"/>
+        </w:trPr>
+        <w:tc>
+          <w:tcPr>
+            <w:tcW w:w="305" w:type="dxa"/>
+            <w:tcBorders>
+              <w:top w:val="single" w:sz="4" w:space="0" w:color="7F7F7F"/>
+              <w:bottom w:val="single" w:sz="4" w:space="0" w:color="7F7F7F"/>
+            </w:tcBorders>
+            <w:shd w:color="auto" w:fill="BFBFBF" w:themeFill="background1" w:themeFillShade="bf" w:val="clear"/>
+          </w:tcPr>
+          <w:p>
+            <w:pPr>
+              <w:pStyle w:val="Normal"/>
+              <w:spacing w:lineRule="auto" w:line="240" w:before="60" w:after="60"/>
+              <w:ind w:start="288"/>
+              <w:jc w:val="center"/>
+              <w:rPr>
+                <w:color w:val="000000"/>
+                <w:sz w:val="16"/>
+                <w:szCs w:val="16"/>
+              </w:rPr>
+            </w:pPr>
+            <w:r>
+              <w:rPr>
+                <w:color w:val="000000"/>
+                <w:sz w:val="16"/>
+                <w:szCs w:val="16"/>
+              </w:rPr>
+            </w:r>
+          </w:p>
+        </w:tc>
+        <w:tc>
+          <w:tcPr>
+            <w:tcW w:w="305" w:type="dxa"/>
+            <w:tcBorders>
+              <w:top w:val="single" w:sz="4" w:space="0" w:color="7F7F7F"/>
+              <w:bottom w:val="single" w:sz="4" w:space="0" w:color="7F7F7F"/>
+            </w:tcBorders>
+            <w:shd w:color="auto" w:fill="BFBFBF" w:themeFill="background1" w:themeFillShade="bf" w:val="clear"/>
+          </w:tcPr>
+          <w:p>
+            <w:pPr>
+              <w:pStyle w:val="Normal"/>
+              <w:spacing w:lineRule="auto" w:line="240" w:before="60" w:after="60"/>
+              <w:ind w:start="288"/>
+              <w:jc w:val="center"/>
+              <w:rPr>
+                <w:color w:val="000000"/>
+                <w:sz w:val="16"/>
+                <w:szCs w:val="16"/>
+              </w:rPr>
+            </w:pPr>
+            <w:r>
+              <w:rPr>
+                <w:color w:val="000000"/>
+                <w:sz w:val="16"/>
+                <w:szCs w:val="16"/>
+              </w:rPr>
+            </w:r>
+          </w:p>
+        </w:tc>
+        <w:tc>
+          <w:tcPr>
+            <w:tcW w:w="8955" w:type="dxa"/>
+            <w:gridSpan w:val="4"/>
+            <w:tcBorders>
+              <w:top w:val="single" w:sz="4" w:space="0" w:color="7F7F7F"/>
+              <w:bottom w:val="single" w:sz="4" w:space="0" w:color="7F7F7F"/>
+            </w:tcBorders>
+            <w:shd w:color="auto" w:fill="BFBFBF" w:themeFill="background1" w:themeFillShade="bf" w:val="clear"/>
+          </w:tcPr>
+          <w:p>
+            <w:pPr>
+              <w:pStyle w:val="dignumTabelle"/>
+              <w:spacing w:lineRule="auto" w:line="240" w:before="60" w:after="60"/>
+              <w:rPr>
+                <w:b/>
+                <w:lang w:val="en-US" w:eastAsia="de-DE"/>
+              </w:rPr>
+            </w:pPr>
+            <w:r>
+              <w:rPr>
+                <w:b/>
+                <w:lang w:val="en-US"/>
+              </w:rPr>
+              <w:t xml:space="preserve">Keepit - Backup {names} </w:t>
+            </w:r>
+          </w:p>
+        </w:tc>
+      </w:tr>
+      <w:tr>
+        <w:trPr>
+          <w:trHeight w:val="456" w:hRule="atLeast"/>
+        </w:trPr>
+        <w:tc>
+          <w:tcPr>
+            <w:tcW w:w="610" w:type="dxa"/>
+            <w:gridSpan w:val="2"/>
+            <w:tcBorders>
+              <w:top w:val="single" w:sz="4" w:space="0" w:color="7F7F7F"/>
+              <w:bottom w:val="single" w:sz="4" w:space="0" w:color="7F7F7F"/>
+            </w:tcBorders>
+            <w:vAlign w:val="center"/>
+          </w:tcPr>
+          <w:p>
+            <w:pPr>
+              <w:pStyle w:val="Normal"/>
+              <w:numPr>
+                <w:ilvl w:val="0"/>
+                <w:numId w:val="5"/>
+              </w:numPr>
+              <w:spacing w:lineRule="auto" w:line="240" w:before="60" w:after="60"/>
+              <w:jc w:val="center"/>
+              <w:rPr>
+                <w:color w:val="000000"/>
+                <w:sz w:val="16"/>
+                <w:szCs w:val="16"/>
+              </w:rPr>
+            </w:pPr>
+            <w:r>
+              <w:rPr>
+                <w:color w:val="000000"/>
+                <w:sz w:val="16"/>
+                <w:szCs w:val="16"/>
+              </w:rPr>
+            </w:r>
+          </w:p>
+        </w:tc>
+        <w:tc>
+          <w:tcPr>
+            <w:tcW w:w="4667" w:type="dxa"/>
+            <w:tcBorders>
+              <w:top w:val="single" w:sz="4" w:space="0" w:color="7F7F7F"/>
+              <w:bottom w:val="single" w:sz="4" w:space="0" w:color="7F7F7F"/>
+            </w:tcBorders>
+          </w:tcPr>
+          <w:p>
+            <w:pPr>
+              <w:pStyle w:val="Normal"/>
+              <w:keepLines/>
+              <w:spacing w:lineRule="auto" w:line="276" w:before="0" w:after="0"/>
+              <w:rPr>
+                <w:rFonts w:cs="Arial"/>
+                <w:b/>
+                <w:sz w:val="16"/>
+                <w:szCs w:val="16"/>
+                <w:lang w:val="en-US"/>
+              </w:rPr>
+            </w:pPr>
+            <w:r>
+              <w:rPr>
+                <w:rFonts w:cs="Arial"/>
+                <w:b/>
+                <w:sz w:val="16"/>
+                <w:szCs w:val="16"/>
+                <w:lang w:val="en-US"/>
+              </w:rPr>
+              <w:t>{#products}{name}</w:t>
+            </w:r>
+          </w:p>
+          <w:p>
+            <w:pPr>
+              <w:pStyle w:val="Normal"/>
+              <w:spacing w:lineRule="auto" w:line="276" w:before="0" w:after="0"/>
+              <w:rPr>
+                <w:rFonts w:cs="Arial"/>
+                <w:b/>
+                <w:sz w:val="16"/>
+                <w:szCs w:val="16"/>
+                <w:lang w:val="en-US"/>
+              </w:rPr>
+            </w:pPr>
+            <w:r>
+              <w:rPr>
+                <w:rFonts w:cs="Arial"/>
+                <w:b/>
+                <w:sz w:val="16"/>
+                <w:szCs w:val="16"/>
+                <w:lang w:val="en-US"/>
+              </w:rPr>
+              <w:t>{contract.name}</w:t>
+            </w:r>
+          </w:p>
+        </w:tc>
+        <w:tc>
+          <w:tcPr>
+            <w:tcW w:w="1099" w:type="dxa"/>
+            <w:tcBorders>
+              <w:top w:val="single" w:sz="4" w:space="0" w:color="7F7F7F"/>
+              <w:bottom w:val="single" w:sz="4" w:space="0" w:color="7F7F7F"/>
+            </w:tcBorders>
+            <w:vAlign w:val="center"/>
+          </w:tcPr>
+          <w:p>
+            <w:pPr>
+              <w:pStyle w:val="Normal"/>
+              <w:spacing w:lineRule="auto" w:line="240" w:before="60" w:after="60"/>
+              <w:jc w:val="end"/>
+              <w:rPr>
+                <w:rFonts w:cs="Arial"/>
+                <w:sz w:val="16"/>
+                <w:szCs w:val="16"/>
+              </w:rPr>
+            </w:pPr>
+            <w:r>
+              <w:rPr>
+                <w:rFonts w:cs="Arial"/>
+                <w:sz w:val="16"/>
+                <w:szCs w:val="16"/>
+              </w:rPr>
+              <w:t>{quantity}</w:t>
+            </w:r>
+          </w:p>
+        </w:tc>
+        <w:tc>
+          <w:tcPr>
+            <w:tcW w:w="1535" w:type="dxa"/>
+            <w:tcBorders>
+              <w:top w:val="single" w:sz="4" w:space="0" w:color="7F7F7F"/>
+              <w:bottom w:val="single" w:sz="4" w:space="0" w:color="7F7F7F"/>
+            </w:tcBorders>
+            <w:vAlign w:val="center"/>
+          </w:tcPr>
+          <w:p>
+            <w:pPr>
+              <w:pStyle w:val="Normal"/>
+              <w:spacing w:lineRule="auto" w:line="240" w:before="60" w:after="60"/>
+              <w:jc w:val="end"/>
+              <w:rPr>
+                <w:rFonts w:cs="Arial"/>
+                <w:sz w:val="16"/>
+                <w:szCs w:val="16"/>
+                <w:lang w:val="en-US"/>
+              </w:rPr>
+            </w:pPr>
+            <w:r>
+              <w:rPr>
+                <w:rFonts w:cs="Arial"/>
+                <w:sz w:val="16"/>
+                <w:szCs w:val="16"/>
+                <w:lang w:val="en-US"/>
+              </w:rPr>
+              <w:t>{prices.price_1}</w:t>
+            </w:r>
+          </w:p>
+        </w:tc>
+        <w:tc>
+          <w:tcPr>
+            <w:tcW w:w="1654" w:type="dxa"/>
+            <w:tcBorders>
+              <w:top w:val="single" w:sz="4" w:space="0" w:color="7F7F7F"/>
+              <w:bottom w:val="single" w:sz="4" w:space="0" w:color="7F7F7F"/>
+            </w:tcBorders>
+            <w:vAlign w:val="center"/>
+          </w:tcPr>
+          <w:p>
+            <w:pPr>
+              <w:pStyle w:val="Tabelle"/>
+              <w:spacing w:lineRule="auto" w:line="240" w:before="60" w:after="60"/>
+              <w:jc w:val="end"/>
+              <w:rPr>
+                <w:b/>
+                <w:color w:val="000000"/>
+                <w:sz w:val="16"/>
+                <w:szCs w:val="16"/>
+                <w:lang w:val="de-DE" w:eastAsia="de-DE"/>
+              </w:rPr>
+            </w:pPr>
+            <w:r>
+              <w:rPr>
+                <w:b/>
+                <w:color w:val="000000"/>
+                <w:sz w:val="16"/>
+                <w:szCs w:val="16"/>
+                <w:lang w:val="de-DE" w:eastAsia="de-DE"/>
+              </w:rPr>
+              <w:t>{/</w:t>
+            </w:r>
+            <w:r>
+              <w:rPr>
+                <w:rFonts w:cs="Arial"/>
+                <w:b/>
+                <w:color w:val="000000"/>
+                <w:sz w:val="16"/>
+                <w:szCs w:val="16"/>
+                <w:lang w:val="en-US" w:eastAsia="de-DE"/>
+              </w:rPr>
+              <w:t>products</w:t>
+            </w:r>
+            <w:r>
+              <w:rPr>
+                <w:b/>
+                <w:color w:val="000000"/>
+                <w:sz w:val="16"/>
+                <w:szCs w:val="16"/>
+                <w:lang w:val="de-DE" w:eastAsia="de-DE"/>
+              </w:rPr>
+              <w:t>}</w:t>
+            </w:r>
+          </w:p>
+        </w:tc>
+      </w:tr>
+      <w:tr>
+        <w:trPr>
+          <w:trHeight w:val="942" w:hRule="atLeast"/>
+          <w:cantSplit w:val="true"/>
+        </w:trPr>
+        <w:tc>
+          <w:tcPr>
+            <w:tcW w:w="610" w:type="dxa"/>
+            <w:gridSpan w:val="2"/>
+            <w:tcBorders>
+              <w:bottom w:val="single" w:sz="4" w:space="0" w:color="7F7F7F"/>
+            </w:tcBorders>
+            <w:vAlign w:val="center"/>
+          </w:tcPr>
+          <w:p>
+            <w:pPr>
+              <w:pStyle w:val="Normal"/>
+              <w:numPr>
+                <w:ilvl w:val="0"/>
+                <w:numId w:val="5"/>
+              </w:numPr>
+              <w:spacing w:lineRule="auto" w:line="240" w:before="60" w:after="60"/>
+              <w:jc w:val="center"/>
+              <w:rPr>
+                <w:color w:val="000000"/>
+                <w:sz w:val="16"/>
+                <w:szCs w:val="16"/>
+              </w:rPr>
+            </w:pPr>
+            <w:r>
+              <w:rPr>
+                <w:color w:val="000000"/>
+                <w:sz w:val="16"/>
+                <w:szCs w:val="16"/>
+              </w:rPr>
+            </w:r>
+          </w:p>
+        </w:tc>
+        <w:tc>
+          <w:tcPr>
+            <w:tcW w:w="4667" w:type="dxa"/>
+            <w:tcBorders>
+              <w:bottom w:val="single" w:sz="4" w:space="0" w:color="7F7F7F"/>
+            </w:tcBorders>
+          </w:tcPr>
+          <w:p>
+            <w:pPr>
+              <w:pStyle w:val="Normal"/>
+              <w:keepLines/>
+              <w:spacing w:lineRule="auto" w:line="276" w:before="0" w:after="0"/>
+              <w:rPr>
+                <w:rFonts w:cs="Arial"/>
+                <w:b/>
+                <w:sz w:val="16"/>
+                <w:szCs w:val="16"/>
+              </w:rPr>
+            </w:pPr>
+            <w:r>
+              <w:rPr>
+                <w:rFonts w:cs="Arial"/>
+                <w:b/>
+                <w:sz w:val="16"/>
+                <w:szCs w:val="16"/>
+              </w:rPr>
+              <w:t>dignum Dienstleistung - Keepit Backup für {}</w:t>
+            </w:r>
+          </w:p>
+          <w:p>
+            <w:pPr>
+              <w:pStyle w:val="Normal"/>
+              <w:keepLines/>
+              <w:spacing w:lineRule="auto" w:line="276" w:before="0" w:after="0"/>
+              <w:rPr>
+                <w:rFonts w:cs="Arial"/>
+                <w:bCs/>
+                <w:sz w:val="16"/>
+                <w:szCs w:val="16"/>
+              </w:rPr>
+            </w:pPr>
+            <w:r>
+              <w:rPr>
+                <w:rFonts w:cs="Arial"/>
+                <w:bCs/>
+                <w:sz w:val="16"/>
+                <w:szCs w:val="16"/>
+              </w:rPr>
+              <w:t>Onboarding, Unterstützung bei Ersteinrichtung &amp; Konfiguration sowie Einweisung / Schulung auf das Produkt</w:t>
+            </w:r>
+          </w:p>
+          <w:p>
+            <w:pPr>
+              <w:pStyle w:val="Normal"/>
+              <w:keepLines/>
+              <w:spacing w:lineRule="auto" w:line="276" w:before="0" w:after="0"/>
+              <w:rPr>
+                <w:rFonts w:cs="Arial"/>
+                <w:b/>
+                <w:sz w:val="16"/>
+                <w:szCs w:val="16"/>
+                <w:lang w:val="en-US"/>
+              </w:rPr>
+            </w:pPr>
+            <w:r>
+              <w:rPr>
+                <w:rFonts w:cs="Arial"/>
+                <w:bCs/>
+                <w:sz w:val="16"/>
+                <w:szCs w:val="16"/>
+              </w:rPr>
+              <w:t>- Pauschalpreis (einmalig)</w:t>
+            </w:r>
+          </w:p>
+        </w:tc>
+        <w:tc>
+          <w:tcPr>
+            <w:tcW w:w="1099" w:type="dxa"/>
+            <w:tcBorders>
+              <w:bottom w:val="single" w:sz="4" w:space="0" w:color="7F7F7F"/>
+            </w:tcBorders>
+            <w:vAlign w:val="center"/>
+          </w:tcPr>
+          <w:p>
+            <w:pPr>
+              <w:pStyle w:val="Normal"/>
+              <w:spacing w:lineRule="auto" w:line="240" w:before="60" w:after="60"/>
+              <w:jc w:val="end"/>
+              <w:rPr>
+                <w:rFonts w:cs="Arial"/>
+                <w:sz w:val="16"/>
+                <w:szCs w:val="16"/>
+              </w:rPr>
+            </w:pPr>
+            <w:r>
+              <w:rPr>
+                <w:rFonts w:cs="Arial"/>
+                <w:sz w:val="16"/>
+                <w:szCs w:val="16"/>
+              </w:rPr>
+              <w:t>1</w:t>
+            </w:r>
+          </w:p>
+        </w:tc>
+        <w:tc>
+          <w:tcPr>
+            <w:tcW w:w="1535" w:type="dxa"/>
+            <w:tcBorders>
+              <w:bottom w:val="single" w:sz="4" w:space="0" w:color="7F7F7F"/>
+            </w:tcBorders>
+            <w:vAlign w:val="center"/>
+          </w:tcPr>
+          <w:p>
+            <w:pPr>
+              <w:pStyle w:val="Normal"/>
+              <w:spacing w:lineRule="auto" w:line="240" w:before="60" w:after="60"/>
+              <w:jc w:val="end"/>
+              <w:rPr>
+                <w:rFonts w:cs="Arial"/>
+                <w:sz w:val="16"/>
+                <w:szCs w:val="16"/>
+                <w:lang w:val="en-US"/>
+              </w:rPr>
+            </w:pPr>
+            <w:r>
+              <w:rPr>
+                <w:rFonts w:cs="Arial"/>
+                <w:sz w:val="16"/>
+                <w:szCs w:val="16"/>
+                <w:lang w:val="en-US"/>
+              </w:rPr>
+            </w:r>
+          </w:p>
+        </w:tc>
+        <w:tc>
+          <w:tcPr>
+            <w:tcW w:w="1654" w:type="dxa"/>
+            <w:tcBorders>
+              <w:bottom w:val="single" w:sz="4" w:space="0" w:color="7F7F7F"/>
+            </w:tcBorders>
+            <w:vAlign w:val="center"/>
+          </w:tcPr>
+          <w:p>
+            <w:pPr>
+              <w:pStyle w:val="Normal"/>
+              <w:spacing w:lineRule="auto" w:line="240" w:before="60" w:after="60"/>
+              <w:jc w:val="end"/>
+              <w:rPr>
+                <w:color w:val="000000"/>
+                <w:sz w:val="16"/>
+                <w:szCs w:val="16"/>
+              </w:rPr>
+            </w:pPr>
+            <w:r>
+              <w:rPr>
+                <w:color w:val="000000"/>
+                <w:sz w:val="16"/>
+                <w:szCs w:val="16"/>
+              </w:rPr>
+              <w:t>300,00</w:t>
+            </w:r>
+          </w:p>
+        </w:tc>
+      </w:tr>
+      <w:tr>
+        <w:trPr>
+          <w:cantSplit w:val="true"/>
+        </w:trPr>
+        <w:tc>
+          <w:tcPr>
+            <w:tcW w:w="5277" w:type="dxa"/>
+            <w:gridSpan w:val="3"/>
+            <w:tcBorders>
+              <w:top w:val="single" w:sz="4" w:space="0" w:color="7F7F7F"/>
+            </w:tcBorders>
+          </w:tcPr>
+          <w:p>
+            <w:pPr>
+              <w:pStyle w:val="Normal"/>
+              <w:spacing w:before="60" w:after="60"/>
+              <w:rPr>
+                <w:b/>
+                <w:color w:val="000000"/>
+                <w:sz w:val="16"/>
+                <w:szCs w:val="16"/>
+              </w:rPr>
+            </w:pPr>
+            <w:r>
+              <w:rPr>
+                <w:b/>
+                <w:color w:val="000000"/>
+                <w:sz w:val="16"/>
+                <w:szCs w:val="16"/>
+              </w:rPr>
+            </w:r>
+          </w:p>
+        </w:tc>
+        <w:tc>
+          <w:tcPr>
+            <w:tcW w:w="2634" w:type="dxa"/>
+            <w:gridSpan w:val="2"/>
+            <w:tcBorders>
+              <w:top w:val="single" w:sz="4" w:space="0" w:color="7F7F7F"/>
+              <w:bottom w:val="single" w:sz="4" w:space="0" w:color="7F7F7F"/>
+            </w:tcBorders>
+            <w:vAlign w:val="center"/>
+          </w:tcPr>
+          <w:p>
+            <w:pPr>
+              <w:pStyle w:val="Tabelle"/>
+              <w:spacing w:lineRule="auto" w:line="240" w:before="60" w:after="60"/>
+              <w:jc w:val="start"/>
+              <w:rPr>
+                <w:b/>
+                <w:color w:val="000000"/>
+                <w:sz w:val="16"/>
+                <w:szCs w:val="16"/>
+                <w:lang w:val="de-DE" w:eastAsia="de-DE"/>
+              </w:rPr>
+            </w:pPr>
+            <w:r>
+              <w:rPr>
+                <w:b/>
+                <w:color w:val="000000"/>
+                <w:sz w:val="16"/>
+                <w:szCs w:val="16"/>
+                <w:lang w:val="de-DE" w:eastAsia="de-DE"/>
+              </w:rPr>
+              <w:t>Summe Netto EUR</w:t>
+            </w:r>
+          </w:p>
+        </w:tc>
+        <w:tc>
+          <w:tcPr>
+            <w:tcW w:w="1654" w:type="dxa"/>
+            <w:tcBorders>
+              <w:top w:val="single" w:sz="4" w:space="0" w:color="7F7F7F"/>
+              <w:bottom w:val="single" w:sz="4" w:space="0" w:color="7F7F7F"/>
+            </w:tcBorders>
+            <w:vAlign w:val="center"/>
+          </w:tcPr>
+          <w:p>
+            <w:pPr>
+              <w:pStyle w:val="Tabelle"/>
+              <w:spacing w:lineRule="auto" w:line="240" w:before="60" w:after="60"/>
+              <w:jc w:val="end"/>
+              <w:rPr>
+                <w:b/>
+                <w:color w:val="000000"/>
+                <w:sz w:val="16"/>
+                <w:szCs w:val="16"/>
+                <w:lang w:val="de-DE" w:eastAsia="de-DE"/>
+              </w:rPr>
+            </w:pPr>
+            <w:r>
+              <w:rPr>
+                <w:b/>
+                <w:color w:val="000000"/>
+                <w:sz w:val="16"/>
+                <w:szCs w:val="16"/>
+                <w:lang w:val="de-DE" w:eastAsia="de-DE"/>
+              </w:rPr>
+            </w:r>
+          </w:p>
+        </w:tc>
+      </w:tr>
+    </w:tbl>
+    <w:p>
+      <w:pPr>
+        <w:pStyle w:val="dignumStandardvor0nach0"/>
+        <w:rPr/>
+      </w:pPr>
+      <w:r>
+        <w:rPr/>
+      </w:r>
+    </w:p>
+    <w:p>
+      <w:pPr>
+        <w:pStyle w:val="dignumStandardvor0nach0"/>
+        <w:rPr/>
+      </w:pPr>
+      <w:r>
+        <w:rPr/>
+      </w:r>
+    </w:p>
+    <w:p>
+      <w:pPr>
+        <w:pStyle w:val="dignumStandardvor0nach0"/>
+        <w:rPr/>
+      </w:pPr>
+      <w:r>
+        <w:rPr/>
+        <w:t>{/positions.products}</w:t>
+      </w:r>
+    </w:p>
+    <w:p>
+      <w:pPr>
+        <w:pStyle w:val="dignumStandardvor0nach0"/>
+        <w:rPr/>
+      </w:pPr>
+      <w:r>
+        <w:rPr/>
+        <w:t>{/positions.includesOptionals}</w:t>
       </w:r>
     </w:p>
     <w:sectPr>
@@ -2391,8 +3230,8 @@
     </w:tblPr>
     <w:tblGrid>
       <w:gridCol w:w="3012"/>
-      <w:gridCol w:w="2966"/>
-      <w:gridCol w:w="4087"/>
+      <w:gridCol w:w="2965"/>
+      <w:gridCol w:w="4088"/>
     </w:tblGrid>
     <w:tr>
       <w:trPr>
@@ -2454,7 +3293,7 @@
       </w:tc>
       <w:tc>
         <w:tcPr>
-          <w:tcW w:w="2966" w:type="dxa"/>
+          <w:tcW w:w="2965" w:type="dxa"/>
           <w:tcBorders>
             <w:start w:val="single" w:sz="4" w:space="0" w:color="7F7F7F"/>
             <w:end w:val="single" w:sz="4" w:space="0" w:color="7F7F7F"/>
@@ -2513,7 +3352,7 @@
       </w:tc>
       <w:tc>
         <w:tcPr>
-          <w:tcW w:w="4087" w:type="dxa"/>
+          <w:tcW w:w="4088" w:type="dxa"/>
           <w:tcBorders>
             <w:start w:val="single" w:sz="4" w:space="0" w:color="7F7F7F"/>
           </w:tcBorders>
@@ -2628,7 +3467,7 @@
       </w:tc>
       <w:tc>
         <w:tcPr>
-          <w:tcW w:w="2966" w:type="dxa"/>
+          <w:tcW w:w="2965" w:type="dxa"/>
           <w:tcBorders>
             <w:start w:val="single" w:sz="4" w:space="0" w:color="7F7F7F"/>
             <w:end w:val="single" w:sz="4" w:space="0" w:color="7F7F7F"/>
@@ -2687,7 +3526,7 @@
       </w:tc>
       <w:tc>
         <w:tcPr>
-          <w:tcW w:w="4087" w:type="dxa"/>
+          <w:tcW w:w="4088" w:type="dxa"/>
           <w:tcBorders>
             <w:start w:val="single" w:sz="4" w:space="0" w:color="7F7F7F"/>
           </w:tcBorders>
@@ -2807,7 +3646,7 @@
       </w:tc>
       <w:tc>
         <w:tcPr>
-          <w:tcW w:w="2966" w:type="dxa"/>
+          <w:tcW w:w="2965" w:type="dxa"/>
           <w:tcBorders>
             <w:start w:val="single" w:sz="4" w:space="0" w:color="7F7F7F"/>
             <w:end w:val="single" w:sz="4" w:space="0" w:color="7F7F7F"/>
@@ -2866,7 +3705,7 @@
       </w:tc>
       <w:tc>
         <w:tcPr>
-          <w:tcW w:w="4087" w:type="dxa"/>
+          <w:tcW w:w="4088" w:type="dxa"/>
           <w:tcBorders>
             <w:start w:val="single" w:sz="4" w:space="0" w:color="7F7F7F"/>
           </w:tcBorders>
@@ -2995,7 +3834,7 @@
       </w:tc>
       <w:tc>
         <w:tcPr>
-          <w:tcW w:w="2966" w:type="dxa"/>
+          <w:tcW w:w="2965" w:type="dxa"/>
           <w:tcBorders>
             <w:start w:val="single" w:sz="4" w:space="0" w:color="7F7F7F"/>
             <w:end w:val="single" w:sz="4" w:space="0" w:color="7F7F7F"/>
@@ -3054,7 +3893,7 @@
       </w:tc>
       <w:tc>
         <w:tcPr>
-          <w:tcW w:w="4087" w:type="dxa"/>
+          <w:tcW w:w="4088" w:type="dxa"/>
           <w:tcBorders>
             <w:start w:val="single" w:sz="4" w:space="0" w:color="7F7F7F"/>
           </w:tcBorders>
@@ -3119,8 +3958,8 @@
     </w:tblPr>
     <w:tblGrid>
       <w:gridCol w:w="3012"/>
-      <w:gridCol w:w="2966"/>
-      <w:gridCol w:w="4087"/>
+      <w:gridCol w:w="2965"/>
+      <w:gridCol w:w="4088"/>
     </w:tblGrid>
     <w:tr>
       <w:trPr>
@@ -3182,7 +4021,7 @@
       </w:tc>
       <w:tc>
         <w:tcPr>
-          <w:tcW w:w="2966" w:type="dxa"/>
+          <w:tcW w:w="2965" w:type="dxa"/>
           <w:tcBorders>
             <w:start w:val="single" w:sz="4" w:space="0" w:color="7F7F7F"/>
             <w:end w:val="single" w:sz="4" w:space="0" w:color="7F7F7F"/>
@@ -3241,7 +4080,7 @@
       </w:tc>
       <w:tc>
         <w:tcPr>
-          <w:tcW w:w="4087" w:type="dxa"/>
+          <w:tcW w:w="4088" w:type="dxa"/>
           <w:tcBorders>
             <w:start w:val="single" w:sz="4" w:space="0" w:color="7F7F7F"/>
           </w:tcBorders>
@@ -3356,7 +4195,7 @@
       </w:tc>
       <w:tc>
         <w:tcPr>
-          <w:tcW w:w="2966" w:type="dxa"/>
+          <w:tcW w:w="2965" w:type="dxa"/>
           <w:tcBorders>
             <w:start w:val="single" w:sz="4" w:space="0" w:color="7F7F7F"/>
             <w:end w:val="single" w:sz="4" w:space="0" w:color="7F7F7F"/>
@@ -3415,7 +4254,7 @@
       </w:tc>
       <w:tc>
         <w:tcPr>
-          <w:tcW w:w="4087" w:type="dxa"/>
+          <w:tcW w:w="4088" w:type="dxa"/>
           <w:tcBorders>
             <w:start w:val="single" w:sz="4" w:space="0" w:color="7F7F7F"/>
           </w:tcBorders>
@@ -3535,7 +4374,7 @@
       </w:tc>
       <w:tc>
         <w:tcPr>
-          <w:tcW w:w="2966" w:type="dxa"/>
+          <w:tcW w:w="2965" w:type="dxa"/>
           <w:tcBorders>
             <w:start w:val="single" w:sz="4" w:space="0" w:color="7F7F7F"/>
             <w:end w:val="single" w:sz="4" w:space="0" w:color="7F7F7F"/>
@@ -3594,7 +4433,7 @@
       </w:tc>
       <w:tc>
         <w:tcPr>
-          <w:tcW w:w="4087" w:type="dxa"/>
+          <w:tcW w:w="4088" w:type="dxa"/>
           <w:tcBorders>
             <w:start w:val="single" w:sz="4" w:space="0" w:color="7F7F7F"/>
           </w:tcBorders>
@@ -3723,7 +4562,7 @@
       </w:tc>
       <w:tc>
         <w:tcPr>
-          <w:tcW w:w="2966" w:type="dxa"/>
+          <w:tcW w:w="2965" w:type="dxa"/>
           <w:tcBorders>
             <w:start w:val="single" w:sz="4" w:space="0" w:color="7F7F7F"/>
             <w:end w:val="single" w:sz="4" w:space="0" w:color="7F7F7F"/>
@@ -3782,7 +4621,7 @@
       </w:tc>
       <w:tc>
         <w:tcPr>
-          <w:tcW w:w="4087" w:type="dxa"/>
+          <w:tcW w:w="4088" w:type="dxa"/>
           <w:tcBorders>
             <w:start w:val="single" w:sz="4" w:space="0" w:color="7F7F7F"/>
           </w:tcBorders>
@@ -3863,7 +4702,7 @@
     </w:pPr>
     <w:r>
       <w:drawing>
-        <wp:anchor distT="0" distB="0" distL="0" distR="0" simplePos="0" relativeHeight="3" behindDoc="1" locked="0" layoutInCell="1" allowOverlap="1">
+        <wp:anchor distT="0" distB="0" distL="0" distR="0" simplePos="0" relativeHeight="4" behindDoc="1" locked="0" layoutInCell="1" allowOverlap="1">
           <wp:simplePos x="0" y="0"/>
           <wp:positionH relativeFrom="column">
             <wp:posOffset>4600575</wp:posOffset>
@@ -3947,7 +4786,7 @@
         <w:sz w:val="16"/>
         <w:szCs w:val="16"/>
       </w:rPr>
-      <w:t>2</w:t>
+      <w:t>1</w:t>
     </w:r>
     <w:r>
       <w:rPr>
@@ -3995,7 +4834,7 @@
         <w:sz w:val="16"/>
         <w:szCs w:val="16"/>
       </w:rPr>
-      <w:t>2</w:t>
+      <w:t>3</w:t>
     </w:r>
     <w:r>
       <w:rPr>
@@ -4087,7 +4926,7 @@
     </w:pPr>
     <w:r>
       <w:drawing>
-        <wp:anchor distT="0" distB="0" distL="0" distR="0" simplePos="0" relativeHeight="3" behindDoc="1" locked="0" layoutInCell="1" allowOverlap="1">
+        <wp:anchor distT="0" distB="0" distL="0" distR="0" simplePos="0" relativeHeight="4" behindDoc="1" locked="0" layoutInCell="1" allowOverlap="1">
           <wp:simplePos x="0" y="0"/>
           <wp:positionH relativeFrom="column">
             <wp:posOffset>4600575</wp:posOffset>
@@ -4171,7 +5010,7 @@
         <w:sz w:val="16"/>
         <w:szCs w:val="16"/>
       </w:rPr>
-      <w:t>2</w:t>
+      <w:t>1</w:t>
     </w:r>
     <w:r>
       <w:rPr>
@@ -4219,7 +5058,7 @@
         <w:sz w:val="16"/>
         <w:szCs w:val="16"/>
       </w:rPr>
-      <w:t>2</w:t>
+      <w:t>3</w:t>
     </w:r>
     <w:r>
       <w:rPr>
@@ -6252,8 +7091,8 @@
     <w:qFormat/>
     <w:rPr/>
   </w:style>
-  <w:style w:type="character" w:styleId="Bulletsuser">
-    <w:name w:val="Bullets (user)"/>
+  <w:style w:type="character" w:styleId="Bullets">
+    <w:name w:val="Bullets"/>
     <w:qFormat/>
     <w:rPr>
       <w:rFonts w:ascii="OpenSymbol" w:hAnsi="OpenSymbol" w:eastAsia="OpenSymbol" w:cs="OpenSymbol"/>
@@ -6266,6 +7105,11 @@
       <w:i/>
       <w:iCs/>
     </w:rPr>
+  </w:style>
+  <w:style w:type="character" w:styleId="NumberingSymbols">
+    <w:name w:val="Numbering Symbols"/>
+    <w:qFormat/>
+    <w:rPr/>
   </w:style>
   <w:style w:type="paragraph" w:styleId="Heading">
     <w:name w:val="Heading"/>
@@ -6849,8 +7693,8 @@
     </w:pPr>
     <w:rPr/>
   </w:style>
-  <w:style w:type="paragraph" w:styleId="FrameContentsuser">
-    <w:name w:val="Frame Contents (user)"/>
+  <w:style w:type="paragraph" w:styleId="FrameContents">
+    <w:name w:val="Frame Contents"/>
     <w:basedOn w:val="Normal"/>
     <w:qFormat/>
     <w:pPr/>
@@ -6876,8 +7720,8 @@
     <w:pPr/>
     <w:rPr/>
   </w:style>
-  <w:style w:type="paragraph" w:styleId="FrameContents">
-    <w:name w:val="Frame Contents"/>
+  <w:style w:type="paragraph" w:styleId="FrameContentsuser">
+    <w:name w:val="Frame Contents (user)"/>
     <w:basedOn w:val="Normal"/>
     <w:qFormat/>
     <w:pPr/>
@@ -6894,8 +7738,8 @@
     <w:name w:val="Nummerierung 123"/>
     <w:qFormat/>
   </w:style>
-  <w:style w:type="numbering" w:styleId="Bulletuser">
-    <w:name w:val="Bullet • (user)"/>
+  <w:style w:type="numbering" w:styleId="Bullet">
+    <w:name w:val="Bullet •"/>
     <w:qFormat/>
   </w:style>
   <w:style w:type="table" w:default="1" w:styleId="NormaleTabelle">

</xml_diff>

<commit_message>
Save State. Temp removed optional/compare
</commit_message>
<xml_diff>
--- a/server/assets/templates/offer.docx
+++ b/server/assets/templates/offer.docx
@@ -15,7 +15,7 @@
           <w:bottom w:w="0" w:type="dxa"/>
           <w:end w:w="70" w:type="dxa"/>
         </w:tblCellMar>
-        <w:tblLook w:val="0000" w:noVBand="0" w:noHBand="0" w:lastColumn="0" w:firstColumn="0" w:lastRow="0" w:firstRow="0"/>
+        <w:tblLook w:val="0000" w:noHBand="0" w:noVBand="0" w:firstColumn="0" w:lastRow="0" w:lastColumn="0" w:firstRow="0"/>
       </w:tblPr>
       <w:tblGrid>
         <w:gridCol w:w="2055"/>
@@ -458,7 +458,7 @@
       </w:tr>
       <w:tr>
         <w:trPr>
-          <w:trHeight w:val="1063" w:hRule="atLeast"/>
+          <w:trHeight w:val="1105" w:hRule="atLeast"/>
         </w:trPr>
         <w:tc>
           <w:tcPr>
@@ -552,7 +552,7 @@
           <w:bottom w:w="0" w:type="dxa"/>
           <w:end w:w="108" w:type="dxa"/>
         </w:tblCellMar>
-        <w:tblLook w:val="01e0" w:noVBand="0" w:noHBand="0" w:lastColumn="1" w:firstColumn="1" w:lastRow="1" w:firstRow="1"/>
+        <w:tblLook w:val="01e0" w:noHBand="0" w:noVBand="0" w:firstColumn="1" w:lastRow="1" w:lastColumn="1" w:firstRow="1"/>
       </w:tblPr>
       <w:tblGrid>
         <w:gridCol w:w="4593"/>
@@ -764,7 +764,7 @@
         <w:rPr>
           <w:b/>
         </w:rPr>
-        <w:t>Keepit SaaS-Backup für {positions.names}</w:t>
+        <w:t>Keepit SaaS-Backup für {products.names}</w:t>
       </w:r>
     </w:p>
     <w:p>
@@ -802,14 +802,14 @@
       </w:pPr>
       <w:r>
         <w:rPr/>
-        <w:t>hiermit senden wir Ihnen wie besprochen unser Angebot zur Einrichtung einer SaaS-Backup Lösung für Ihre {</w:t>
+        <w:t>hiermit senden wir Ihnen wie besprochen unser Angebot zur Einrichtung einer SaaS-Backup Lösung für Ihre {products</w:t>
       </w:r>
       <w:r>
         <w:rPr>
           <w:b w:val="false"/>
           <w:bCs w:val="false"/>
         </w:rPr>
-        <w:t>positions.names</w:t>
+        <w:t>.names</w:t>
       </w:r>
       <w:r>
         <w:rPr/>
@@ -832,56 +832,21 @@
       </w:pPr>
       <w:r>
         <w:rPr/>
-        <w:t>{#positions.includesOptionals}</w:t>
+        <w:t>{#</w:t>
+      </w:r>
+      <w:r>
+        <w:rPr/>
+        <w:t>products.</w:t>
+      </w:r>
+      <w:r>
+        <w:rPr/>
+        <w:t>grouped}</w:t>
       </w:r>
     </w:p>
     <w:p>
       <w:pPr>
         <w:pStyle w:val="dignumStandardvor0nach0"/>
-        <w:rPr/>
-      </w:pPr>
-      <w:r>
-        <w:rPr/>
-        <w:t xml:space="preserve">Das Angebot ist unterteilt in folgende, </w:t>
-      </w:r>
-      <w:r>
-        <w:rPr>
-          <w:b/>
-          <w:bCs/>
-        </w:rPr>
-        <w:t>alternative Offerten</w:t>
-      </w:r>
-      <w:r>
-        <w:rPr/>
-        <w:t>:</w:t>
-      </w:r>
-    </w:p>
-    <w:p>
-      <w:pPr>
-        <w:pStyle w:val="dignumStandardvor0nach0"/>
-        <w:rPr/>
-      </w:pPr>
-      <w:r>
-        <w:rPr/>
-      </w:r>
-    </w:p>
-    <w:p>
-      <w:pPr>
-        <w:pStyle w:val="dignumStandardvor0nach0"/>
-        <w:rPr/>
-      </w:pPr>
-      <w:r>
-        <w:rPr/>
-        <w:t>{#positions.products}</w:t>
-      </w:r>
-    </w:p>
-    <w:p>
-      <w:pPr>
-        <w:pStyle w:val="dignumStandardvor0nach0"/>
-        <w:numPr>
-          <w:ilvl w:val="0"/>
-          <w:numId w:val="8"/>
-        </w:numPr>
+        <w:jc w:val="start"/>
         <w:rPr>
           <w:b/>
           <w:bCs/>
@@ -899,214 +864,8 @@
       <w:pPr>
         <w:pStyle w:val="dignumStandardvor0nach0"/>
         <w:numPr>
-          <w:ilvl w:val="1"/>
-          <w:numId w:val="9"/>
-        </w:numPr>
-        <w:rPr>
-          <w:b w:val="false"/>
-          <w:bCs w:val="false"/>
-        </w:rPr>
-      </w:pPr>
-      <w:r>
-        <w:rPr>
-          <w:b w:val="false"/>
-          <w:bCs w:val="false"/>
-        </w:rPr>
-        <w:t xml:space="preserve">Im Vertrag </w:t>
-      </w:r>
-      <w:r>
-        <w:rPr>
-          <w:b/>
-          <w:bCs/>
-        </w:rPr>
-        <w:t>„{contract.name}“</w:t>
-      </w:r>
-    </w:p>
-    <w:p>
-      <w:pPr>
-        <w:pStyle w:val="dignumStandardvor0nach0"/>
-        <w:numPr>
-          <w:ilvl w:val="2"/>
-          <w:numId w:val="9"/>
-        </w:numPr>
-        <w:rPr>
-          <w:b w:val="false"/>
-          <w:bCs w:val="false"/>
-        </w:rPr>
-      </w:pPr>
-      <w:r>
-        <w:rPr>
-          <w:b w:val="false"/>
-          <w:bCs w:val="false"/>
-        </w:rPr>
-        <w:t>{#contract.features}</w:t>
-      </w:r>
-    </w:p>
-    <w:p>
-      <w:pPr>
-        <w:pStyle w:val="dignumStandardvor0nach0"/>
-        <w:numPr>
-          <w:ilvl w:val="2"/>
-          <w:numId w:val="9"/>
-        </w:numPr>
-        <w:rPr>
-          <w:b w:val="false"/>
-          <w:bCs w:val="false"/>
-        </w:rPr>
-      </w:pPr>
-      <w:r>
-        <w:rPr>
-          <w:b w:val="false"/>
-          <w:bCs w:val="false"/>
-        </w:rPr>
-        <w:t>{.}</w:t>
-      </w:r>
-    </w:p>
-    <w:p>
-      <w:pPr>
-        <w:pStyle w:val="dignumStandardvor0nach0"/>
-        <w:numPr>
-          <w:ilvl w:val="2"/>
-          <w:numId w:val="9"/>
-        </w:numPr>
-        <w:rPr>
-          <w:b w:val="false"/>
-          <w:bCs w:val="false"/>
-        </w:rPr>
-      </w:pPr>
-      <w:r>
-        <w:rPr>
-          <w:b w:val="false"/>
-          <w:bCs w:val="false"/>
-        </w:rPr>
-        <w:t>{/contract.features}</w:t>
-      </w:r>
-    </w:p>
-    <w:p>
-      <w:pPr>
-        <w:pStyle w:val="dignumStandardvor0nach0"/>
-        <w:numPr>
-          <w:ilvl w:val="1"/>
-          <w:numId w:val="9"/>
-        </w:numPr>
-        <w:rPr>
-          <w:b w:val="false"/>
-          <w:bCs w:val="false"/>
-        </w:rPr>
-      </w:pPr>
-      <w:r>
-        <w:rPr>
-          <w:b w:val="false"/>
-          <w:bCs w:val="false"/>
-        </w:rPr>
-        <w:t xml:space="preserve">Vertragslaufzeit: </w:t>
-      </w:r>
-      <w:r>
-        <w:rPr>
-          <w:b/>
-          <w:bCs/>
-        </w:rPr>
-        <w:t>{duration}</w:t>
-      </w:r>
-    </w:p>
-    <w:p>
-      <w:pPr>
-        <w:pStyle w:val="dignumStandardvor0nach0"/>
-        <w:numPr>
-          <w:ilvl w:val="1"/>
-          <w:numId w:val="9"/>
-        </w:numPr>
-        <w:rPr>
-          <w:b w:val="false"/>
-          <w:bCs w:val="false"/>
-        </w:rPr>
-      </w:pPr>
-      <w:r>
-        <w:rPr>
-          <w:b w:val="false"/>
-          <w:bCs w:val="false"/>
-        </w:rPr>
-        <w:t>Zahlsungsweise: im Voraus</w:t>
-      </w:r>
-    </w:p>
-    <w:p>
-      <w:pPr>
-        <w:pStyle w:val="dignumStandardvor0nach0"/>
-        <w:rPr>
-          <w:b w:val="false"/>
-          <w:bCs w:val="false"/>
-        </w:rPr>
-      </w:pPr>
-      <w:r>
-        <w:rPr>
-          <w:b w:val="false"/>
-          <w:bCs w:val="false"/>
-        </w:rPr>
-      </w:r>
-    </w:p>
-    <w:p>
-      <w:pPr>
-        <w:pStyle w:val="dignumStandardvor0nach0"/>
-        <w:rPr/>
-      </w:pPr>
-      <w:r>
-        <w:rPr/>
-        <w:t>{/positions.products}</w:t>
-      </w:r>
-    </w:p>
-    <w:p>
-      <w:pPr>
-        <w:pStyle w:val="dignumStandardvor0nach0"/>
-        <w:rPr/>
-      </w:pPr>
-      <w:r>
-        <w:rPr/>
-        <w:t>{/positions.includesOptionals}</w:t>
-      </w:r>
-    </w:p>
-    <w:p>
-      <w:pPr>
-        <w:pStyle w:val="dignumStandardvor0nach0"/>
-        <w:rPr/>
-      </w:pPr>
-      <w:r>
-        <w:rPr/>
-        <w:t>{^positions.includesOptionals}</w:t>
-      </w:r>
-    </w:p>
-    <w:p>
-      <w:pPr>
-        <w:pStyle w:val="dignumStandardvor0nach0"/>
-        <w:rPr/>
-      </w:pPr>
-      <w:r>
-        <w:rPr/>
-        <w:t>{#positions.products}</w:t>
-      </w:r>
-    </w:p>
-    <w:p>
-      <w:pPr>
-        <w:pStyle w:val="dignumStandardvor0nach0"/>
-        <w:jc w:val="start"/>
-        <w:rPr>
-          <w:b/>
-          <w:bCs/>
-        </w:rPr>
-      </w:pPr>
-      <w:r>
-        <w:rPr>
-          <w:b/>
-          <w:bCs/>
-        </w:rPr>
-        <w:t>Keepit für {names}</w:t>
-      </w:r>
-    </w:p>
-    <w:p>
-      <w:pPr>
-        <w:pStyle w:val="dignumStandardvor0nach0"/>
-        <w:numPr>
           <w:ilvl w:val="0"/>
-          <w:numId w:val="6"/>
+          <w:numId w:val="5"/>
         </w:numPr>
         <w:jc w:val="start"/>
         <w:rPr>
@@ -1134,7 +893,7 @@
         <w:pStyle w:val="dignumStandardvor0nach0"/>
         <w:numPr>
           <w:ilvl w:val="1"/>
-          <w:numId w:val="7"/>
+          <w:numId w:val="6"/>
         </w:numPr>
         <w:jc w:val="start"/>
         <w:rPr>
@@ -1155,7 +914,7 @@
         <w:pStyle w:val="dignumStandardvor0nach0"/>
         <w:numPr>
           <w:ilvl w:val="1"/>
-          <w:numId w:val="7"/>
+          <w:numId w:val="6"/>
         </w:numPr>
         <w:jc w:val="start"/>
         <w:rPr>
@@ -1176,7 +935,7 @@
         <w:pStyle w:val="dignumStandardvor0nach0"/>
         <w:numPr>
           <w:ilvl w:val="1"/>
-          <w:numId w:val="7"/>
+          <w:numId w:val="6"/>
         </w:numPr>
         <w:jc w:val="start"/>
         <w:rPr>
@@ -1197,7 +956,7 @@
         <w:pStyle w:val="dignumStandardvor0nach0"/>
         <w:numPr>
           <w:ilvl w:val="0"/>
-          <w:numId w:val="6"/>
+          <w:numId w:val="5"/>
         </w:numPr>
         <w:jc w:val="start"/>
         <w:rPr>
@@ -1225,7 +984,7 @@
         <w:pStyle w:val="dignumStandardvor0nach0"/>
         <w:numPr>
           <w:ilvl w:val="0"/>
-          <w:numId w:val="6"/>
+          <w:numId w:val="5"/>
         </w:numPr>
         <w:jc w:val="start"/>
         <w:rPr/>
@@ -1245,17 +1004,15 @@
       </w:pPr>
       <w:r>
         <w:rPr/>
-        <w:t>{/positions.products}</w:t>
+        <w:t>{/</w:t>
       </w:r>
-    </w:p>
-    <w:p>
-      <w:pPr>
-        <w:pStyle w:val="dignumStandardvor0nach0"/>
-        <w:rPr/>
-      </w:pPr>
       <w:r>
         <w:rPr/>
-        <w:t>{/positions.includesOptionals}</w:t>
+        <w:t>products.</w:t>
+      </w:r>
+      <w:r>
+        <w:rPr/>
+        <w:t>grouped}</w:t>
       </w:r>
     </w:p>
     <w:p>
@@ -1305,7 +1062,23 @@
       </w:pPr>
       <w:r>
         <w:rPr/>
-        <w:t>{#products}{description}{/products}</w:t>
+        <w:t>{#products.</w:t>
+      </w:r>
+      <w:r>
+        <w:rPr/>
+        <w:t>items</w:t>
+      </w:r>
+      <w:r>
+        <w:rPr/>
+        <w:t>}{description}{/products.</w:t>
+      </w:r>
+      <w:r>
+        <w:rPr/>
+        <w:t>items</w:t>
+      </w:r>
+      <w:r>
+        <w:rPr/>
+        <w:t>}</w:t>
       </w:r>
     </w:p>
     <w:p>
@@ -1395,46 +1168,7 @@
       </w:pPr>
       <w:r>
         <w:rPr/>
-        <w:t>{#positions.includesOptionals}</w:t>
-      </w:r>
-    </w:p>
-    <w:p>
-      <w:pPr>
-        <w:pStyle w:val="dignumStandardvor0nach0"/>
-        <w:rPr/>
-      </w:pPr>
-      <w:r>
-        <w:rPr/>
-        <w:t>{#positions.products}</w:t>
-      </w:r>
-    </w:p>
-    <w:p>
-      <w:pPr>
-        <w:pStyle w:val="dignumStandardvor0nach0"/>
-        <w:numPr>
-          <w:ilvl w:val="0"/>
-          <w:numId w:val="4"/>
-        </w:numPr>
-        <w:rPr>
-          <w:b/>
-          <w:bCs/>
-        </w:rPr>
-      </w:pPr>
-      <w:r>
-        <w:rPr>
-          <w:b/>
-          <w:bCs/>
-        </w:rPr>
-        <w:t>Keepit für {names} „{contract.name}“ mit einer Laufzeit von {duration} Jahre(n)</w:t>
-      </w:r>
-    </w:p>
-    <w:p>
-      <w:pPr>
-        <w:pStyle w:val="dignumStandardvor0nach0"/>
-        <w:rPr/>
-      </w:pPr>
-      <w:r>
-        <w:rPr/>
+        <w:t>{#products.grouped}</w:t>
       </w:r>
     </w:p>
     <w:tbl>
@@ -1449,7 +1183,7 @@
           <w:bottom w:w="0" w:type="dxa"/>
           <w:end w:w="70" w:type="dxa"/>
         </w:tblCellMar>
-        <w:tblLook w:val="0000" w:noVBand="0" w:noHBand="0" w:lastColumn="0" w:firstColumn="0" w:lastRow="0" w:firstRow="0"/>
+        <w:tblLook w:val="0000" w:noHBand="0" w:noVBand="0" w:firstColumn="0" w:lastRow="0" w:lastColumn="0" w:firstRow="0"/>
       </w:tblPr>
       <w:tblGrid>
         <w:gridCol w:w="305"/>
@@ -1476,16 +1210,32 @@
           <w:p>
             <w:pPr>
               <w:pStyle w:val="Tabellenberschrift"/>
-              <w:spacing w:before="80" w:after="80"/>
+              <w:widowControl w:val="false"/>
+              <w:suppressLineNumbers/>
+              <w:suppressAutoHyphens w:val="true"/>
+              <w:bidi w:val="0"/>
+              <w:spacing w:lineRule="auto" w:line="240" w:before="80" w:after="80"/>
               <w:rPr>
+                <w:rFonts w:ascii="Arial" w:hAnsi="Arial" w:eastAsia="Times New Roman" w:cs="Times New Roman"/>
+                <w:b/>
+                <w:bCs/>
+                <w:color w:val="auto"/>
+                <w:kern w:val="0"/>
                 <w:sz w:val="16"/>
                 <w:szCs w:val="16"/>
+                <w:lang w:val="de-DE" w:eastAsia="de-DE" w:bidi="ar-SA"/>
               </w:rPr>
             </w:pPr>
             <w:r>
               <w:rPr>
+                <w:rFonts w:eastAsia="Times New Roman" w:cs="Times New Roman"/>
+                <w:b/>
+                <w:bCs/>
+                <w:color w:val="auto"/>
+                <w:kern w:val="0"/>
                 <w:sz w:val="16"/>
                 <w:szCs w:val="16"/>
+                <w:lang w:val="de-DE" w:eastAsia="de-DE" w:bidi="ar-SA"/>
               </w:rPr>
               <w:t>Pos.</w:t>
             </w:r>
@@ -1503,16 +1253,32 @@
           <w:p>
             <w:pPr>
               <w:pStyle w:val="Tabellenberschrift"/>
-              <w:spacing w:before="80" w:after="80"/>
+              <w:widowControl w:val="false"/>
+              <w:suppressLineNumbers/>
+              <w:suppressAutoHyphens w:val="true"/>
+              <w:bidi w:val="0"/>
+              <w:spacing w:lineRule="auto" w:line="240" w:before="80" w:after="80"/>
               <w:rPr>
+                <w:rFonts w:ascii="Arial" w:hAnsi="Arial" w:eastAsia="Times New Roman" w:cs="Times New Roman"/>
+                <w:b/>
+                <w:bCs/>
+                <w:color w:val="auto"/>
+                <w:kern w:val="0"/>
                 <w:sz w:val="16"/>
                 <w:szCs w:val="16"/>
+                <w:lang w:val="de-DE" w:eastAsia="de-DE" w:bidi="ar-SA"/>
               </w:rPr>
             </w:pPr>
             <w:r>
               <w:rPr>
+                <w:rFonts w:eastAsia="Times New Roman" w:cs="Times New Roman"/>
+                <w:b/>
+                <w:bCs/>
+                <w:color w:val="auto"/>
+                <w:kern w:val="0"/>
                 <w:sz w:val="16"/>
                 <w:szCs w:val="16"/>
+                <w:lang w:val="de-DE" w:eastAsia="de-DE" w:bidi="ar-SA"/>
               </w:rPr>
               <w:t>Artikel / Leistung</w:t>
             </w:r>
@@ -1530,17 +1296,32 @@
           <w:p>
             <w:pPr>
               <w:pStyle w:val="Tabellenberschrift"/>
-              <w:spacing w:before="80" w:after="80"/>
-              <w:jc w:val="center"/>
+              <w:widowControl w:val="false"/>
+              <w:suppressLineNumbers/>
+              <w:suppressAutoHyphens w:val="true"/>
+              <w:bidi w:val="0"/>
+              <w:spacing w:lineRule="auto" w:line="240" w:before="80" w:after="80"/>
               <w:rPr>
+                <w:rFonts w:ascii="Arial" w:hAnsi="Arial" w:eastAsia="Times New Roman" w:cs="Times New Roman"/>
+                <w:b/>
+                <w:bCs/>
+                <w:color w:val="auto"/>
+                <w:kern w:val="0"/>
                 <w:sz w:val="16"/>
                 <w:szCs w:val="16"/>
+                <w:lang w:val="de-DE" w:eastAsia="de-DE" w:bidi="ar-SA"/>
               </w:rPr>
             </w:pPr>
             <w:r>
               <w:rPr>
+                <w:rFonts w:eastAsia="Times New Roman" w:cs="Times New Roman"/>
+                <w:b/>
+                <w:bCs/>
+                <w:color w:val="auto"/>
+                <w:kern w:val="0"/>
                 <w:sz w:val="16"/>
                 <w:szCs w:val="16"/>
+                <w:lang w:val="de-DE" w:eastAsia="de-DE" w:bidi="ar-SA"/>
               </w:rPr>
               <w:t>Anz.</w:t>
             </w:r>
@@ -1558,17 +1339,32 @@
           <w:p>
             <w:pPr>
               <w:pStyle w:val="Tabellenberschrift"/>
-              <w:spacing w:before="80" w:after="80"/>
-              <w:jc w:val="center"/>
+              <w:widowControl w:val="false"/>
+              <w:suppressLineNumbers/>
+              <w:suppressAutoHyphens w:val="true"/>
+              <w:bidi w:val="0"/>
+              <w:spacing w:lineRule="auto" w:line="240" w:before="80" w:after="80"/>
               <w:rPr>
+                <w:rFonts w:ascii="Arial" w:hAnsi="Arial" w:eastAsia="Times New Roman" w:cs="Times New Roman"/>
+                <w:b/>
+                <w:bCs/>
+                <w:color w:val="auto"/>
+                <w:kern w:val="0"/>
                 <w:sz w:val="16"/>
                 <w:szCs w:val="16"/>
+                <w:lang w:val="de-DE" w:eastAsia="de-DE" w:bidi="ar-SA"/>
               </w:rPr>
             </w:pPr>
             <w:r>
               <w:rPr>
+                <w:rFonts w:eastAsia="Times New Roman" w:cs="Times New Roman"/>
+                <w:b/>
+                <w:bCs/>
+                <w:color w:val="auto"/>
+                <w:kern w:val="0"/>
                 <w:sz w:val="16"/>
                 <w:szCs w:val="16"/>
+                <w:lang w:val="de-DE" w:eastAsia="de-DE" w:bidi="ar-SA"/>
               </w:rPr>
               <w:t>Preis User</w:t>
             </w:r>
@@ -1576,17 +1372,32 @@
           <w:p>
             <w:pPr>
               <w:pStyle w:val="Tabellenberschrift"/>
-              <w:spacing w:before="80" w:after="80"/>
-              <w:jc w:val="center"/>
+              <w:widowControl w:val="false"/>
+              <w:suppressLineNumbers/>
+              <w:suppressAutoHyphens w:val="true"/>
+              <w:bidi w:val="0"/>
+              <w:spacing w:lineRule="auto" w:line="240" w:before="80" w:after="80"/>
               <w:rPr>
+                <w:rFonts w:ascii="Arial" w:hAnsi="Arial" w:eastAsia="Times New Roman" w:cs="Times New Roman"/>
+                <w:b/>
+                <w:bCs/>
+                <w:color w:val="auto"/>
+                <w:kern w:val="0"/>
                 <w:sz w:val="16"/>
                 <w:szCs w:val="16"/>
+                <w:lang w:val="de-DE" w:eastAsia="de-DE" w:bidi="ar-SA"/>
               </w:rPr>
             </w:pPr>
             <w:r>
               <w:rPr>
+                <w:rFonts w:eastAsia="Times New Roman" w:cs="Times New Roman"/>
+                <w:b/>
+                <w:bCs/>
+                <w:color w:val="auto"/>
+                <w:kern w:val="0"/>
                 <w:sz w:val="16"/>
                 <w:szCs w:val="16"/>
+                <w:lang w:val="de-DE" w:eastAsia="de-DE" w:bidi="ar-SA"/>
               </w:rPr>
               <w:t>/ Monat</w:t>
             </w:r>
@@ -1604,17 +1415,32 @@
           <w:p>
             <w:pPr>
               <w:pStyle w:val="Tabellenberschrift"/>
-              <w:spacing w:before="80" w:after="80"/>
-              <w:jc w:val="center"/>
+              <w:widowControl w:val="false"/>
+              <w:suppressLineNumbers/>
+              <w:suppressAutoHyphens w:val="true"/>
+              <w:bidi w:val="0"/>
+              <w:spacing w:lineRule="auto" w:line="240" w:before="80" w:after="80"/>
               <w:rPr>
+                <w:rFonts w:ascii="Arial" w:hAnsi="Arial" w:eastAsia="Times New Roman" w:cs="Times New Roman"/>
+                <w:b/>
+                <w:bCs/>
+                <w:color w:val="auto"/>
+                <w:kern w:val="0"/>
                 <w:sz w:val="16"/>
                 <w:szCs w:val="16"/>
+                <w:lang w:val="de-DE" w:eastAsia="de-DE" w:bidi="ar-SA"/>
               </w:rPr>
             </w:pPr>
             <w:r>
               <w:rPr>
+                <w:rFonts w:eastAsia="Times New Roman" w:cs="Times New Roman"/>
+                <w:b/>
+                <w:bCs/>
+                <w:color w:val="auto"/>
+                <w:kern w:val="0"/>
                 <w:sz w:val="16"/>
                 <w:szCs w:val="16"/>
+                <w:lang w:val="de-DE" w:eastAsia="de-DE" w:bidi="ar-SA"/>
               </w:rPr>
               <w:t>Gesamt EUR</w:t>
             </w:r>
@@ -1622,19 +1448,34 @@
           <w:p>
             <w:pPr>
               <w:pStyle w:val="Tabellenberschrift"/>
-              <w:spacing w:before="80" w:after="80"/>
-              <w:jc w:val="center"/>
+              <w:widowControl w:val="false"/>
+              <w:suppressLineNumbers/>
+              <w:suppressAutoHyphens w:val="true"/>
+              <w:bidi w:val="0"/>
+              <w:spacing w:lineRule="auto" w:line="240" w:before="80" w:after="80"/>
               <w:rPr>
+                <w:rFonts w:ascii="Arial" w:hAnsi="Arial" w:eastAsia="Times New Roman" w:cs="Times New Roman"/>
+                <w:b/>
+                <w:bCs/>
+                <w:color w:val="auto"/>
+                <w:kern w:val="0"/>
                 <w:sz w:val="16"/>
                 <w:szCs w:val="16"/>
+                <w:lang w:val="de-DE" w:eastAsia="de-DE" w:bidi="ar-SA"/>
               </w:rPr>
             </w:pPr>
             <w:r>
               <w:rPr>
+                <w:rFonts w:eastAsia="Times New Roman" w:cs="Times New Roman"/>
+                <w:b/>
+                <w:bCs/>
+                <w:color w:val="auto"/>
+                <w:kern w:val="0"/>
                 <w:sz w:val="16"/>
                 <w:szCs w:val="16"/>
+                <w:lang w:val="de-DE" w:eastAsia="de-DE" w:bidi="ar-SA"/>
               </w:rPr>
-              <w:t>(36 Monate)</w:t>
+              <w:t>({duration_months} Monate)</w:t>
             </w:r>
           </w:p>
         </w:tc>
@@ -1734,7 +1575,7 @@
       </w:tr>
       <w:tr>
         <w:trPr>
-          <w:trHeight w:val="456" w:hRule="atLeast"/>
+          <w:trHeight w:val="556" w:hRule="atLeast"/>
         </w:trPr>
         <w:tc>
           <w:tcPr>
@@ -1751,10 +1592,10 @@
               <w:pStyle w:val="Normal"/>
               <w:numPr>
                 <w:ilvl w:val="0"/>
-                <w:numId w:val="5"/>
+                <w:numId w:val="4"/>
               </w:numPr>
               <w:spacing w:lineRule="auto" w:line="240" w:before="60" w:after="60"/>
-              <w:jc w:val="center"/>
+              <w:jc w:val="start"/>
               <w:rPr>
                 <w:color w:val="000000"/>
                 <w:sz w:val="16"/>
@@ -1777,12 +1618,14 @@
               <w:top w:val="single" w:sz="4" w:space="0" w:color="7F7F7F"/>
               <w:bottom w:val="single" w:sz="4" w:space="0" w:color="7F7F7F"/>
             </w:tcBorders>
+            <w:vAlign w:val="center"/>
           </w:tcPr>
           <w:p>
             <w:pPr>
               <w:pStyle w:val="Normal"/>
               <w:keepLines/>
               <w:spacing w:lineRule="auto" w:line="276" w:before="0" w:after="0"/>
+              <w:jc w:val="start"/>
               <w:rPr>
                 <w:rFonts w:cs="Arial"/>
                 <w:b/>
@@ -1799,13 +1642,25 @@
                 <w:szCs w:val="16"/>
                 <w:lang w:val="en-US"/>
               </w:rPr>
-              <w:t>{#products}{name}</w:t>
+              <w:t>{#items}{#optional}</w:t>
+            </w:r>
+            <w:r>
+              <w:rPr>
+                <w:rFonts w:cs="Arial"/>
+                <w:b/>
+                <w:sz w:val="16"/>
+                <w:szCs w:val="16"/>
+                <w:u w:val="single"/>
+                <w:lang w:val="en-US"/>
+              </w:rPr>
+              <w:t>(optional):{/optional}</w:t>
             </w:r>
           </w:p>
           <w:p>
             <w:pPr>
               <w:pStyle w:val="Normal"/>
               <w:spacing w:lineRule="auto" w:line="276" w:before="0" w:after="0"/>
+              <w:jc w:val="start"/>
               <w:rPr>
                 <w:rFonts w:cs="Arial"/>
                 <w:b/>
@@ -1818,6 +1673,28 @@
               <w:rPr>
                 <w:rFonts w:cs="Arial"/>
                 <w:b/>
+                <w:sz w:val="16"/>
+                <w:szCs w:val="16"/>
+                <w:lang w:val="en-US"/>
+              </w:rPr>
+              <w:t>{name}</w:t>
+            </w:r>
+          </w:p>
+          <w:p>
+            <w:pPr>
+              <w:pStyle w:val="Normal"/>
+              <w:spacing w:lineRule="auto" w:line="276" w:before="0" w:after="0"/>
+              <w:jc w:val="start"/>
+              <w:rPr>
+                <w:b w:val="false"/>
+                <w:bCs w:val="false"/>
+              </w:rPr>
+            </w:pPr>
+            <w:r>
+              <w:rPr>
+                <w:rFonts w:cs="Arial"/>
+                <w:b w:val="false"/>
+                <w:bCs w:val="false"/>
                 <w:sz w:val="16"/>
                 <w:szCs w:val="16"/>
                 <w:lang w:val="en-US"/>
@@ -1839,12 +1716,8 @@
             <w:pPr>
               <w:pStyle w:val="Normal"/>
               <w:spacing w:lineRule="auto" w:line="240" w:before="60" w:after="60"/>
-              <w:jc w:val="end"/>
-              <w:rPr>
-                <w:rFonts w:cs="Arial"/>
-                <w:sz w:val="16"/>
-                <w:szCs w:val="16"/>
-              </w:rPr>
+              <w:jc w:val="start"/>
+              <w:rPr/>
             </w:pPr>
             <w:r>
               <w:rPr>
@@ -1869,13 +1742,8 @@
             <w:pPr>
               <w:pStyle w:val="Normal"/>
               <w:spacing w:lineRule="auto" w:line="240" w:before="60" w:after="60"/>
-              <w:jc w:val="end"/>
-              <w:rPr>
-                <w:rFonts w:cs="Arial"/>
-                <w:sz w:val="16"/>
-                <w:szCs w:val="16"/>
-                <w:lang w:val="en-US"/>
-              </w:rPr>
+              <w:jc w:val="start"/>
+              <w:rPr/>
             </w:pPr>
             <w:r>
               <w:rPr>
@@ -1884,7 +1752,25 @@
                 <w:szCs w:val="16"/>
                 <w:lang w:val="en-US"/>
               </w:rPr>
-              <w:t>{prices.price_1}</w:t>
+              <w:t>{</w:t>
+            </w:r>
+            <w:r>
+              <w:rPr>
+                <w:rFonts w:cs="Arial"/>
+                <w:sz w:val="16"/>
+                <w:szCs w:val="16"/>
+                <w:lang w:val="en-US"/>
+              </w:rPr>
+              <w:t>price.unit</w:t>
+            </w:r>
+            <w:r>
+              <w:rPr>
+                <w:rFonts w:cs="Arial"/>
+                <w:sz w:val="16"/>
+                <w:szCs w:val="16"/>
+                <w:lang w:val="en-US"/>
+              </w:rPr>
+              <w:t>}</w:t>
             </w:r>
           </w:p>
         </w:tc>
@@ -1901,247 +1787,39 @@
             <w:pPr>
               <w:pStyle w:val="Tabelle"/>
               <w:spacing w:lineRule="auto" w:line="240" w:before="60" w:after="60"/>
-              <w:jc w:val="end"/>
+              <w:jc w:val="start"/>
               <w:rPr>
                 <w:b/>
+                <w:bCs/>
+                <w:i w:val="false"/>
+                <w:iCs w:val="false"/>
+              </w:rPr>
+            </w:pPr>
+            <w:r>
+              <w:rPr>
+                <w:b/>
+                <w:bCs/>
+                <w:i w:val="false"/>
+                <w:iCs w:val="false"/>
                 <w:color w:val="000000"/>
                 <w:sz w:val="16"/>
                 <w:szCs w:val="16"/>
                 <w:lang w:val="de-DE" w:eastAsia="de-DE"/>
               </w:rPr>
-            </w:pPr>
+              <w:t>{price.total}</w:t>
+            </w:r>
             <w:r>
               <w:rPr>
                 <w:b/>
+                <w:bCs/>
+                <w:i w:val="false"/>
+                <w:iCs w:val="false"/>
                 <w:color w:val="000000"/>
                 <w:sz w:val="16"/>
                 <w:szCs w:val="16"/>
                 <w:lang w:val="de-DE" w:eastAsia="de-DE"/>
               </w:rPr>
-              <w:t>{/</w:t>
-            </w:r>
-            <w:r>
-              <w:rPr>
-                <w:rFonts w:cs="Arial"/>
-                <w:b/>
-                <w:color w:val="000000"/>
-                <w:sz w:val="16"/>
-                <w:szCs w:val="16"/>
-                <w:lang w:val="en-US" w:eastAsia="de-DE"/>
-              </w:rPr>
-              <w:t>products</w:t>
-            </w:r>
-            <w:r>
-              <w:rPr>
-                <w:b/>
-                <w:color w:val="000000"/>
-                <w:sz w:val="16"/>
-                <w:szCs w:val="16"/>
-                <w:lang w:val="de-DE" w:eastAsia="de-DE"/>
-              </w:rPr>
-              <w:t>}</w:t>
-            </w:r>
-          </w:p>
-        </w:tc>
-      </w:tr>
-      <w:tr>
-        <w:trPr>
-          <w:trHeight w:val="942" w:hRule="atLeast"/>
-          <w:cantSplit w:val="true"/>
-        </w:trPr>
-        <w:tc>
-          <w:tcPr>
-            <w:tcW w:w="610" w:type="dxa"/>
-            <w:gridSpan w:val="2"/>
-            <w:tcBorders>
-              <w:bottom w:val="single" w:sz="4" w:space="0" w:color="7F7F7F"/>
-            </w:tcBorders>
-            <w:vAlign w:val="center"/>
-          </w:tcPr>
-          <w:p>
-            <w:pPr>
-              <w:pStyle w:val="Normal"/>
-              <w:numPr>
-                <w:ilvl w:val="0"/>
-                <w:numId w:val="5"/>
-              </w:numPr>
-              <w:spacing w:lineRule="auto" w:line="240" w:before="60" w:after="60"/>
-              <w:jc w:val="center"/>
-              <w:rPr>
-                <w:color w:val="000000"/>
-                <w:sz w:val="16"/>
-                <w:szCs w:val="16"/>
-              </w:rPr>
-            </w:pPr>
-            <w:r>
-              <w:rPr>
-                <w:color w:val="000000"/>
-                <w:sz w:val="16"/>
-                <w:szCs w:val="16"/>
-              </w:rPr>
-            </w:r>
-          </w:p>
-        </w:tc>
-        <w:tc>
-          <w:tcPr>
-            <w:tcW w:w="4667" w:type="dxa"/>
-            <w:tcBorders>
-              <w:bottom w:val="single" w:sz="4" w:space="0" w:color="7F7F7F"/>
-            </w:tcBorders>
-          </w:tcPr>
-          <w:p>
-            <w:pPr>
-              <w:pStyle w:val="Normal"/>
-              <w:keepLines/>
-              <w:spacing w:lineRule="auto" w:line="276" w:before="0" w:after="0"/>
-              <w:rPr>
-                <w:rFonts w:cs="Arial"/>
-                <w:b/>
-                <w:sz w:val="16"/>
-                <w:szCs w:val="16"/>
-              </w:rPr>
-            </w:pPr>
-            <w:r>
-              <w:rPr>
-                <w:rFonts w:cs="Arial"/>
-                <w:b/>
-                <w:sz w:val="16"/>
-                <w:szCs w:val="16"/>
-              </w:rPr>
-              <w:t>dignum Dienstleistung - Keepit Backup für {}</w:t>
-            </w:r>
-          </w:p>
-          <w:p>
-            <w:pPr>
-              <w:pStyle w:val="Normal"/>
-              <w:keepLines/>
-              <w:spacing w:lineRule="auto" w:line="276" w:before="0" w:after="0"/>
-              <w:rPr>
-                <w:rFonts w:cs="Arial"/>
-                <w:bCs/>
-                <w:sz w:val="16"/>
-                <w:szCs w:val="16"/>
-              </w:rPr>
-            </w:pPr>
-            <w:r>
-              <w:rPr>
-                <w:rFonts w:cs="Arial"/>
-                <w:bCs/>
-                <w:sz w:val="16"/>
-                <w:szCs w:val="16"/>
-              </w:rPr>
-              <w:t>Onboarding, Unterstützung bei Ersteinrichtung &amp; Konfiguration sowie Einweisung / Schulung auf das Produkt</w:t>
-            </w:r>
-          </w:p>
-          <w:p>
-            <w:pPr>
-              <w:pStyle w:val="Normal"/>
-              <w:keepLines/>
-              <w:spacing w:lineRule="auto" w:line="276" w:before="0" w:after="0"/>
-              <w:rPr>
-                <w:rFonts w:cs="Arial"/>
-                <w:b/>
-                <w:sz w:val="16"/>
-                <w:szCs w:val="16"/>
-                <w:lang w:val="en-US"/>
-              </w:rPr>
-            </w:pPr>
-            <w:r>
-              <w:rPr>
-                <w:rFonts w:cs="Arial"/>
-                <w:bCs/>
-                <w:sz w:val="16"/>
-                <w:szCs w:val="16"/>
-              </w:rPr>
-              <w:t>- Pauschalpreis (einmalig)</w:t>
-            </w:r>
-          </w:p>
-        </w:tc>
-        <w:tc>
-          <w:tcPr>
-            <w:tcW w:w="1099" w:type="dxa"/>
-            <w:tcBorders>
-              <w:bottom w:val="single" w:sz="4" w:space="0" w:color="7F7F7F"/>
-            </w:tcBorders>
-            <w:vAlign w:val="center"/>
-          </w:tcPr>
-          <w:p>
-            <w:pPr>
-              <w:pStyle w:val="Normal"/>
-              <w:spacing w:lineRule="auto" w:line="240" w:before="60" w:after="60"/>
-              <w:jc w:val="end"/>
-              <w:rPr>
-                <w:rFonts w:cs="Arial"/>
-                <w:sz w:val="16"/>
-                <w:szCs w:val="16"/>
-              </w:rPr>
-            </w:pPr>
-            <w:r>
-              <w:rPr>
-                <w:rFonts w:cs="Arial"/>
-                <w:sz w:val="16"/>
-                <w:szCs w:val="16"/>
-              </w:rPr>
-              <w:t>1</w:t>
-            </w:r>
-          </w:p>
-        </w:tc>
-        <w:tc>
-          <w:tcPr>
-            <w:tcW w:w="1535" w:type="dxa"/>
-            <w:tcBorders>
-              <w:bottom w:val="single" w:sz="4" w:space="0" w:color="7F7F7F"/>
-            </w:tcBorders>
-            <w:vAlign w:val="center"/>
-          </w:tcPr>
-          <w:p>
-            <w:pPr>
-              <w:pStyle w:val="Normal"/>
-              <w:spacing w:lineRule="auto" w:line="240" w:before="60" w:after="60"/>
-              <w:jc w:val="end"/>
-              <w:rPr>
-                <w:rFonts w:cs="Arial"/>
-                <w:sz w:val="16"/>
-                <w:szCs w:val="16"/>
-                <w:lang w:val="en-US"/>
-              </w:rPr>
-            </w:pPr>
-            <w:r>
-              <w:rPr>
-                <w:rFonts w:cs="Arial"/>
-                <w:sz w:val="16"/>
-                <w:szCs w:val="16"/>
-                <w:lang w:val="en-US"/>
-              </w:rPr>
-            </w:r>
-          </w:p>
-        </w:tc>
-        <w:tc>
-          <w:tcPr>
-            <w:tcW w:w="1654" w:type="dxa"/>
-            <w:tcBorders>
-              <w:bottom w:val="single" w:sz="4" w:space="0" w:color="7F7F7F"/>
-            </w:tcBorders>
-            <w:vAlign w:val="center"/>
-          </w:tcPr>
-          <w:p>
-            <w:pPr>
-              <w:pStyle w:val="Normal"/>
-              <w:spacing w:lineRule="auto" w:line="240" w:before="60" w:after="60"/>
-              <w:jc w:val="end"/>
-              <w:rPr>
-                <w:color w:val="000000"/>
-                <w:sz w:val="16"/>
-                <w:szCs w:val="16"/>
-              </w:rPr>
-            </w:pPr>
-            <w:r>
-              <w:rPr>
-                <w:color w:val="000000"/>
-                <w:sz w:val="16"/>
-                <w:szCs w:val="16"/>
-              </w:rPr>
-              <w:t>300,00</w:t>
+              <w:t>{/}</w:t>
             </w:r>
           </w:p>
         </w:tc>
@@ -2196,15 +1874,17 @@
               <w:jc w:val="start"/>
               <w:rPr>
                 <w:b/>
-                <w:color w:val="000000"/>
-                <w:sz w:val="16"/>
-                <w:szCs w:val="16"/>
-                <w:lang w:val="de-DE" w:eastAsia="de-DE"/>
+                <w:bCs/>
+                <w:i w:val="false"/>
+                <w:iCs w:val="false"/>
               </w:rPr>
             </w:pPr>
             <w:r>
               <w:rPr>
                 <w:b/>
+                <w:bCs/>
+                <w:i w:val="false"/>
+                <w:iCs w:val="false"/>
                 <w:color w:val="000000"/>
                 <w:sz w:val="16"/>
                 <w:szCs w:val="16"/>
@@ -2227,9 +1907,12 @@
             <w:pPr>
               <w:pStyle w:val="Tabelle"/>
               <w:spacing w:lineRule="auto" w:line="240" w:before="60" w:after="60"/>
-              <w:jc w:val="end"/>
+              <w:jc w:val="start"/>
               <w:rPr>
                 <w:b/>
+                <w:bCs/>
+                <w:i w:val="false"/>
+                <w:iCs w:val="false"/>
                 <w:color w:val="000000"/>
                 <w:sz w:val="16"/>
                 <w:szCs w:val="16"/>
@@ -2239,11 +1922,15 @@
             <w:r>
               <w:rPr>
                 <w:b/>
+                <w:bCs/>
+                <w:i w:val="false"/>
+                <w:iCs w:val="false"/>
                 <w:color w:val="000000"/>
                 <w:sz w:val="16"/>
                 <w:szCs w:val="16"/>
                 <w:lang w:val="de-DE" w:eastAsia="de-DE"/>
               </w:rPr>
+              <w:t>{total}</w:t>
             </w:r>
           </w:p>
         </w:tc>
@@ -2256,6 +1943,7 @@
       </w:pPr>
       <w:r>
         <w:rPr/>
+        <w:t>{/products.grouped}</w:t>
       </w:r>
     </w:p>
     <w:p>
@@ -2274,908 +1962,6 @@
       </w:pPr>
       <w:r>
         <w:rPr/>
-        <w:t>{/positions.products}</w:t>
-      </w:r>
-    </w:p>
-    <w:p>
-      <w:pPr>
-        <w:pStyle w:val="dignumStandardvor0nach0"/>
-        <w:rPr/>
-      </w:pPr>
-      <w:r>
-        <w:rPr/>
-        <w:t>{/positions.includesOptionals}</w:t>
-      </w:r>
-    </w:p>
-    <w:p>
-      <w:pPr>
-        <w:pStyle w:val="dignumStandardvor0nach0"/>
-        <w:rPr/>
-      </w:pPr>
-      <w:r>
-        <w:rPr/>
-      </w:r>
-    </w:p>
-    <w:p>
-      <w:pPr>
-        <w:pStyle w:val="dignumStandardvor0nach0"/>
-        <w:rPr/>
-      </w:pPr>
-      <w:r>
-        <w:rPr/>
-        <w:t>{^positions.includesOptionals}</w:t>
-      </w:r>
-    </w:p>
-    <w:p>
-      <w:pPr>
-        <w:pStyle w:val="dignumStandardvor0nach0"/>
-        <w:rPr>
-          <w:b/>
-          <w:bCs/>
-        </w:rPr>
-      </w:pPr>
-      <w:r>
-        <w:rPr/>
-        <w:t>{#positions.products}</w:t>
-      </w:r>
-    </w:p>
-    <w:p>
-      <w:pPr>
-        <w:pStyle w:val="dignumStandardvor0nach0"/>
-        <w:rPr/>
-      </w:pPr>
-      <w:r>
-        <w:rPr/>
-      </w:r>
-    </w:p>
-    <w:tbl>
-      <w:tblPr>
-        <w:tblW w:w="9565" w:type="dxa"/>
-        <w:jc w:val="start"/>
-        <w:tblInd w:w="0" w:type="dxa"/>
-        <w:tblLayout w:type="fixed"/>
-        <w:tblCellMar>
-          <w:top w:w="0" w:type="dxa"/>
-          <w:start w:w="70" w:type="dxa"/>
-          <w:bottom w:w="0" w:type="dxa"/>
-          <w:end w:w="70" w:type="dxa"/>
-        </w:tblCellMar>
-        <w:tblLook w:val="0000" w:noVBand="0" w:noHBand="0" w:lastColumn="0" w:firstColumn="0" w:lastRow="0" w:firstRow="0"/>
-      </w:tblPr>
-      <w:tblGrid>
-        <w:gridCol w:w="305"/>
-        <w:gridCol w:w="305"/>
-        <w:gridCol w:w="4667"/>
-        <w:gridCol w:w="1099"/>
-        <w:gridCol w:w="1535"/>
-        <w:gridCol w:w="1654"/>
-      </w:tblGrid>
-      <w:tr>
-        <w:trPr>
-          <w:trHeight w:val="389" w:hRule="atLeast"/>
-        </w:trPr>
-        <w:tc>
-          <w:tcPr>
-            <w:tcW w:w="610" w:type="dxa"/>
-            <w:gridSpan w:val="2"/>
-            <w:tcBorders>
-              <w:top w:val="single" w:sz="4" w:space="0" w:color="000000"/>
-              <w:bottom w:val="single" w:sz="4" w:space="0" w:color="000000"/>
-            </w:tcBorders>
-            <w:vAlign w:val="center"/>
-          </w:tcPr>
-          <w:p>
-            <w:pPr>
-              <w:pStyle w:val="Tabellenberschrift"/>
-              <w:spacing w:before="80" w:after="80"/>
-              <w:rPr>
-                <w:sz w:val="16"/>
-                <w:szCs w:val="16"/>
-              </w:rPr>
-            </w:pPr>
-            <w:r>
-              <w:rPr>
-                <w:sz w:val="16"/>
-                <w:szCs w:val="16"/>
-              </w:rPr>
-              <w:t>Pos.</w:t>
-            </w:r>
-          </w:p>
-        </w:tc>
-        <w:tc>
-          <w:tcPr>
-            <w:tcW w:w="4667" w:type="dxa"/>
-            <w:tcBorders>
-              <w:top w:val="single" w:sz="4" w:space="0" w:color="000000"/>
-              <w:bottom w:val="single" w:sz="4" w:space="0" w:color="000000"/>
-            </w:tcBorders>
-            <w:vAlign w:val="center"/>
-          </w:tcPr>
-          <w:p>
-            <w:pPr>
-              <w:pStyle w:val="Tabellenberschrift"/>
-              <w:spacing w:before="80" w:after="80"/>
-              <w:rPr>
-                <w:sz w:val="16"/>
-                <w:szCs w:val="16"/>
-              </w:rPr>
-            </w:pPr>
-            <w:r>
-              <w:rPr>
-                <w:sz w:val="16"/>
-                <w:szCs w:val="16"/>
-              </w:rPr>
-              <w:t>Artikel / Leistung</w:t>
-            </w:r>
-          </w:p>
-        </w:tc>
-        <w:tc>
-          <w:tcPr>
-            <w:tcW w:w="1099" w:type="dxa"/>
-            <w:tcBorders>
-              <w:top w:val="single" w:sz="4" w:space="0" w:color="000000"/>
-              <w:bottom w:val="single" w:sz="4" w:space="0" w:color="000000"/>
-            </w:tcBorders>
-            <w:vAlign w:val="center"/>
-          </w:tcPr>
-          <w:p>
-            <w:pPr>
-              <w:pStyle w:val="Tabellenberschrift"/>
-              <w:spacing w:before="80" w:after="80"/>
-              <w:jc w:val="center"/>
-              <w:rPr>
-                <w:sz w:val="16"/>
-                <w:szCs w:val="16"/>
-              </w:rPr>
-            </w:pPr>
-            <w:r>
-              <w:rPr>
-                <w:sz w:val="16"/>
-                <w:szCs w:val="16"/>
-              </w:rPr>
-              <w:t>Anz.</w:t>
-            </w:r>
-          </w:p>
-        </w:tc>
-        <w:tc>
-          <w:tcPr>
-            <w:tcW w:w="1535" w:type="dxa"/>
-            <w:tcBorders>
-              <w:top w:val="single" w:sz="4" w:space="0" w:color="000000"/>
-              <w:bottom w:val="single" w:sz="4" w:space="0" w:color="000000"/>
-            </w:tcBorders>
-            <w:vAlign w:val="center"/>
-          </w:tcPr>
-          <w:p>
-            <w:pPr>
-              <w:pStyle w:val="Tabellenberschrift"/>
-              <w:spacing w:before="80" w:after="80"/>
-              <w:jc w:val="center"/>
-              <w:rPr>
-                <w:sz w:val="16"/>
-                <w:szCs w:val="16"/>
-              </w:rPr>
-            </w:pPr>
-            <w:r>
-              <w:rPr>
-                <w:sz w:val="16"/>
-                <w:szCs w:val="16"/>
-              </w:rPr>
-              <w:t>Preis User</w:t>
-            </w:r>
-          </w:p>
-          <w:p>
-            <w:pPr>
-              <w:pStyle w:val="Tabellenberschrift"/>
-              <w:spacing w:before="80" w:after="80"/>
-              <w:jc w:val="center"/>
-              <w:rPr>
-                <w:sz w:val="16"/>
-                <w:szCs w:val="16"/>
-              </w:rPr>
-            </w:pPr>
-            <w:r>
-              <w:rPr>
-                <w:sz w:val="16"/>
-                <w:szCs w:val="16"/>
-              </w:rPr>
-              <w:t>/ Monat</w:t>
-            </w:r>
-          </w:p>
-        </w:tc>
-        <w:tc>
-          <w:tcPr>
-            <w:tcW w:w="1654" w:type="dxa"/>
-            <w:tcBorders>
-              <w:top w:val="single" w:sz="4" w:space="0" w:color="000000"/>
-              <w:bottom w:val="single" w:sz="4" w:space="0" w:color="000000"/>
-            </w:tcBorders>
-            <w:vAlign w:val="center"/>
-          </w:tcPr>
-          <w:p>
-            <w:pPr>
-              <w:pStyle w:val="Tabellenberschrift"/>
-              <w:spacing w:before="80" w:after="80"/>
-              <w:jc w:val="center"/>
-              <w:rPr>
-                <w:sz w:val="16"/>
-                <w:szCs w:val="16"/>
-              </w:rPr>
-            </w:pPr>
-            <w:r>
-              <w:rPr>
-                <w:sz w:val="16"/>
-                <w:szCs w:val="16"/>
-              </w:rPr>
-              <w:t>Gesamt EUR</w:t>
-            </w:r>
-          </w:p>
-          <w:p>
-            <w:pPr>
-              <w:pStyle w:val="Tabellenberschrift"/>
-              <w:spacing w:before="80" w:after="80"/>
-              <w:jc w:val="center"/>
-              <w:rPr>
-                <w:sz w:val="16"/>
-                <w:szCs w:val="16"/>
-              </w:rPr>
-            </w:pPr>
-            <w:r>
-              <w:rPr>
-                <w:sz w:val="16"/>
-                <w:szCs w:val="16"/>
-              </w:rPr>
-              <w:t>(36 Monate)</w:t>
-            </w:r>
-          </w:p>
-        </w:tc>
-      </w:tr>
-      <w:tr>
-        <w:trPr>
-          <w:cantSplit w:val="true"/>
-        </w:trPr>
-        <w:tc>
-          <w:tcPr>
-            <w:tcW w:w="305" w:type="dxa"/>
-            <w:tcBorders>
-              <w:top w:val="single" w:sz="4" w:space="0" w:color="7F7F7F"/>
-              <w:bottom w:val="single" w:sz="4" w:space="0" w:color="7F7F7F"/>
-            </w:tcBorders>
-            <w:shd w:color="auto" w:fill="BFBFBF" w:themeFill="background1" w:themeFillShade="bf" w:val="clear"/>
-          </w:tcPr>
-          <w:p>
-            <w:pPr>
-              <w:pStyle w:val="Normal"/>
-              <w:spacing w:lineRule="auto" w:line="240" w:before="60" w:after="60"/>
-              <w:ind w:start="288"/>
-              <w:jc w:val="center"/>
-              <w:rPr>
-                <w:color w:val="000000"/>
-                <w:sz w:val="16"/>
-                <w:szCs w:val="16"/>
-              </w:rPr>
-            </w:pPr>
-            <w:r>
-              <w:rPr>
-                <w:color w:val="000000"/>
-                <w:sz w:val="16"/>
-                <w:szCs w:val="16"/>
-              </w:rPr>
-            </w:r>
-          </w:p>
-        </w:tc>
-        <w:tc>
-          <w:tcPr>
-            <w:tcW w:w="305" w:type="dxa"/>
-            <w:tcBorders>
-              <w:top w:val="single" w:sz="4" w:space="0" w:color="7F7F7F"/>
-              <w:bottom w:val="single" w:sz="4" w:space="0" w:color="7F7F7F"/>
-            </w:tcBorders>
-            <w:shd w:color="auto" w:fill="BFBFBF" w:themeFill="background1" w:themeFillShade="bf" w:val="clear"/>
-          </w:tcPr>
-          <w:p>
-            <w:pPr>
-              <w:pStyle w:val="Normal"/>
-              <w:spacing w:lineRule="auto" w:line="240" w:before="60" w:after="60"/>
-              <w:ind w:start="288"/>
-              <w:jc w:val="center"/>
-              <w:rPr>
-                <w:color w:val="000000"/>
-                <w:sz w:val="16"/>
-                <w:szCs w:val="16"/>
-              </w:rPr>
-            </w:pPr>
-            <w:r>
-              <w:rPr>
-                <w:color w:val="000000"/>
-                <w:sz w:val="16"/>
-                <w:szCs w:val="16"/>
-              </w:rPr>
-            </w:r>
-          </w:p>
-        </w:tc>
-        <w:tc>
-          <w:tcPr>
-            <w:tcW w:w="8955" w:type="dxa"/>
-            <w:gridSpan w:val="4"/>
-            <w:tcBorders>
-              <w:top w:val="single" w:sz="4" w:space="0" w:color="7F7F7F"/>
-              <w:bottom w:val="single" w:sz="4" w:space="0" w:color="7F7F7F"/>
-            </w:tcBorders>
-            <w:shd w:color="auto" w:fill="BFBFBF" w:themeFill="background1" w:themeFillShade="bf" w:val="clear"/>
-          </w:tcPr>
-          <w:p>
-            <w:pPr>
-              <w:pStyle w:val="dignumTabelle"/>
-              <w:spacing w:lineRule="auto" w:line="240" w:before="60" w:after="60"/>
-              <w:rPr>
-                <w:b/>
-                <w:lang w:val="en-US" w:eastAsia="de-DE"/>
-              </w:rPr>
-            </w:pPr>
-            <w:r>
-              <w:rPr>
-                <w:b/>
-                <w:lang w:val="en-US"/>
-              </w:rPr>
-              <w:t xml:space="preserve">Keepit - Backup {names} </w:t>
-            </w:r>
-          </w:p>
-        </w:tc>
-      </w:tr>
-      <w:tr>
-        <w:trPr>
-          <w:trHeight w:val="456" w:hRule="atLeast"/>
-        </w:trPr>
-        <w:tc>
-          <w:tcPr>
-            <w:tcW w:w="610" w:type="dxa"/>
-            <w:gridSpan w:val="2"/>
-            <w:tcBorders>
-              <w:top w:val="single" w:sz="4" w:space="0" w:color="7F7F7F"/>
-              <w:bottom w:val="single" w:sz="4" w:space="0" w:color="7F7F7F"/>
-            </w:tcBorders>
-            <w:vAlign w:val="center"/>
-          </w:tcPr>
-          <w:p>
-            <w:pPr>
-              <w:pStyle w:val="Normal"/>
-              <w:numPr>
-                <w:ilvl w:val="0"/>
-                <w:numId w:val="5"/>
-              </w:numPr>
-              <w:spacing w:lineRule="auto" w:line="240" w:before="60" w:after="60"/>
-              <w:jc w:val="center"/>
-              <w:rPr>
-                <w:color w:val="000000"/>
-                <w:sz w:val="16"/>
-                <w:szCs w:val="16"/>
-              </w:rPr>
-            </w:pPr>
-            <w:r>
-              <w:rPr>
-                <w:color w:val="000000"/>
-                <w:sz w:val="16"/>
-                <w:szCs w:val="16"/>
-              </w:rPr>
-            </w:r>
-          </w:p>
-        </w:tc>
-        <w:tc>
-          <w:tcPr>
-            <w:tcW w:w="4667" w:type="dxa"/>
-            <w:tcBorders>
-              <w:top w:val="single" w:sz="4" w:space="0" w:color="7F7F7F"/>
-              <w:bottom w:val="single" w:sz="4" w:space="0" w:color="7F7F7F"/>
-            </w:tcBorders>
-          </w:tcPr>
-          <w:p>
-            <w:pPr>
-              <w:pStyle w:val="Normal"/>
-              <w:keepLines/>
-              <w:spacing w:lineRule="auto" w:line="276" w:before="0" w:after="0"/>
-              <w:rPr>
-                <w:rFonts w:cs="Arial"/>
-                <w:b/>
-                <w:sz w:val="16"/>
-                <w:szCs w:val="16"/>
-                <w:lang w:val="en-US"/>
-              </w:rPr>
-            </w:pPr>
-            <w:r>
-              <w:rPr>
-                <w:rFonts w:cs="Arial"/>
-                <w:b/>
-                <w:sz w:val="16"/>
-                <w:szCs w:val="16"/>
-                <w:lang w:val="en-US"/>
-              </w:rPr>
-              <w:t>{#products}{name}</w:t>
-            </w:r>
-          </w:p>
-          <w:p>
-            <w:pPr>
-              <w:pStyle w:val="Normal"/>
-              <w:spacing w:lineRule="auto" w:line="276" w:before="0" w:after="0"/>
-              <w:rPr>
-                <w:rFonts w:cs="Arial"/>
-                <w:b/>
-                <w:sz w:val="16"/>
-                <w:szCs w:val="16"/>
-                <w:lang w:val="en-US"/>
-              </w:rPr>
-            </w:pPr>
-            <w:r>
-              <w:rPr>
-                <w:rFonts w:cs="Arial"/>
-                <w:b/>
-                <w:sz w:val="16"/>
-                <w:szCs w:val="16"/>
-                <w:lang w:val="en-US"/>
-              </w:rPr>
-              <w:t>{contract.name}</w:t>
-            </w:r>
-          </w:p>
-        </w:tc>
-        <w:tc>
-          <w:tcPr>
-            <w:tcW w:w="1099" w:type="dxa"/>
-            <w:tcBorders>
-              <w:top w:val="single" w:sz="4" w:space="0" w:color="7F7F7F"/>
-              <w:bottom w:val="single" w:sz="4" w:space="0" w:color="7F7F7F"/>
-            </w:tcBorders>
-            <w:vAlign w:val="center"/>
-          </w:tcPr>
-          <w:p>
-            <w:pPr>
-              <w:pStyle w:val="Normal"/>
-              <w:spacing w:lineRule="auto" w:line="240" w:before="60" w:after="60"/>
-              <w:jc w:val="end"/>
-              <w:rPr>
-                <w:rFonts w:cs="Arial"/>
-                <w:sz w:val="16"/>
-                <w:szCs w:val="16"/>
-              </w:rPr>
-            </w:pPr>
-            <w:r>
-              <w:rPr>
-                <w:rFonts w:cs="Arial"/>
-                <w:sz w:val="16"/>
-                <w:szCs w:val="16"/>
-              </w:rPr>
-              <w:t>{quantity}</w:t>
-            </w:r>
-          </w:p>
-        </w:tc>
-        <w:tc>
-          <w:tcPr>
-            <w:tcW w:w="1535" w:type="dxa"/>
-            <w:tcBorders>
-              <w:top w:val="single" w:sz="4" w:space="0" w:color="7F7F7F"/>
-              <w:bottom w:val="single" w:sz="4" w:space="0" w:color="7F7F7F"/>
-            </w:tcBorders>
-            <w:vAlign w:val="center"/>
-          </w:tcPr>
-          <w:p>
-            <w:pPr>
-              <w:pStyle w:val="Normal"/>
-              <w:spacing w:lineRule="auto" w:line="240" w:before="60" w:after="60"/>
-              <w:jc w:val="end"/>
-              <w:rPr>
-                <w:rFonts w:cs="Arial"/>
-                <w:sz w:val="16"/>
-                <w:szCs w:val="16"/>
-                <w:lang w:val="en-US"/>
-              </w:rPr>
-            </w:pPr>
-            <w:r>
-              <w:rPr>
-                <w:rFonts w:cs="Arial"/>
-                <w:sz w:val="16"/>
-                <w:szCs w:val="16"/>
-                <w:lang w:val="en-US"/>
-              </w:rPr>
-              <w:t>{prices.price_1}</w:t>
-            </w:r>
-          </w:p>
-        </w:tc>
-        <w:tc>
-          <w:tcPr>
-            <w:tcW w:w="1654" w:type="dxa"/>
-            <w:tcBorders>
-              <w:top w:val="single" w:sz="4" w:space="0" w:color="7F7F7F"/>
-              <w:bottom w:val="single" w:sz="4" w:space="0" w:color="7F7F7F"/>
-            </w:tcBorders>
-            <w:vAlign w:val="center"/>
-          </w:tcPr>
-          <w:p>
-            <w:pPr>
-              <w:pStyle w:val="Tabelle"/>
-              <w:spacing w:lineRule="auto" w:line="240" w:before="60" w:after="60"/>
-              <w:jc w:val="end"/>
-              <w:rPr>
-                <w:b/>
-                <w:color w:val="000000"/>
-                <w:sz w:val="16"/>
-                <w:szCs w:val="16"/>
-                <w:lang w:val="de-DE" w:eastAsia="de-DE"/>
-              </w:rPr>
-            </w:pPr>
-            <w:r>
-              <w:rPr>
-                <w:b/>
-                <w:color w:val="000000"/>
-                <w:sz w:val="16"/>
-                <w:szCs w:val="16"/>
-                <w:lang w:val="de-DE" w:eastAsia="de-DE"/>
-              </w:rPr>
-              <w:t>{/</w:t>
-            </w:r>
-            <w:r>
-              <w:rPr>
-                <w:rFonts w:cs="Arial"/>
-                <w:b/>
-                <w:color w:val="000000"/>
-                <w:sz w:val="16"/>
-                <w:szCs w:val="16"/>
-                <w:lang w:val="en-US" w:eastAsia="de-DE"/>
-              </w:rPr>
-              <w:t>products</w:t>
-            </w:r>
-            <w:r>
-              <w:rPr>
-                <w:b/>
-                <w:color w:val="000000"/>
-                <w:sz w:val="16"/>
-                <w:szCs w:val="16"/>
-                <w:lang w:val="de-DE" w:eastAsia="de-DE"/>
-              </w:rPr>
-              <w:t>}</w:t>
-            </w:r>
-          </w:p>
-        </w:tc>
-      </w:tr>
-      <w:tr>
-        <w:trPr>
-          <w:trHeight w:val="942" w:hRule="atLeast"/>
-          <w:cantSplit w:val="true"/>
-        </w:trPr>
-        <w:tc>
-          <w:tcPr>
-            <w:tcW w:w="610" w:type="dxa"/>
-            <w:gridSpan w:val="2"/>
-            <w:tcBorders>
-              <w:bottom w:val="single" w:sz="4" w:space="0" w:color="7F7F7F"/>
-            </w:tcBorders>
-            <w:vAlign w:val="center"/>
-          </w:tcPr>
-          <w:p>
-            <w:pPr>
-              <w:pStyle w:val="Normal"/>
-              <w:numPr>
-                <w:ilvl w:val="0"/>
-                <w:numId w:val="5"/>
-              </w:numPr>
-              <w:spacing w:lineRule="auto" w:line="240" w:before="60" w:after="60"/>
-              <w:jc w:val="center"/>
-              <w:rPr>
-                <w:color w:val="000000"/>
-                <w:sz w:val="16"/>
-                <w:szCs w:val="16"/>
-              </w:rPr>
-            </w:pPr>
-            <w:r>
-              <w:rPr>
-                <w:color w:val="000000"/>
-                <w:sz w:val="16"/>
-                <w:szCs w:val="16"/>
-              </w:rPr>
-            </w:r>
-          </w:p>
-        </w:tc>
-        <w:tc>
-          <w:tcPr>
-            <w:tcW w:w="4667" w:type="dxa"/>
-            <w:tcBorders>
-              <w:bottom w:val="single" w:sz="4" w:space="0" w:color="7F7F7F"/>
-            </w:tcBorders>
-          </w:tcPr>
-          <w:p>
-            <w:pPr>
-              <w:pStyle w:val="Normal"/>
-              <w:keepLines/>
-              <w:spacing w:lineRule="auto" w:line="276" w:before="0" w:after="0"/>
-              <w:rPr>
-                <w:rFonts w:cs="Arial"/>
-                <w:b/>
-                <w:sz w:val="16"/>
-                <w:szCs w:val="16"/>
-              </w:rPr>
-            </w:pPr>
-            <w:r>
-              <w:rPr>
-                <w:rFonts w:cs="Arial"/>
-                <w:b/>
-                <w:sz w:val="16"/>
-                <w:szCs w:val="16"/>
-              </w:rPr>
-              <w:t>dignum Dienstleistung - Keepit Backup für {}</w:t>
-            </w:r>
-          </w:p>
-          <w:p>
-            <w:pPr>
-              <w:pStyle w:val="Normal"/>
-              <w:keepLines/>
-              <w:spacing w:lineRule="auto" w:line="276" w:before="0" w:after="0"/>
-              <w:rPr>
-                <w:rFonts w:cs="Arial"/>
-                <w:bCs/>
-                <w:sz w:val="16"/>
-                <w:szCs w:val="16"/>
-              </w:rPr>
-            </w:pPr>
-            <w:r>
-              <w:rPr>
-                <w:rFonts w:cs="Arial"/>
-                <w:bCs/>
-                <w:sz w:val="16"/>
-                <w:szCs w:val="16"/>
-              </w:rPr>
-              <w:t>Onboarding, Unterstützung bei Ersteinrichtung &amp; Konfiguration sowie Einweisung / Schulung auf das Produkt</w:t>
-            </w:r>
-          </w:p>
-          <w:p>
-            <w:pPr>
-              <w:pStyle w:val="Normal"/>
-              <w:keepLines/>
-              <w:spacing w:lineRule="auto" w:line="276" w:before="0" w:after="0"/>
-              <w:rPr>
-                <w:rFonts w:cs="Arial"/>
-                <w:b/>
-                <w:sz w:val="16"/>
-                <w:szCs w:val="16"/>
-                <w:lang w:val="en-US"/>
-              </w:rPr>
-            </w:pPr>
-            <w:r>
-              <w:rPr>
-                <w:rFonts w:cs="Arial"/>
-                <w:bCs/>
-                <w:sz w:val="16"/>
-                <w:szCs w:val="16"/>
-              </w:rPr>
-              <w:t>- Pauschalpreis (einmalig)</w:t>
-            </w:r>
-          </w:p>
-        </w:tc>
-        <w:tc>
-          <w:tcPr>
-            <w:tcW w:w="1099" w:type="dxa"/>
-            <w:tcBorders>
-              <w:bottom w:val="single" w:sz="4" w:space="0" w:color="7F7F7F"/>
-            </w:tcBorders>
-            <w:vAlign w:val="center"/>
-          </w:tcPr>
-          <w:p>
-            <w:pPr>
-              <w:pStyle w:val="Normal"/>
-              <w:spacing w:lineRule="auto" w:line="240" w:before="60" w:after="60"/>
-              <w:jc w:val="end"/>
-              <w:rPr>
-                <w:rFonts w:cs="Arial"/>
-                <w:sz w:val="16"/>
-                <w:szCs w:val="16"/>
-              </w:rPr>
-            </w:pPr>
-            <w:r>
-              <w:rPr>
-                <w:rFonts w:cs="Arial"/>
-                <w:sz w:val="16"/>
-                <w:szCs w:val="16"/>
-              </w:rPr>
-              <w:t>1</w:t>
-            </w:r>
-          </w:p>
-        </w:tc>
-        <w:tc>
-          <w:tcPr>
-            <w:tcW w:w="1535" w:type="dxa"/>
-            <w:tcBorders>
-              <w:bottom w:val="single" w:sz="4" w:space="0" w:color="7F7F7F"/>
-            </w:tcBorders>
-            <w:vAlign w:val="center"/>
-          </w:tcPr>
-          <w:p>
-            <w:pPr>
-              <w:pStyle w:val="Normal"/>
-              <w:spacing w:lineRule="auto" w:line="240" w:before="60" w:after="60"/>
-              <w:jc w:val="end"/>
-              <w:rPr>
-                <w:rFonts w:cs="Arial"/>
-                <w:sz w:val="16"/>
-                <w:szCs w:val="16"/>
-                <w:lang w:val="en-US"/>
-              </w:rPr>
-            </w:pPr>
-            <w:r>
-              <w:rPr>
-                <w:rFonts w:cs="Arial"/>
-                <w:sz w:val="16"/>
-                <w:szCs w:val="16"/>
-                <w:lang w:val="en-US"/>
-              </w:rPr>
-            </w:r>
-          </w:p>
-        </w:tc>
-        <w:tc>
-          <w:tcPr>
-            <w:tcW w:w="1654" w:type="dxa"/>
-            <w:tcBorders>
-              <w:bottom w:val="single" w:sz="4" w:space="0" w:color="7F7F7F"/>
-            </w:tcBorders>
-            <w:vAlign w:val="center"/>
-          </w:tcPr>
-          <w:p>
-            <w:pPr>
-              <w:pStyle w:val="Normal"/>
-              <w:spacing w:lineRule="auto" w:line="240" w:before="60" w:after="60"/>
-              <w:jc w:val="end"/>
-              <w:rPr>
-                <w:color w:val="000000"/>
-                <w:sz w:val="16"/>
-                <w:szCs w:val="16"/>
-              </w:rPr>
-            </w:pPr>
-            <w:r>
-              <w:rPr>
-                <w:color w:val="000000"/>
-                <w:sz w:val="16"/>
-                <w:szCs w:val="16"/>
-              </w:rPr>
-              <w:t>300,00</w:t>
-            </w:r>
-          </w:p>
-        </w:tc>
-      </w:tr>
-      <w:tr>
-        <w:trPr>
-          <w:cantSplit w:val="true"/>
-        </w:trPr>
-        <w:tc>
-          <w:tcPr>
-            <w:tcW w:w="5277" w:type="dxa"/>
-            <w:gridSpan w:val="3"/>
-            <w:tcBorders>
-              <w:top w:val="single" w:sz="4" w:space="0" w:color="7F7F7F"/>
-            </w:tcBorders>
-          </w:tcPr>
-          <w:p>
-            <w:pPr>
-              <w:pStyle w:val="Normal"/>
-              <w:spacing w:before="60" w:after="60"/>
-              <w:rPr>
-                <w:b/>
-                <w:color w:val="000000"/>
-                <w:sz w:val="16"/>
-                <w:szCs w:val="16"/>
-              </w:rPr>
-            </w:pPr>
-            <w:r>
-              <w:rPr>
-                <w:b/>
-                <w:color w:val="000000"/>
-                <w:sz w:val="16"/>
-                <w:szCs w:val="16"/>
-              </w:rPr>
-            </w:r>
-          </w:p>
-        </w:tc>
-        <w:tc>
-          <w:tcPr>
-            <w:tcW w:w="2634" w:type="dxa"/>
-            <w:gridSpan w:val="2"/>
-            <w:tcBorders>
-              <w:top w:val="single" w:sz="4" w:space="0" w:color="7F7F7F"/>
-              <w:bottom w:val="single" w:sz="4" w:space="0" w:color="7F7F7F"/>
-            </w:tcBorders>
-            <w:vAlign w:val="center"/>
-          </w:tcPr>
-          <w:p>
-            <w:pPr>
-              <w:pStyle w:val="Tabelle"/>
-              <w:spacing w:lineRule="auto" w:line="240" w:before="60" w:after="60"/>
-              <w:jc w:val="start"/>
-              <w:rPr>
-                <w:b/>
-                <w:color w:val="000000"/>
-                <w:sz w:val="16"/>
-                <w:szCs w:val="16"/>
-                <w:lang w:val="de-DE" w:eastAsia="de-DE"/>
-              </w:rPr>
-            </w:pPr>
-            <w:r>
-              <w:rPr>
-                <w:b/>
-                <w:color w:val="000000"/>
-                <w:sz w:val="16"/>
-                <w:szCs w:val="16"/>
-                <w:lang w:val="de-DE" w:eastAsia="de-DE"/>
-              </w:rPr>
-              <w:t>Summe Netto EUR</w:t>
-            </w:r>
-          </w:p>
-        </w:tc>
-        <w:tc>
-          <w:tcPr>
-            <w:tcW w:w="1654" w:type="dxa"/>
-            <w:tcBorders>
-              <w:top w:val="single" w:sz="4" w:space="0" w:color="7F7F7F"/>
-              <w:bottom w:val="single" w:sz="4" w:space="0" w:color="7F7F7F"/>
-            </w:tcBorders>
-            <w:vAlign w:val="center"/>
-          </w:tcPr>
-          <w:p>
-            <w:pPr>
-              <w:pStyle w:val="Tabelle"/>
-              <w:spacing w:lineRule="auto" w:line="240" w:before="60" w:after="60"/>
-              <w:jc w:val="end"/>
-              <w:rPr>
-                <w:b/>
-                <w:color w:val="000000"/>
-                <w:sz w:val="16"/>
-                <w:szCs w:val="16"/>
-                <w:lang w:val="de-DE" w:eastAsia="de-DE"/>
-              </w:rPr>
-            </w:pPr>
-            <w:r>
-              <w:rPr>
-                <w:b/>
-                <w:color w:val="000000"/>
-                <w:sz w:val="16"/>
-                <w:szCs w:val="16"/>
-                <w:lang w:val="de-DE" w:eastAsia="de-DE"/>
-              </w:rPr>
-            </w:r>
-          </w:p>
-        </w:tc>
-      </w:tr>
-    </w:tbl>
-    <w:p>
-      <w:pPr>
-        <w:pStyle w:val="dignumStandardvor0nach0"/>
-        <w:rPr/>
-      </w:pPr>
-      <w:r>
-        <w:rPr/>
-      </w:r>
-    </w:p>
-    <w:p>
-      <w:pPr>
-        <w:pStyle w:val="dignumStandardvor0nach0"/>
-        <w:rPr/>
-      </w:pPr>
-      <w:r>
-        <w:rPr/>
-      </w:r>
-    </w:p>
-    <w:p>
-      <w:pPr>
-        <w:pStyle w:val="dignumStandardvor0nach0"/>
-        <w:rPr/>
-      </w:pPr>
-      <w:r>
-        <w:rPr/>
-        <w:t>{/positions.products}</w:t>
-      </w:r>
-    </w:p>
-    <w:p>
-      <w:pPr>
-        <w:pStyle w:val="dignumStandardvor0nach0"/>
-        <w:rPr/>
-      </w:pPr>
-      <w:r>
-        <w:rPr/>
-        <w:t>{/positions.includesOptionals}</w:t>
       </w:r>
     </w:p>
     <w:sectPr>
@@ -3226,12 +2012,12 @@
         <w:bottom w:w="0" w:type="dxa"/>
         <w:end w:w="108" w:type="dxa"/>
       </w:tblCellMar>
-      <w:tblLook w:val="01e0" w:noVBand="0" w:noHBand="0" w:lastColumn="1" w:firstColumn="1" w:lastRow="1" w:firstRow="1"/>
+      <w:tblLook w:val="01e0" w:noHBand="0" w:noVBand="0" w:firstColumn="1" w:lastRow="1" w:lastColumn="1" w:firstRow="1"/>
     </w:tblPr>
     <w:tblGrid>
       <w:gridCol w:w="3012"/>
-      <w:gridCol w:w="2965"/>
-      <w:gridCol w:w="4088"/>
+      <w:gridCol w:w="2963"/>
+      <w:gridCol w:w="4090"/>
     </w:tblGrid>
     <w:tr>
       <w:trPr>
@@ -3293,7 +2079,7 @@
       </w:tc>
       <w:tc>
         <w:tcPr>
-          <w:tcW w:w="2965" w:type="dxa"/>
+          <w:tcW w:w="2963" w:type="dxa"/>
           <w:tcBorders>
             <w:start w:val="single" w:sz="4" w:space="0" w:color="7F7F7F"/>
             <w:end w:val="single" w:sz="4" w:space="0" w:color="7F7F7F"/>
@@ -3352,7 +2138,7 @@
       </w:tc>
       <w:tc>
         <w:tcPr>
-          <w:tcW w:w="4088" w:type="dxa"/>
+          <w:tcW w:w="4090" w:type="dxa"/>
           <w:tcBorders>
             <w:start w:val="single" w:sz="4" w:space="0" w:color="7F7F7F"/>
           </w:tcBorders>
@@ -3467,7 +2253,7 @@
       </w:tc>
       <w:tc>
         <w:tcPr>
-          <w:tcW w:w="2965" w:type="dxa"/>
+          <w:tcW w:w="2963" w:type="dxa"/>
           <w:tcBorders>
             <w:start w:val="single" w:sz="4" w:space="0" w:color="7F7F7F"/>
             <w:end w:val="single" w:sz="4" w:space="0" w:color="7F7F7F"/>
@@ -3526,7 +2312,7 @@
       </w:tc>
       <w:tc>
         <w:tcPr>
-          <w:tcW w:w="4088" w:type="dxa"/>
+          <w:tcW w:w="4090" w:type="dxa"/>
           <w:tcBorders>
             <w:start w:val="single" w:sz="4" w:space="0" w:color="7F7F7F"/>
           </w:tcBorders>
@@ -3646,7 +2432,7 @@
       </w:tc>
       <w:tc>
         <w:tcPr>
-          <w:tcW w:w="2965" w:type="dxa"/>
+          <w:tcW w:w="2963" w:type="dxa"/>
           <w:tcBorders>
             <w:start w:val="single" w:sz="4" w:space="0" w:color="7F7F7F"/>
             <w:end w:val="single" w:sz="4" w:space="0" w:color="7F7F7F"/>
@@ -3705,7 +2491,7 @@
       </w:tc>
       <w:tc>
         <w:tcPr>
-          <w:tcW w:w="4088" w:type="dxa"/>
+          <w:tcW w:w="4090" w:type="dxa"/>
           <w:tcBorders>
             <w:start w:val="single" w:sz="4" w:space="0" w:color="7F7F7F"/>
           </w:tcBorders>
@@ -3834,7 +2620,7 @@
       </w:tc>
       <w:tc>
         <w:tcPr>
-          <w:tcW w:w="2965" w:type="dxa"/>
+          <w:tcW w:w="2963" w:type="dxa"/>
           <w:tcBorders>
             <w:start w:val="single" w:sz="4" w:space="0" w:color="7F7F7F"/>
             <w:end w:val="single" w:sz="4" w:space="0" w:color="7F7F7F"/>
@@ -3893,7 +2679,7 @@
       </w:tc>
       <w:tc>
         <w:tcPr>
-          <w:tcW w:w="4088" w:type="dxa"/>
+          <w:tcW w:w="4090" w:type="dxa"/>
           <w:tcBorders>
             <w:start w:val="single" w:sz="4" w:space="0" w:color="7F7F7F"/>
           </w:tcBorders>
@@ -3954,12 +2740,12 @@
         <w:bottom w:w="0" w:type="dxa"/>
         <w:end w:w="108" w:type="dxa"/>
       </w:tblCellMar>
-      <w:tblLook w:val="01e0" w:noVBand="0" w:noHBand="0" w:lastColumn="1" w:firstColumn="1" w:lastRow="1" w:firstRow="1"/>
+      <w:tblLook w:val="01e0" w:noHBand="0" w:noVBand="0" w:firstColumn="1" w:lastRow="1" w:lastColumn="1" w:firstRow="1"/>
     </w:tblPr>
     <w:tblGrid>
       <w:gridCol w:w="3012"/>
-      <w:gridCol w:w="2965"/>
-      <w:gridCol w:w="4088"/>
+      <w:gridCol w:w="2963"/>
+      <w:gridCol w:w="4090"/>
     </w:tblGrid>
     <w:tr>
       <w:trPr>
@@ -4021,7 +2807,7 @@
       </w:tc>
       <w:tc>
         <w:tcPr>
-          <w:tcW w:w="2965" w:type="dxa"/>
+          <w:tcW w:w="2963" w:type="dxa"/>
           <w:tcBorders>
             <w:start w:val="single" w:sz="4" w:space="0" w:color="7F7F7F"/>
             <w:end w:val="single" w:sz="4" w:space="0" w:color="7F7F7F"/>
@@ -4080,7 +2866,7 @@
       </w:tc>
       <w:tc>
         <w:tcPr>
-          <w:tcW w:w="4088" w:type="dxa"/>
+          <w:tcW w:w="4090" w:type="dxa"/>
           <w:tcBorders>
             <w:start w:val="single" w:sz="4" w:space="0" w:color="7F7F7F"/>
           </w:tcBorders>
@@ -4195,7 +2981,7 @@
       </w:tc>
       <w:tc>
         <w:tcPr>
-          <w:tcW w:w="2965" w:type="dxa"/>
+          <w:tcW w:w="2963" w:type="dxa"/>
           <w:tcBorders>
             <w:start w:val="single" w:sz="4" w:space="0" w:color="7F7F7F"/>
             <w:end w:val="single" w:sz="4" w:space="0" w:color="7F7F7F"/>
@@ -4254,7 +3040,7 @@
       </w:tc>
       <w:tc>
         <w:tcPr>
-          <w:tcW w:w="4088" w:type="dxa"/>
+          <w:tcW w:w="4090" w:type="dxa"/>
           <w:tcBorders>
             <w:start w:val="single" w:sz="4" w:space="0" w:color="7F7F7F"/>
           </w:tcBorders>
@@ -4374,7 +3160,7 @@
       </w:tc>
       <w:tc>
         <w:tcPr>
-          <w:tcW w:w="2965" w:type="dxa"/>
+          <w:tcW w:w="2963" w:type="dxa"/>
           <w:tcBorders>
             <w:start w:val="single" w:sz="4" w:space="0" w:color="7F7F7F"/>
             <w:end w:val="single" w:sz="4" w:space="0" w:color="7F7F7F"/>
@@ -4433,7 +3219,7 @@
       </w:tc>
       <w:tc>
         <w:tcPr>
-          <w:tcW w:w="4088" w:type="dxa"/>
+          <w:tcW w:w="4090" w:type="dxa"/>
           <w:tcBorders>
             <w:start w:val="single" w:sz="4" w:space="0" w:color="7F7F7F"/>
           </w:tcBorders>
@@ -4562,7 +3348,7 @@
       </w:tc>
       <w:tc>
         <w:tcPr>
-          <w:tcW w:w="2965" w:type="dxa"/>
+          <w:tcW w:w="2963" w:type="dxa"/>
           <w:tcBorders>
             <w:start w:val="single" w:sz="4" w:space="0" w:color="7F7F7F"/>
             <w:end w:val="single" w:sz="4" w:space="0" w:color="7F7F7F"/>
@@ -4621,7 +3407,7 @@
       </w:tc>
       <w:tc>
         <w:tcPr>
-          <w:tcW w:w="4088" w:type="dxa"/>
+          <w:tcW w:w="4090" w:type="dxa"/>
           <w:tcBorders>
             <w:start w:val="single" w:sz="4" w:space="0" w:color="7F7F7F"/>
           </w:tcBorders>
@@ -4702,7 +3488,7 @@
     </w:pPr>
     <w:r>
       <w:drawing>
-        <wp:anchor distT="0" distB="0" distL="0" distR="0" simplePos="0" relativeHeight="4" behindDoc="1" locked="0" layoutInCell="1" allowOverlap="1">
+        <wp:anchor distT="0" distB="0" distL="0" distR="0" simplePos="0" relativeHeight="3" behindDoc="1" locked="0" layoutInCell="1" allowOverlap="1">
           <wp:simplePos x="0" y="0"/>
           <wp:positionH relativeFrom="column">
             <wp:posOffset>4600575</wp:posOffset>
@@ -4786,7 +3572,7 @@
         <w:sz w:val="16"/>
         <w:szCs w:val="16"/>
       </w:rPr>
-      <w:t>1</w:t>
+      <w:t>2</w:t>
     </w:r>
     <w:r>
       <w:rPr>
@@ -4834,7 +3620,7 @@
         <w:sz w:val="16"/>
         <w:szCs w:val="16"/>
       </w:rPr>
-      <w:t>3</w:t>
+      <w:t>2</w:t>
     </w:r>
     <w:r>
       <w:rPr>
@@ -4926,7 +3712,7 @@
     </w:pPr>
     <w:r>
       <w:drawing>
-        <wp:anchor distT="0" distB="0" distL="0" distR="0" simplePos="0" relativeHeight="4" behindDoc="1" locked="0" layoutInCell="1" allowOverlap="1">
+        <wp:anchor distT="0" distB="0" distL="0" distR="0" simplePos="0" relativeHeight="3" behindDoc="1" locked="0" layoutInCell="1" allowOverlap="1">
           <wp:simplePos x="0" y="0"/>
           <wp:positionH relativeFrom="column">
             <wp:posOffset>4600575</wp:posOffset>
@@ -5010,7 +3796,7 @@
         <w:sz w:val="16"/>
         <w:szCs w:val="16"/>
       </w:rPr>
-      <w:t>1</w:t>
+      <w:t>2</w:t>
     </w:r>
     <w:r>
       <w:rPr>
@@ -5058,7 +3844,7 @@
         <w:sz w:val="16"/>
         <w:szCs w:val="16"/>
       </w:rPr>
-      <w:t>3</w:t>
+      <w:t>2</w:t>
     </w:r>
     <w:r>
       <w:rPr>
@@ -5535,40 +4321,40 @@
   <w:abstractNum w:abstractNumId="4">
     <w:lvl w:ilvl="0">
       <w:start w:val="1"/>
-      <w:numFmt w:val="upperLetter"/>
-      <w:lvlText w:val="%1)"/>
+      <w:numFmt w:val="decimal"/>
+      <w:lvlText w:val="%1."/>
       <w:lvlJc w:val="start"/>
       <w:pPr>
         <w:tabs>
-          <w:tab w:val="num" w:pos="0"/>
+          <w:tab w:val="num" w:pos="397"/>
         </w:tabs>
-        <w:ind w:start="1065" w:hanging="360"/>
+        <w:ind w:start="754" w:hanging="397"/>
       </w:pPr>
       <w:rPr/>
     </w:lvl>
     <w:lvl w:ilvl="1">
       <w:start w:val="1"/>
-      <w:numFmt w:val="lowerLetter"/>
+      <w:numFmt w:val="decimal"/>
       <w:lvlText w:val="%2."/>
       <w:lvlJc w:val="start"/>
       <w:pPr>
         <w:tabs>
-          <w:tab w:val="num" w:pos="0"/>
+          <w:tab w:val="num" w:pos="794"/>
         </w:tabs>
-        <w:ind w:start="1785" w:hanging="360"/>
+        <w:ind w:start="1151" w:hanging="397"/>
       </w:pPr>
       <w:rPr/>
     </w:lvl>
     <w:lvl w:ilvl="2">
       <w:start w:val="1"/>
-      <w:numFmt w:val="lowerRoman"/>
+      <w:numFmt w:val="decimal"/>
       <w:lvlText w:val="%3."/>
-      <w:lvlJc w:val="end"/>
+      <w:lvlJc w:val="start"/>
       <w:pPr>
         <w:tabs>
-          <w:tab w:val="num" w:pos="0"/>
+          <w:tab w:val="num" w:pos="1191"/>
         </w:tabs>
-        <w:ind w:start="2505" w:hanging="180"/>
+        <w:ind w:start="1548" w:hanging="397"/>
       </w:pPr>
       <w:rPr/>
     </w:lvl>
@@ -5579,35 +4365,35 @@
       <w:lvlJc w:val="start"/>
       <w:pPr>
         <w:tabs>
-          <w:tab w:val="num" w:pos="0"/>
+          <w:tab w:val="num" w:pos="1588"/>
         </w:tabs>
-        <w:ind w:start="3225" w:hanging="360"/>
+        <w:ind w:start="1945" w:hanging="397"/>
       </w:pPr>
       <w:rPr/>
     </w:lvl>
     <w:lvl w:ilvl="4">
       <w:start w:val="1"/>
-      <w:numFmt w:val="lowerLetter"/>
+      <w:numFmt w:val="decimal"/>
       <w:lvlText w:val="%5."/>
       <w:lvlJc w:val="start"/>
       <w:pPr>
         <w:tabs>
-          <w:tab w:val="num" w:pos="0"/>
+          <w:tab w:val="num" w:pos="1985"/>
         </w:tabs>
-        <w:ind w:start="3945" w:hanging="360"/>
+        <w:ind w:start="2342" w:hanging="397"/>
       </w:pPr>
       <w:rPr/>
     </w:lvl>
     <w:lvl w:ilvl="5">
       <w:start w:val="1"/>
-      <w:numFmt w:val="lowerRoman"/>
+      <w:numFmt w:val="decimal"/>
       <w:lvlText w:val="%6."/>
-      <w:lvlJc w:val="end"/>
+      <w:lvlJc w:val="start"/>
       <w:pPr>
         <w:tabs>
-          <w:tab w:val="num" w:pos="0"/>
+          <w:tab w:val="num" w:pos="2381"/>
         </w:tabs>
-        <w:ind w:start="4665" w:hanging="180"/>
+        <w:ind w:start="2738" w:hanging="397"/>
       </w:pPr>
       <w:rPr/>
     </w:lvl>
@@ -5618,125 +4404,6 @@
       <w:lvlJc w:val="start"/>
       <w:pPr>
         <w:tabs>
-          <w:tab w:val="num" w:pos="0"/>
-        </w:tabs>
-        <w:ind w:start="5385" w:hanging="360"/>
-      </w:pPr>
-      <w:rPr/>
-    </w:lvl>
-    <w:lvl w:ilvl="7">
-      <w:start w:val="1"/>
-      <w:numFmt w:val="lowerLetter"/>
-      <w:lvlText w:val="%8."/>
-      <w:lvlJc w:val="start"/>
-      <w:pPr>
-        <w:tabs>
-          <w:tab w:val="num" w:pos="0"/>
-        </w:tabs>
-        <w:ind w:start="6105" w:hanging="360"/>
-      </w:pPr>
-      <w:rPr/>
-    </w:lvl>
-    <w:lvl w:ilvl="8">
-      <w:start w:val="1"/>
-      <w:numFmt w:val="lowerRoman"/>
-      <w:lvlText w:val="%9."/>
-      <w:lvlJc w:val="end"/>
-      <w:pPr>
-        <w:tabs>
-          <w:tab w:val="num" w:pos="0"/>
-        </w:tabs>
-        <w:ind w:start="6825" w:hanging="180"/>
-      </w:pPr>
-      <w:rPr/>
-    </w:lvl>
-  </w:abstractNum>
-  <w:abstractNum w:abstractNumId="5">
-    <w:lvl w:ilvl="0">
-      <w:start w:val="1"/>
-      <w:numFmt w:val="decimal"/>
-      <w:lvlText w:val="%1."/>
-      <w:lvlJc w:val="start"/>
-      <w:pPr>
-        <w:tabs>
-          <w:tab w:val="num" w:pos="397"/>
-        </w:tabs>
-        <w:ind w:start="754" w:hanging="397"/>
-      </w:pPr>
-      <w:rPr/>
-    </w:lvl>
-    <w:lvl w:ilvl="1">
-      <w:start w:val="1"/>
-      <w:numFmt w:val="decimal"/>
-      <w:lvlText w:val="%2."/>
-      <w:lvlJc w:val="start"/>
-      <w:pPr>
-        <w:tabs>
-          <w:tab w:val="num" w:pos="794"/>
-        </w:tabs>
-        <w:ind w:start="1151" w:hanging="397"/>
-      </w:pPr>
-      <w:rPr/>
-    </w:lvl>
-    <w:lvl w:ilvl="2">
-      <w:start w:val="1"/>
-      <w:numFmt w:val="decimal"/>
-      <w:lvlText w:val="%3."/>
-      <w:lvlJc w:val="start"/>
-      <w:pPr>
-        <w:tabs>
-          <w:tab w:val="num" w:pos="1191"/>
-        </w:tabs>
-        <w:ind w:start="1548" w:hanging="397"/>
-      </w:pPr>
-      <w:rPr/>
-    </w:lvl>
-    <w:lvl w:ilvl="3">
-      <w:start w:val="1"/>
-      <w:numFmt w:val="decimal"/>
-      <w:lvlText w:val="%4."/>
-      <w:lvlJc w:val="start"/>
-      <w:pPr>
-        <w:tabs>
-          <w:tab w:val="num" w:pos="1588"/>
-        </w:tabs>
-        <w:ind w:start="1945" w:hanging="397"/>
-      </w:pPr>
-      <w:rPr/>
-    </w:lvl>
-    <w:lvl w:ilvl="4">
-      <w:start w:val="1"/>
-      <w:numFmt w:val="decimal"/>
-      <w:lvlText w:val="%5."/>
-      <w:lvlJc w:val="start"/>
-      <w:pPr>
-        <w:tabs>
-          <w:tab w:val="num" w:pos="1985"/>
-        </w:tabs>
-        <w:ind w:start="2342" w:hanging="397"/>
-      </w:pPr>
-      <w:rPr/>
-    </w:lvl>
-    <w:lvl w:ilvl="5">
-      <w:start w:val="1"/>
-      <w:numFmt w:val="decimal"/>
-      <w:lvlText w:val="%6."/>
-      <w:lvlJc w:val="start"/>
-      <w:pPr>
-        <w:tabs>
-          <w:tab w:val="num" w:pos="2381"/>
-        </w:tabs>
-        <w:ind w:start="2738" w:hanging="397"/>
-      </w:pPr>
-      <w:rPr/>
-    </w:lvl>
-    <w:lvl w:ilvl="6">
-      <w:start w:val="1"/>
-      <w:numFmt w:val="decimal"/>
-      <w:lvlText w:val="%7."/>
-      <w:lvlJc w:val="start"/>
-      <w:pPr>
-        <w:tabs>
           <w:tab w:val="num" w:pos="2778"/>
         </w:tabs>
         <w:ind w:start="3135" w:hanging="397"/>
@@ -5770,7 +4437,7 @@
       <w:rPr/>
     </w:lvl>
   </w:abstractNum>
-  <w:abstractNum w:abstractNumId="6">
+  <w:abstractNum w:abstractNumId="5">
     <w:lvl w:ilvl="0">
       <w:start w:val="1"/>
       <w:numFmt w:val="bullet"/>
@@ -5907,7 +4574,7 @@
       </w:rPr>
     </w:lvl>
   </w:abstractNum>
-  <w:abstractNum w:abstractNumId="7">
+  <w:abstractNum w:abstractNumId="6">
     <w:lvl w:ilvl="0">
       <w:start w:val="1"/>
       <w:numFmt w:val="bullet"/>
@@ -5951,262 +4618,6 @@
       </w:pPr>
       <w:rPr>
         <w:rFonts w:ascii="OpenSymbol" w:hAnsi="OpenSymbol" w:cs="OpenSymbol" w:hint="default"/>
-      </w:rPr>
-    </w:lvl>
-    <w:lvl w:ilvl="3">
-      <w:start w:val="1"/>
-      <w:numFmt w:val="bullet"/>
-      <w:lvlText w:val=""/>
-      <w:lvlJc w:val="start"/>
-      <w:pPr>
-        <w:tabs>
-          <w:tab w:val="num" w:pos="1800"/>
-        </w:tabs>
-        <w:ind w:start="1800" w:hanging="360"/>
-      </w:pPr>
-      <w:rPr>
-        <w:rFonts w:ascii="Symbol" w:hAnsi="Symbol" w:cs="Symbol" w:hint="default"/>
-      </w:rPr>
-    </w:lvl>
-    <w:lvl w:ilvl="4">
-      <w:start w:val="1"/>
-      <w:numFmt w:val="bullet"/>
-      <w:lvlText w:val="◦"/>
-      <w:lvlJc w:val="start"/>
-      <w:pPr>
-        <w:tabs>
-          <w:tab w:val="num" w:pos="2160"/>
-        </w:tabs>
-        <w:ind w:start="2160" w:hanging="360"/>
-      </w:pPr>
-      <w:rPr>
-        <w:rFonts w:ascii="OpenSymbol" w:hAnsi="OpenSymbol" w:cs="OpenSymbol" w:hint="default"/>
-      </w:rPr>
-    </w:lvl>
-    <w:lvl w:ilvl="5">
-      <w:start w:val="1"/>
-      <w:numFmt w:val="bullet"/>
-      <w:lvlText w:val="▪"/>
-      <w:lvlJc w:val="start"/>
-      <w:pPr>
-        <w:tabs>
-          <w:tab w:val="num" w:pos="2520"/>
-        </w:tabs>
-        <w:ind w:start="2520" w:hanging="360"/>
-      </w:pPr>
-      <w:rPr>
-        <w:rFonts w:ascii="OpenSymbol" w:hAnsi="OpenSymbol" w:cs="OpenSymbol" w:hint="default"/>
-      </w:rPr>
-    </w:lvl>
-    <w:lvl w:ilvl="6">
-      <w:start w:val="1"/>
-      <w:numFmt w:val="bullet"/>
-      <w:lvlText w:val=""/>
-      <w:lvlJc w:val="start"/>
-      <w:pPr>
-        <w:tabs>
-          <w:tab w:val="num" w:pos="2880"/>
-        </w:tabs>
-        <w:ind w:start="2880" w:hanging="360"/>
-      </w:pPr>
-      <w:rPr>
-        <w:rFonts w:ascii="Symbol" w:hAnsi="Symbol" w:cs="Symbol" w:hint="default"/>
-      </w:rPr>
-    </w:lvl>
-    <w:lvl w:ilvl="7">
-      <w:start w:val="1"/>
-      <w:numFmt w:val="bullet"/>
-      <w:lvlText w:val="◦"/>
-      <w:lvlJc w:val="start"/>
-      <w:pPr>
-        <w:tabs>
-          <w:tab w:val="num" w:pos="3240"/>
-        </w:tabs>
-        <w:ind w:start="3240" w:hanging="360"/>
-      </w:pPr>
-      <w:rPr>
-        <w:rFonts w:ascii="OpenSymbol" w:hAnsi="OpenSymbol" w:cs="OpenSymbol" w:hint="default"/>
-      </w:rPr>
-    </w:lvl>
-    <w:lvl w:ilvl="8">
-      <w:start w:val="1"/>
-      <w:numFmt w:val="bullet"/>
-      <w:lvlText w:val="▪"/>
-      <w:lvlJc w:val="start"/>
-      <w:pPr>
-        <w:tabs>
-          <w:tab w:val="num" w:pos="3600"/>
-        </w:tabs>
-        <w:ind w:start="3600" w:hanging="360"/>
-      </w:pPr>
-      <w:rPr>
-        <w:rFonts w:ascii="OpenSymbol" w:hAnsi="OpenSymbol" w:cs="OpenSymbol" w:hint="default"/>
-      </w:rPr>
-    </w:lvl>
-  </w:abstractNum>
-  <w:abstractNum w:abstractNumId="8">
-    <w:lvl w:ilvl="0">
-      <w:start w:val="1"/>
-      <w:numFmt w:val="upperLetter"/>
-      <w:lvlText w:val="%1)"/>
-      <w:lvlJc w:val="start"/>
-      <w:pPr>
-        <w:tabs>
-          <w:tab w:val="num" w:pos="720"/>
-        </w:tabs>
-        <w:ind w:start="720" w:hanging="360"/>
-      </w:pPr>
-      <w:rPr/>
-    </w:lvl>
-    <w:lvl w:ilvl="1">
-      <w:start w:val="1"/>
-      <w:numFmt w:val="upperLetter"/>
-      <w:lvlText w:val="%2)"/>
-      <w:lvlJc w:val="start"/>
-      <w:pPr>
-        <w:tabs>
-          <w:tab w:val="num" w:pos="1080"/>
-        </w:tabs>
-        <w:ind w:start="1080" w:hanging="360"/>
-      </w:pPr>
-      <w:rPr/>
-    </w:lvl>
-    <w:lvl w:ilvl="2">
-      <w:start w:val="1"/>
-      <w:numFmt w:val="upperLetter"/>
-      <w:lvlText w:val="%3)"/>
-      <w:lvlJc w:val="start"/>
-      <w:pPr>
-        <w:tabs>
-          <w:tab w:val="num" w:pos="1440"/>
-        </w:tabs>
-        <w:ind w:start="1440" w:hanging="360"/>
-      </w:pPr>
-      <w:rPr/>
-    </w:lvl>
-    <w:lvl w:ilvl="3">
-      <w:start w:val="1"/>
-      <w:numFmt w:val="upperLetter"/>
-      <w:lvlText w:val="%4)"/>
-      <w:lvlJc w:val="start"/>
-      <w:pPr>
-        <w:tabs>
-          <w:tab w:val="num" w:pos="1800"/>
-        </w:tabs>
-        <w:ind w:start="1800" w:hanging="360"/>
-      </w:pPr>
-      <w:rPr/>
-    </w:lvl>
-    <w:lvl w:ilvl="4">
-      <w:start w:val="1"/>
-      <w:numFmt w:val="upperLetter"/>
-      <w:lvlText w:val="%5)"/>
-      <w:lvlJc w:val="start"/>
-      <w:pPr>
-        <w:tabs>
-          <w:tab w:val="num" w:pos="2160"/>
-        </w:tabs>
-        <w:ind w:start="2160" w:hanging="360"/>
-      </w:pPr>
-      <w:rPr/>
-    </w:lvl>
-    <w:lvl w:ilvl="5">
-      <w:start w:val="1"/>
-      <w:numFmt w:val="upperLetter"/>
-      <w:lvlText w:val="%6)"/>
-      <w:lvlJc w:val="start"/>
-      <w:pPr>
-        <w:tabs>
-          <w:tab w:val="num" w:pos="2520"/>
-        </w:tabs>
-        <w:ind w:start="2520" w:hanging="360"/>
-      </w:pPr>
-      <w:rPr/>
-    </w:lvl>
-    <w:lvl w:ilvl="6">
-      <w:start w:val="1"/>
-      <w:numFmt w:val="upperLetter"/>
-      <w:lvlText w:val="%7)"/>
-      <w:lvlJc w:val="start"/>
-      <w:pPr>
-        <w:tabs>
-          <w:tab w:val="num" w:pos="2880"/>
-        </w:tabs>
-        <w:ind w:start="2880" w:hanging="360"/>
-      </w:pPr>
-      <w:rPr/>
-    </w:lvl>
-    <w:lvl w:ilvl="7">
-      <w:start w:val="1"/>
-      <w:numFmt w:val="upperLetter"/>
-      <w:lvlText w:val="%8)"/>
-      <w:lvlJc w:val="start"/>
-      <w:pPr>
-        <w:tabs>
-          <w:tab w:val="num" w:pos="3240"/>
-        </w:tabs>
-        <w:ind w:start="3240" w:hanging="360"/>
-      </w:pPr>
-      <w:rPr/>
-    </w:lvl>
-    <w:lvl w:ilvl="8">
-      <w:start w:val="1"/>
-      <w:numFmt w:val="upperLetter"/>
-      <w:lvlText w:val="%9)"/>
-      <w:lvlJc w:val="start"/>
-      <w:pPr>
-        <w:tabs>
-          <w:tab w:val="num" w:pos="3600"/>
-        </w:tabs>
-        <w:ind w:start="3600" w:hanging="360"/>
-      </w:pPr>
-      <w:rPr/>
-    </w:lvl>
-  </w:abstractNum>
-  <w:abstractNum w:abstractNumId="9">
-    <w:lvl w:ilvl="0">
-      <w:start w:val="1"/>
-      <w:numFmt w:val="bullet"/>
-      <w:lvlText w:val=""/>
-      <w:lvlJc w:val="start"/>
-      <w:pPr>
-        <w:tabs>
-          <w:tab w:val="num" w:pos="720"/>
-        </w:tabs>
-        <w:ind w:start="720" w:hanging="360"/>
-      </w:pPr>
-      <w:rPr>
-        <w:rFonts w:ascii="Symbol" w:hAnsi="Symbol" w:cs="Symbol" w:hint="default"/>
-      </w:rPr>
-    </w:lvl>
-    <w:lvl w:ilvl="1">
-      <w:start w:val="1"/>
-      <w:numFmt w:val="bullet"/>
-      <w:lvlText w:val=""/>
-      <w:lvlJc w:val="start"/>
-      <w:pPr>
-        <w:tabs>
-          <w:tab w:val="num" w:pos="1080"/>
-        </w:tabs>
-        <w:ind w:start="1080" w:hanging="360"/>
-      </w:pPr>
-      <w:rPr>
-        <w:rFonts w:ascii="Symbol" w:hAnsi="Symbol" w:cs="Symbol" w:hint="default"/>
-      </w:rPr>
-    </w:lvl>
-    <w:lvl w:ilvl="2">
-      <w:start w:val="1"/>
-      <w:numFmt w:val="bullet"/>
-      <w:lvlText w:val="o"/>
-      <w:lvlJc w:val="start"/>
-      <w:pPr>
-        <w:tabs>
-          <w:tab w:val="num" w:pos="1440"/>
-        </w:tabs>
-        <w:ind w:start="1440" w:hanging="360"/>
-      </w:pPr>
-      <w:rPr>
-        <w:rFonts w:ascii="Courier New" w:hAnsi="Courier New" w:cs="Courier New" w:hint="default"/>
       </w:rPr>
     </w:lvl>
     <w:lvl w:ilvl="3">
@@ -6317,15 +4728,6 @@
   </w:num>
   <w:num w:numId="6">
     <w:abstractNumId w:val="6"/>
-  </w:num>
-  <w:num w:numId="7">
-    <w:abstractNumId w:val="7"/>
-  </w:num>
-  <w:num w:numId="8">
-    <w:abstractNumId w:val="8"/>
-  </w:num>
-  <w:num w:numId="9">
-    <w:abstractNumId w:val="9"/>
   </w:num>
 </w:numbering>
 </file>
@@ -7106,13 +5508,13 @@
       <w:iCs/>
     </w:rPr>
   </w:style>
-  <w:style w:type="character" w:styleId="NumberingSymbols">
-    <w:name w:val="Numbering Symbols"/>
+  <w:style w:type="character" w:styleId="Nummerierungszeichenuser">
+    <w:name w:val="Nummerierungszeichen (user)"/>
     <w:qFormat/>
     <w:rPr/>
   </w:style>
-  <w:style w:type="paragraph" w:styleId="Heading">
-    <w:name w:val="Heading"/>
+  <w:style w:type="paragraph" w:styleId="berschrift">
+    <w:name w:val="Überschrift"/>
     <w:basedOn w:val="Normal"/>
     <w:next w:val="BodyText"/>
     <w:qFormat/>
@@ -7158,8 +5560,8 @@
       <w:szCs w:val="24"/>
     </w:rPr>
   </w:style>
-  <w:style w:type="paragraph" w:styleId="Index">
-    <w:name w:val="Index"/>
+  <w:style w:type="paragraph" w:styleId="Verzeichnis">
+    <w:name w:val="Verzeichnis"/>
     <w:basedOn w:val="Normal"/>
     <w:qFormat/>
     <w:pPr>
@@ -7169,8 +5571,8 @@
       <w:rFonts w:cs="Arial Unicode MS"/>
     </w:rPr>
   </w:style>
-  <w:style w:type="paragraph" w:styleId="berschrift">
-    <w:name w:val="Überschrift"/>
+  <w:style w:type="paragraph" w:styleId="berschriftuser">
+    <w:name w:val="Überschrift (user)"/>
     <w:basedOn w:val="Normal"/>
     <w:next w:val="BodyText"/>
     <w:qFormat/>
@@ -7184,8 +5586,8 @@
       <w:szCs w:val="28"/>
     </w:rPr>
   </w:style>
-  <w:style w:type="paragraph" w:styleId="Verzeichnis">
-    <w:name w:val="Verzeichnis"/>
+  <w:style w:type="paragraph" w:styleId="Verzeichnisuser">
+    <w:name w:val="Verzeichnis (user)"/>
     <w:basedOn w:val="Normal"/>
     <w:qFormat/>
     <w:pPr>
@@ -7386,8 +5788,8 @@
     <w:pPr/>
     <w:rPr/>
   </w:style>
-  <w:style w:type="paragraph" w:styleId="HeaderandFooter">
-    <w:name w:val="Header and Footer"/>
+  <w:style w:type="paragraph" w:styleId="Kopf-Fuzeileuser">
+    <w:name w:val="Kopf-/Fußzeile (user)"/>
     <w:basedOn w:val="Normal"/>
     <w:qFormat/>
     <w:pPr/>
@@ -7451,7 +5853,8 @@
     <w:qFormat/>
     <w:pPr>
       <w:suppressLineNumbers/>
-      <w:jc w:val="center"/>
+      <w:spacing w:lineRule="auto" w:line="240"/>
+      <w:jc w:val="start"/>
     </w:pPr>
     <w:rPr>
       <w:b/>
@@ -7720,12 +6123,42 @@
     <w:pPr/>
     <w:rPr/>
   </w:style>
-  <w:style w:type="paragraph" w:styleId="FrameContentsuser">
-    <w:name w:val="Frame Contents (user)"/>
-    <w:basedOn w:val="Normal"/>
+  <w:style w:type="paragraph" w:styleId="Tabelleuser">
+    <w:name w:val="Tabelle (user)"/>
+    <w:basedOn w:val="Caption"/>
     <w:qFormat/>
     <w:pPr/>
     <w:rPr/>
+  </w:style>
+  <w:style w:type="paragraph" w:styleId="Rahmeninhaltuser">
+    <w:name w:val="Rahmeninhalt (user)"/>
+    <w:basedOn w:val="Normal"/>
+    <w:qFormat/>
+    <w:pPr/>
+    <w:rPr/>
+  </w:style>
+  <w:style w:type="paragraph" w:styleId="Tabelleninhaltuser">
+    <w:name w:val="Tabelleninhalt (user)"/>
+    <w:basedOn w:val="Normal"/>
+    <w:qFormat/>
+    <w:pPr>
+      <w:widowControl w:val="false"/>
+      <w:suppressLineNumbers/>
+    </w:pPr>
+    <w:rPr/>
+  </w:style>
+  <w:style w:type="paragraph" w:styleId="Tabellenberschriftuser">
+    <w:name w:val="Tabellenüberschrift (user)"/>
+    <w:basedOn w:val="Tabelleninhaltuser"/>
+    <w:qFormat/>
+    <w:pPr>
+      <w:suppressLineNumbers/>
+      <w:jc w:val="center"/>
+    </w:pPr>
+    <w:rPr>
+      <w:b/>
+      <w:bCs/>
+    </w:rPr>
   </w:style>
   <w:style w:type="numbering" w:styleId="KeineListe" w:default="1">
     <w:name w:val="Keine Liste"/>
@@ -7767,37 +6200,37 @@
         <a:srgbClr val="000000"/>
       </a:dk1>
       <a:lt1>
-        <a:srgbClr val="FFFFFF"/>
+        <a:srgbClr val="ffffff"/>
       </a:lt1>
       <a:dk2>
-        <a:srgbClr val="44546A"/>
+        <a:srgbClr val="44546a"/>
       </a:dk2>
       <a:lt2>
-        <a:srgbClr val="E7E6E6"/>
+        <a:srgbClr val="e7e6e6"/>
       </a:lt2>
       <a:accent1>
-        <a:srgbClr val="5B9BD5"/>
+        <a:srgbClr val="5b9bd5"/>
       </a:accent1>
       <a:accent2>
-        <a:srgbClr val="ED7D31"/>
+        <a:srgbClr val="ed7d31"/>
       </a:accent2>
       <a:accent3>
-        <a:srgbClr val="A5A5A5"/>
+        <a:srgbClr val="a5a5a5"/>
       </a:accent3>
       <a:accent4>
-        <a:srgbClr val="FFC000"/>
+        <a:srgbClr val="ffc000"/>
       </a:accent4>
       <a:accent5>
-        <a:srgbClr val="4472C4"/>
+        <a:srgbClr val="4472c4"/>
       </a:accent5>
       <a:accent6>
-        <a:srgbClr val="70AD47"/>
+        <a:srgbClr val="70ad47"/>
       </a:accent6>
       <a:hlink>
-        <a:srgbClr val="0563C1"/>
+        <a:srgbClr val="0563c1"/>
       </a:hlink>
       <a:folHlink>
-        <a:srgbClr val="954F72"/>
+        <a:srgbClr val="954f72"/>
       </a:folHlink>
     </a:clrScheme>
     <a:fontScheme name="Office">

</xml_diff>

<commit_message>
added flatRates to data
</commit_message>
<xml_diff>
--- a/server/assets/templates/offer.docx
+++ b/server/assets/templates/offer.docx
@@ -2002,6 +2002,202 @@
                 <w:lang w:val="de-DE" w:eastAsia="de-DE"/>
               </w:rPr>
               <w:t>{/}</w:t>
+            </w:r>
+          </w:p>
+        </w:tc>
+      </w:tr>
+      <w:tr>
+        <w:trPr>
+          <w:trHeight w:val="456" w:hRule="atLeast"/>
+        </w:trPr>
+        <w:tc>
+          <w:tcPr>
+            <w:tcW w:w="610" w:type="dxa"/>
+            <w:gridSpan w:val="2"/>
+            <w:tcBorders>
+              <w:bottom w:val="single" w:sz="4" w:space="0" w:color="7F7F7F"/>
+            </w:tcBorders>
+            <w:vAlign w:val="center"/>
+          </w:tcPr>
+          <w:p>
+            <w:pPr>
+              <w:pStyle w:val="Normal"/>
+              <w:numPr>
+                <w:ilvl w:val="0"/>
+                <w:numId w:val="4"/>
+              </w:numPr>
+              <w:spacing w:lineRule="auto" w:line="240" w:before="60" w:after="60"/>
+              <w:jc w:val="center"/>
+              <w:rPr>
+                <w:color w:val="000000"/>
+                <w:sz w:val="16"/>
+                <w:szCs w:val="16"/>
+              </w:rPr>
+            </w:pPr>
+            <w:r>
+              <w:rPr>
+                <w:color w:val="000000"/>
+                <w:sz w:val="16"/>
+                <w:szCs w:val="16"/>
+              </w:rPr>
+            </w:r>
+          </w:p>
+        </w:tc>
+        <w:tc>
+          <w:tcPr>
+            <w:tcW w:w="4667" w:type="dxa"/>
+            <w:tcBorders>
+              <w:bottom w:val="single" w:sz="4" w:space="0" w:color="7F7F7F"/>
+            </w:tcBorders>
+            <w:vAlign w:val="center"/>
+          </w:tcPr>
+          <w:p>
+            <w:pPr>
+              <w:pStyle w:val="Normal"/>
+              <w:keepLines/>
+              <w:spacing w:lineRule="auto" w:line="276" w:before="0" w:after="0"/>
+              <w:jc w:val="start"/>
+              <w:rPr>
+                <w:sz w:val="16"/>
+                <w:szCs w:val="16"/>
+              </w:rPr>
+            </w:pPr>
+            <w:r>
+              <w:rPr>
+                <w:sz w:val="16"/>
+                <w:szCs w:val="16"/>
+              </w:rPr>
+              <w:t>{#flatRates}</w:t>
+            </w:r>
+          </w:p>
+          <w:p>
+            <w:pPr>
+              <w:pStyle w:val="Normal"/>
+              <w:keepLines/>
+              <w:spacing w:lineRule="auto" w:line="276" w:before="0" w:after="0"/>
+              <w:jc w:val="start"/>
+              <w:rPr>
+                <w:b/>
+                <w:bCs/>
+                <w:sz w:val="16"/>
+                <w:szCs w:val="16"/>
+              </w:rPr>
+            </w:pPr>
+            <w:r>
+              <w:rPr>
+                <w:b/>
+                <w:bCs/>
+                <w:sz w:val="16"/>
+                <w:szCs w:val="16"/>
+              </w:rPr>
+              <w:t>{flatRate.name}</w:t>
+            </w:r>
+          </w:p>
+          <w:p>
+            <w:pPr>
+              <w:pStyle w:val="Normal"/>
+              <w:spacing w:lineRule="auto" w:line="276" w:before="0" w:after="0"/>
+              <w:jc w:val="start"/>
+              <w:rPr>
+                <w:b w:val="false"/>
+                <w:bCs w:val="false"/>
+                <w:sz w:val="16"/>
+                <w:szCs w:val="16"/>
+              </w:rPr>
+            </w:pPr>
+            <w:r>
+              <w:rPr>
+                <w:b w:val="false"/>
+                <w:bCs w:val="false"/>
+                <w:sz w:val="16"/>
+                <w:szCs w:val="16"/>
+              </w:rPr>
+              <w:t>{flatRate.table}</w:t>
+            </w:r>
+          </w:p>
+        </w:tc>
+        <w:tc>
+          <w:tcPr>
+            <w:tcW w:w="1099" w:type="dxa"/>
+            <w:tcBorders>
+              <w:bottom w:val="single" w:sz="4" w:space="0" w:color="7F7F7F"/>
+            </w:tcBorders>
+            <w:vAlign w:val="center"/>
+          </w:tcPr>
+          <w:p>
+            <w:pPr>
+              <w:pStyle w:val="Normal"/>
+              <w:spacing w:lineRule="auto" w:line="240" w:before="60" w:after="60"/>
+              <w:jc w:val="start"/>
+              <w:rPr>
+                <w:sz w:val="16"/>
+                <w:szCs w:val="16"/>
+              </w:rPr>
+            </w:pPr>
+            <w:r>
+              <w:rPr>
+                <w:sz w:val="16"/>
+                <w:szCs w:val="16"/>
+              </w:rPr>
+              <w:t>{quantity}</w:t>
+            </w:r>
+          </w:p>
+        </w:tc>
+        <w:tc>
+          <w:tcPr>
+            <w:tcW w:w="1535" w:type="dxa"/>
+            <w:tcBorders>
+              <w:bottom w:val="single" w:sz="4" w:space="0" w:color="7F7F7F"/>
+            </w:tcBorders>
+            <w:vAlign w:val="center"/>
+          </w:tcPr>
+          <w:p>
+            <w:pPr>
+              <w:pStyle w:val="Normal"/>
+              <w:spacing w:lineRule="auto" w:line="240" w:before="60" w:after="60"/>
+              <w:jc w:val="end"/>
+              <w:rPr>
+                <w:sz w:val="16"/>
+                <w:szCs w:val="16"/>
+              </w:rPr>
+            </w:pPr>
+            <w:r>
+              <w:rPr>
+                <w:sz w:val="16"/>
+                <w:szCs w:val="16"/>
+              </w:rPr>
+            </w:r>
+          </w:p>
+        </w:tc>
+        <w:tc>
+          <w:tcPr>
+            <w:tcW w:w="1654" w:type="dxa"/>
+            <w:tcBorders>
+              <w:bottom w:val="single" w:sz="4" w:space="0" w:color="7F7F7F"/>
+            </w:tcBorders>
+            <w:vAlign w:val="center"/>
+          </w:tcPr>
+          <w:p>
+            <w:pPr>
+              <w:pStyle w:val="Normal"/>
+              <w:keepLines/>
+              <w:spacing w:lineRule="auto" w:line="276" w:before="0" w:after="0"/>
+              <w:jc w:val="start"/>
+              <w:rPr>
+                <w:b/>
+                <w:bCs/>
+                <w:sz w:val="16"/>
+                <w:szCs w:val="16"/>
+              </w:rPr>
+            </w:pPr>
+            <w:r>
+              <w:rPr>
+                <w:b/>
+                <w:bCs/>
+                <w:sz w:val="16"/>
+                <w:szCs w:val="16"/>
+              </w:rPr>
+              <w:t>{total_cents}{/}</w:t>
             </w:r>
           </w:p>
         </w:tc>

</xml_diff>

<commit_message>
new pipeline implementation for doc generation
</commit_message>
<xml_diff>
--- a/server/assets/templates/offer.docx
+++ b/server/assets/templates/offer.docx
@@ -1807,8 +1807,10 @@
               <w:spacing w:lineRule="auto" w:line="276" w:before="0" w:after="0"/>
               <w:jc w:val="start"/>
               <w:rPr>
-                <w:b w:val="false"/>
-                <w:bCs w:val="false"/>
+                <w:rFonts w:cs="Arial"/>
+                <w:sz w:val="16"/>
+                <w:szCs w:val="16"/>
+                <w:lang w:val="en-US"/>
               </w:rPr>
             </w:pPr>
             <w:r>
@@ -2197,7 +2199,7 @@
                 <w:sz w:val="16"/>
                 <w:szCs w:val="16"/>
               </w:rPr>
-              <w:t>{total_cents}{/}</w:t>
+              <w:t>{price.total}{/}</w:t>
             </w:r>
           </w:p>
         </w:tc>

</xml_diff>

<commit_message>
Trying to implement new pricing table configuratable
</commit_message>
<xml_diff>
--- a/server/assets/templates/offer.docx
+++ b/server/assets/templates/offer.docx
@@ -15,7 +15,7 @@
           <w:bottom w:w="0" w:type="dxa"/>
           <w:end w:w="70" w:type="dxa"/>
         </w:tblCellMar>
-        <w:tblLook w:val="0000" w:noHBand="0" w:noVBand="0" w:firstColumn="0" w:lastRow="0" w:lastColumn="0" w:firstRow="0"/>
+        <w:tblLook w:val="0000" w:noVBand="0" w:noHBand="0" w:lastColumn="0" w:firstColumn="0" w:lastRow="0" w:firstRow="0"/>
       </w:tblPr>
       <w:tblGrid>
         <w:gridCol w:w="2055"/>
@@ -552,7 +552,7 @@
           <w:bottom w:w="0" w:type="dxa"/>
           <w:end w:w="108" w:type="dxa"/>
         </w:tblCellMar>
-        <w:tblLook w:val="01e0" w:noHBand="0" w:noVBand="0" w:firstColumn="1" w:lastRow="1" w:lastColumn="1" w:firstRow="1"/>
+        <w:tblLook w:val="01e0" w:noVBand="0" w:noHBand="0" w:lastColumn="1" w:firstColumn="1" w:lastRow="1" w:firstRow="1"/>
       </w:tblPr>
       <w:tblGrid>
         <w:gridCol w:w="4593"/>
@@ -1119,6 +1119,15 @@
     <w:p>
       <w:pPr>
         <w:pStyle w:val="dignumStandardvor0nach0"/>
+        <w:rPr/>
+      </w:pPr>
+      <w:r>
+        <w:rPr/>
+      </w:r>
+    </w:p>
+    <w:p>
+      <w:pPr>
+        <w:pStyle w:val="dignumStandardvor0nach0"/>
         <w:rPr>
           <w:b/>
           <w:bCs/>
@@ -1141,7 +1150,7 @@
           <w:bottom w:w="0" w:type="dxa"/>
           <w:end w:w="70" w:type="dxa"/>
         </w:tblCellMar>
-        <w:tblLook w:val="0000" w:noHBand="0" w:noVBand="0" w:firstColumn="0" w:lastRow="0" w:lastColumn="0" w:firstRow="0"/>
+        <w:tblLook w:val="0000" w:noVBand="0" w:noHBand="0" w:lastColumn="0" w:firstColumn="0" w:lastRow="0" w:firstRow="0"/>
       </w:tblPr>
       <w:tblGrid>
         <w:gridCol w:w="305"/>
@@ -1260,8 +1269,7 @@
               <w:suppressLineNumbers/>
               <w:suppressAutoHyphens w:val="true"/>
               <w:bidi w:val="0"/>
-              <w:spacing w:before="80" w:after="80"/>
-              <w:jc w:val="start"/>
+              <w:spacing w:lineRule="exact" w:line="240" w:before="80" w:after="80"/>
               <w:rPr>
                 <w:rFonts w:ascii="Arial" w:hAnsi="Arial" w:eastAsia="Times New Roman" w:cs="Times New Roman"/>
                 <w:b/>
@@ -1305,17 +1313,8 @@
               <w:suppressAutoHyphens w:val="true"/>
               <w:bidi w:val="0"/>
               <w:spacing w:before="80" w:after="80"/>
-              <w:jc w:val="start"/>
-              <w:rPr>
-                <w:rFonts w:ascii="Arial" w:hAnsi="Arial" w:eastAsia="Times New Roman" w:cs="Times New Roman"/>
-                <w:b/>
-                <w:bCs/>
-                <w:color w:val="auto"/>
-                <w:kern w:val="0"/>
-                <w:sz w:val="16"/>
-                <w:szCs w:val="16"/>
-                <w:lang w:val="de-DE" w:eastAsia="de-DE" w:bidi="ar-SA"/>
-              </w:rPr>
+              <w:jc w:val="end"/>
+              <w:rPr/>
             </w:pPr>
             <w:r>
               <w:rPr>
@@ -1339,17 +1338,8 @@
               <w:suppressAutoHyphens w:val="true"/>
               <w:bidi w:val="0"/>
               <w:spacing w:before="80" w:after="80"/>
-              <w:jc w:val="start"/>
-              <w:rPr>
-                <w:rFonts w:ascii="Arial" w:hAnsi="Arial" w:eastAsia="Times New Roman" w:cs="Times New Roman"/>
-                <w:b/>
-                <w:bCs/>
-                <w:color w:val="auto"/>
-                <w:kern w:val="0"/>
-                <w:sz w:val="16"/>
-                <w:szCs w:val="16"/>
-                <w:lang w:val="de-DE" w:eastAsia="de-DE" w:bidi="ar-SA"/>
-              </w:rPr>
+              <w:jc w:val="end"/>
+              <w:rPr/>
             </w:pPr>
             <w:r>
               <w:rPr>
@@ -1383,17 +1373,8 @@
               <w:suppressAutoHyphens w:val="true"/>
               <w:bidi w:val="0"/>
               <w:spacing w:before="80" w:after="80"/>
-              <w:jc w:val="start"/>
-              <w:rPr>
-                <w:rFonts w:ascii="Arial" w:hAnsi="Arial" w:eastAsia="Times New Roman" w:cs="Times New Roman"/>
-                <w:b/>
-                <w:bCs/>
-                <w:color w:val="auto"/>
-                <w:kern w:val="0"/>
-                <w:sz w:val="16"/>
-                <w:szCs w:val="16"/>
-                <w:lang w:val="de-DE" w:eastAsia="de-DE" w:bidi="ar-SA"/>
-              </w:rPr>
+              <w:jc w:val="end"/>
+              <w:rPr/>
             </w:pPr>
             <w:r>
               <w:rPr>
@@ -1417,17 +1398,8 @@
               <w:suppressAutoHyphens w:val="true"/>
               <w:bidi w:val="0"/>
               <w:spacing w:before="80" w:after="80"/>
-              <w:jc w:val="start"/>
-              <w:rPr>
-                <w:rFonts w:ascii="Arial" w:hAnsi="Arial" w:eastAsia="Times New Roman" w:cs="Times New Roman"/>
-                <w:b/>
-                <w:bCs/>
-                <w:color w:val="auto"/>
-                <w:kern w:val="0"/>
-                <w:sz w:val="16"/>
-                <w:szCs w:val="16"/>
-                <w:lang w:val="de-DE" w:eastAsia="de-DE" w:bidi="ar-SA"/>
-              </w:rPr>
+              <w:jc w:val="end"/>
+              <w:rPr/>
             </w:pPr>
             <w:r>
               <w:rPr>
@@ -1523,10 +1495,8 @@
             <w:pPr>
               <w:pStyle w:val="dignumTabelle"/>
               <w:spacing w:lineRule="auto" w:line="240" w:before="60" w:after="60"/>
-              <w:rPr>
-                <w:b/>
-                <w:lang w:val="en-US" w:eastAsia="de-DE"/>
-              </w:rPr>
+              <w:jc w:val="start"/>
+              <w:rPr/>
             </w:pPr>
             <w:r>
               <w:rPr>
@@ -1646,7 +1616,7 @@
                 <w:szCs w:val="16"/>
                 <w:lang w:val="en-US"/>
               </w:rPr>
-              <w:t>Keepit – Tarif Backup für {name}</w:t>
+              <w:t>Keepit – {contract.name} Backup für {name}</w:t>
             </w:r>
           </w:p>
           <w:p>
@@ -1687,7 +1657,7 @@
             <w:pPr>
               <w:pStyle w:val="Normal"/>
               <w:spacing w:lineRule="auto" w:line="240" w:before="60" w:after="60"/>
-              <w:jc w:val="start"/>
+              <w:jc w:val="end"/>
               <w:rPr/>
             </w:pPr>
             <w:r>
@@ -1713,7 +1683,7 @@
             <w:pPr>
               <w:pStyle w:val="Normal"/>
               <w:spacing w:lineRule="auto" w:line="240" w:before="60" w:after="60"/>
-              <w:jc w:val="start"/>
+              <w:jc w:val="end"/>
               <w:rPr/>
             </w:pPr>
             <w:r>
@@ -1740,7 +1710,7 @@
             <w:pPr>
               <w:pStyle w:val="Tabelle"/>
               <w:spacing w:lineRule="auto" w:line="240" w:before="60" w:after="60"/>
-              <w:jc w:val="start"/>
+              <w:jc w:val="end"/>
               <w:rPr/>
             </w:pPr>
             <w:r>
@@ -1831,20 +1801,6 @@
               </w:rPr>
               <w:t>{#flatRates}</w:t>
             </w:r>
-          </w:p>
-          <w:p>
-            <w:pPr>
-              <w:pStyle w:val="Normal"/>
-              <w:keepLines/>
-              <w:spacing w:lineRule="auto" w:line="276" w:before="0" w:after="0"/>
-              <w:jc w:val="start"/>
-              <w:rPr>
-                <w:b/>
-                <w:bCs/>
-                <w:sz w:val="16"/>
-                <w:szCs w:val="16"/>
-              </w:rPr>
-            </w:pPr>
             <w:r>
               <w:rPr>
                 <w:b/>
@@ -1890,11 +1846,8 @@
             <w:pPr>
               <w:pStyle w:val="Normal"/>
               <w:spacing w:lineRule="auto" w:line="240" w:before="60" w:after="60"/>
-              <w:jc w:val="start"/>
-              <w:rPr>
-                <w:sz w:val="16"/>
-                <w:szCs w:val="16"/>
-              </w:rPr>
+              <w:jc w:val="end"/>
+              <w:rPr/>
             </w:pPr>
             <w:r>
               <w:rPr>
@@ -1944,13 +1897,8 @@
               <w:pStyle w:val="Normal"/>
               <w:keepLines/>
               <w:spacing w:lineRule="auto" w:line="276" w:before="0" w:after="0"/>
-              <w:jc w:val="start"/>
-              <w:rPr>
-                <w:b/>
-                <w:bCs/>
-                <w:sz w:val="16"/>
-                <w:szCs w:val="16"/>
-              </w:rPr>
+              <w:jc w:val="end"/>
+              <w:rPr/>
             </w:pPr>
             <w:r>
               <w:rPr>
@@ -2044,16 +1992,8 @@
             <w:pPr>
               <w:pStyle w:val="Tabelle"/>
               <w:spacing w:lineRule="auto" w:line="240" w:before="60" w:after="60"/>
-              <w:jc w:val="start"/>
-              <w:rPr>
-                <w:b/>
-                <w:i w:val="false"/>
-                <w:iCs w:val="false"/>
-                <w:color w:val="000000"/>
-                <w:sz w:val="16"/>
-                <w:szCs w:val="16"/>
-                <w:lang w:val="de-DE" w:eastAsia="de-DE"/>
-              </w:rPr>
+              <w:jc w:val="end"/>
+              <w:rPr/>
             </w:pPr>
             <w:r>
               <w:rPr>
@@ -2147,12 +2087,12 @@
         <w:bottom w:w="0" w:type="dxa"/>
         <w:end w:w="108" w:type="dxa"/>
       </w:tblCellMar>
-      <w:tblLook w:val="01e0" w:noHBand="0" w:noVBand="0" w:firstColumn="1" w:lastRow="1" w:lastColumn="1" w:firstRow="1"/>
+      <w:tblLook w:val="01e0" w:noVBand="0" w:noHBand="0" w:lastColumn="1" w:firstColumn="1" w:lastRow="1" w:firstRow="1"/>
     </w:tblPr>
     <w:tblGrid>
       <w:gridCol w:w="3012"/>
-      <w:gridCol w:w="2962"/>
-      <w:gridCol w:w="4091"/>
+      <w:gridCol w:w="2959"/>
+      <w:gridCol w:w="4094"/>
     </w:tblGrid>
     <w:tr>
       <w:trPr>
@@ -2214,7 +2154,7 @@
       </w:tc>
       <w:tc>
         <w:tcPr>
-          <w:tcW w:w="2962" w:type="dxa"/>
+          <w:tcW w:w="2959" w:type="dxa"/>
           <w:tcBorders>
             <w:start w:val="single" w:sz="4" w:space="0" w:color="7F7F7F"/>
             <w:end w:val="single" w:sz="4" w:space="0" w:color="7F7F7F"/>
@@ -2273,7 +2213,7 @@
       </w:tc>
       <w:tc>
         <w:tcPr>
-          <w:tcW w:w="4091" w:type="dxa"/>
+          <w:tcW w:w="4094" w:type="dxa"/>
           <w:tcBorders>
             <w:start w:val="single" w:sz="4" w:space="0" w:color="7F7F7F"/>
           </w:tcBorders>
@@ -2388,7 +2328,7 @@
       </w:tc>
       <w:tc>
         <w:tcPr>
-          <w:tcW w:w="2962" w:type="dxa"/>
+          <w:tcW w:w="2959" w:type="dxa"/>
           <w:tcBorders>
             <w:start w:val="single" w:sz="4" w:space="0" w:color="7F7F7F"/>
             <w:end w:val="single" w:sz="4" w:space="0" w:color="7F7F7F"/>
@@ -2447,7 +2387,7 @@
       </w:tc>
       <w:tc>
         <w:tcPr>
-          <w:tcW w:w="4091" w:type="dxa"/>
+          <w:tcW w:w="4094" w:type="dxa"/>
           <w:tcBorders>
             <w:start w:val="single" w:sz="4" w:space="0" w:color="7F7F7F"/>
           </w:tcBorders>
@@ -2567,7 +2507,7 @@
       </w:tc>
       <w:tc>
         <w:tcPr>
-          <w:tcW w:w="2962" w:type="dxa"/>
+          <w:tcW w:w="2959" w:type="dxa"/>
           <w:tcBorders>
             <w:start w:val="single" w:sz="4" w:space="0" w:color="7F7F7F"/>
             <w:end w:val="single" w:sz="4" w:space="0" w:color="7F7F7F"/>
@@ -2626,7 +2566,7 @@
       </w:tc>
       <w:tc>
         <w:tcPr>
-          <w:tcW w:w="4091" w:type="dxa"/>
+          <w:tcW w:w="4094" w:type="dxa"/>
           <w:tcBorders>
             <w:start w:val="single" w:sz="4" w:space="0" w:color="7F7F7F"/>
           </w:tcBorders>
@@ -2755,7 +2695,7 @@
       </w:tc>
       <w:tc>
         <w:tcPr>
-          <w:tcW w:w="2962" w:type="dxa"/>
+          <w:tcW w:w="2959" w:type="dxa"/>
           <w:tcBorders>
             <w:start w:val="single" w:sz="4" w:space="0" w:color="7F7F7F"/>
             <w:end w:val="single" w:sz="4" w:space="0" w:color="7F7F7F"/>
@@ -2814,7 +2754,7 @@
       </w:tc>
       <w:tc>
         <w:tcPr>
-          <w:tcW w:w="4091" w:type="dxa"/>
+          <w:tcW w:w="4094" w:type="dxa"/>
           <w:tcBorders>
             <w:start w:val="single" w:sz="4" w:space="0" w:color="7F7F7F"/>
           </w:tcBorders>
@@ -2875,12 +2815,12 @@
         <w:bottom w:w="0" w:type="dxa"/>
         <w:end w:w="108" w:type="dxa"/>
       </w:tblCellMar>
-      <w:tblLook w:val="01e0" w:noHBand="0" w:noVBand="0" w:firstColumn="1" w:lastRow="1" w:lastColumn="1" w:firstRow="1"/>
+      <w:tblLook w:val="01e0" w:noVBand="0" w:noHBand="0" w:lastColumn="1" w:firstColumn="1" w:lastRow="1" w:firstRow="1"/>
     </w:tblPr>
     <w:tblGrid>
       <w:gridCol w:w="3012"/>
-      <w:gridCol w:w="2962"/>
-      <w:gridCol w:w="4091"/>
+      <w:gridCol w:w="2959"/>
+      <w:gridCol w:w="4094"/>
     </w:tblGrid>
     <w:tr>
       <w:trPr>
@@ -2942,7 +2882,7 @@
       </w:tc>
       <w:tc>
         <w:tcPr>
-          <w:tcW w:w="2962" w:type="dxa"/>
+          <w:tcW w:w="2959" w:type="dxa"/>
           <w:tcBorders>
             <w:start w:val="single" w:sz="4" w:space="0" w:color="7F7F7F"/>
             <w:end w:val="single" w:sz="4" w:space="0" w:color="7F7F7F"/>
@@ -3001,7 +2941,7 @@
       </w:tc>
       <w:tc>
         <w:tcPr>
-          <w:tcW w:w="4091" w:type="dxa"/>
+          <w:tcW w:w="4094" w:type="dxa"/>
           <w:tcBorders>
             <w:start w:val="single" w:sz="4" w:space="0" w:color="7F7F7F"/>
           </w:tcBorders>
@@ -3116,7 +3056,7 @@
       </w:tc>
       <w:tc>
         <w:tcPr>
-          <w:tcW w:w="2962" w:type="dxa"/>
+          <w:tcW w:w="2959" w:type="dxa"/>
           <w:tcBorders>
             <w:start w:val="single" w:sz="4" w:space="0" w:color="7F7F7F"/>
             <w:end w:val="single" w:sz="4" w:space="0" w:color="7F7F7F"/>
@@ -3175,7 +3115,7 @@
       </w:tc>
       <w:tc>
         <w:tcPr>
-          <w:tcW w:w="4091" w:type="dxa"/>
+          <w:tcW w:w="4094" w:type="dxa"/>
           <w:tcBorders>
             <w:start w:val="single" w:sz="4" w:space="0" w:color="7F7F7F"/>
           </w:tcBorders>
@@ -3295,7 +3235,7 @@
       </w:tc>
       <w:tc>
         <w:tcPr>
-          <w:tcW w:w="2962" w:type="dxa"/>
+          <w:tcW w:w="2959" w:type="dxa"/>
           <w:tcBorders>
             <w:start w:val="single" w:sz="4" w:space="0" w:color="7F7F7F"/>
             <w:end w:val="single" w:sz="4" w:space="0" w:color="7F7F7F"/>
@@ -3354,7 +3294,7 @@
       </w:tc>
       <w:tc>
         <w:tcPr>
-          <w:tcW w:w="4091" w:type="dxa"/>
+          <w:tcW w:w="4094" w:type="dxa"/>
           <w:tcBorders>
             <w:start w:val="single" w:sz="4" w:space="0" w:color="7F7F7F"/>
           </w:tcBorders>
@@ -3483,7 +3423,7 @@
       </w:tc>
       <w:tc>
         <w:tcPr>
-          <w:tcW w:w="2962" w:type="dxa"/>
+          <w:tcW w:w="2959" w:type="dxa"/>
           <w:tcBorders>
             <w:start w:val="single" w:sz="4" w:space="0" w:color="7F7F7F"/>
             <w:end w:val="single" w:sz="4" w:space="0" w:color="7F7F7F"/>
@@ -3542,7 +3482,7 @@
       </w:tc>
       <w:tc>
         <w:tcPr>
-          <w:tcW w:w="4091" w:type="dxa"/>
+          <w:tcW w:w="4094" w:type="dxa"/>
           <w:tcBorders>
             <w:start w:val="single" w:sz="4" w:space="0" w:color="7F7F7F"/>
           </w:tcBorders>
@@ -5628,8 +5568,8 @@
     <w:qFormat/>
     <w:rPr/>
   </w:style>
-  <w:style w:type="character" w:styleId="Bullets">
-    <w:name w:val="Bullets"/>
+  <w:style w:type="character" w:styleId="Bulletsuser">
+    <w:name w:val="Bullets (user)"/>
     <w:qFormat/>
     <w:rPr>
       <w:rFonts w:ascii="OpenSymbol" w:hAnsi="OpenSymbol" w:eastAsia="OpenSymbol" w:cs="OpenSymbol"/>
@@ -5643,13 +5583,13 @@
       <w:iCs/>
     </w:rPr>
   </w:style>
-  <w:style w:type="character" w:styleId="Nummerierungszeichenuser">
-    <w:name w:val="Nummerierungszeichen (user)"/>
+  <w:style w:type="character" w:styleId="NumberingSymbols">
+    <w:name w:val="Numbering Symbols"/>
     <w:qFormat/>
     <w:rPr/>
   </w:style>
-  <w:style w:type="paragraph" w:styleId="berschrift">
-    <w:name w:val="Überschrift"/>
+  <w:style w:type="paragraph" w:styleId="Heading">
+    <w:name w:val="Heading"/>
     <w:basedOn w:val="Normal"/>
     <w:next w:val="BodyText"/>
     <w:qFormat/>
@@ -5695,8 +5635,8 @@
       <w:szCs w:val="24"/>
     </w:rPr>
   </w:style>
-  <w:style w:type="paragraph" w:styleId="Verzeichnis">
-    <w:name w:val="Verzeichnis"/>
+  <w:style w:type="paragraph" w:styleId="Index">
+    <w:name w:val="Index"/>
     <w:basedOn w:val="Normal"/>
     <w:qFormat/>
     <w:pPr>
@@ -5706,8 +5646,8 @@
       <w:rFonts w:cs="Arial Unicode MS"/>
     </w:rPr>
   </w:style>
-  <w:style w:type="paragraph" w:styleId="berschriftuser">
-    <w:name w:val="Überschrift (user)"/>
+  <w:style w:type="paragraph" w:styleId="berschrift">
+    <w:name w:val="Überschrift"/>
     <w:basedOn w:val="Normal"/>
     <w:next w:val="BodyText"/>
     <w:qFormat/>
@@ -5721,8 +5661,8 @@
       <w:szCs w:val="28"/>
     </w:rPr>
   </w:style>
-  <w:style w:type="paragraph" w:styleId="Verzeichnisuser">
-    <w:name w:val="Verzeichnis (user)"/>
+  <w:style w:type="paragraph" w:styleId="Verzeichnis">
+    <w:name w:val="Verzeichnis"/>
     <w:basedOn w:val="Normal"/>
     <w:qFormat/>
     <w:pPr>
@@ -5923,8 +5863,8 @@
     <w:pPr/>
     <w:rPr/>
   </w:style>
-  <w:style w:type="paragraph" w:styleId="Kopf-Fuzeileuser">
-    <w:name w:val="Kopf-/Fußzeile (user)"/>
+  <w:style w:type="paragraph" w:styleId="HeaderandFooter">
+    <w:name w:val="Header and Footer"/>
     <w:basedOn w:val="Normal"/>
     <w:qFormat/>
     <w:pPr/>
@@ -5988,8 +5928,7 @@
     <w:qFormat/>
     <w:pPr>
       <w:suppressLineNumbers/>
-      <w:spacing w:lineRule="auto" w:line="240"/>
-      <w:jc w:val="start"/>
+      <w:jc w:val="end"/>
     </w:pPr>
     <w:rPr>
       <w:b/>
@@ -6231,8 +6170,8 @@
     </w:pPr>
     <w:rPr/>
   </w:style>
-  <w:style w:type="paragraph" w:styleId="FrameContents">
-    <w:name w:val="Frame Contents"/>
+  <w:style w:type="paragraph" w:styleId="FrameContentsuser">
+    <w:name w:val="Frame Contents (user)"/>
     <w:basedOn w:val="Normal"/>
     <w:qFormat/>
     <w:pPr/>
@@ -6258,42 +6197,12 @@
     <w:pPr/>
     <w:rPr/>
   </w:style>
-  <w:style w:type="paragraph" w:styleId="Tabelleuser">
-    <w:name w:val="Tabelle (user)"/>
-    <w:basedOn w:val="Caption"/>
+  <w:style w:type="paragraph" w:styleId="FrameContents">
+    <w:name w:val="Frame Contents"/>
+    <w:basedOn w:val="Normal"/>
     <w:qFormat/>
     <w:pPr/>
     <w:rPr/>
-  </w:style>
-  <w:style w:type="paragraph" w:styleId="Rahmeninhaltuser">
-    <w:name w:val="Rahmeninhalt (user)"/>
-    <w:basedOn w:val="Normal"/>
-    <w:qFormat/>
-    <w:pPr/>
-    <w:rPr/>
-  </w:style>
-  <w:style w:type="paragraph" w:styleId="Tabelleninhaltuser">
-    <w:name w:val="Tabelleninhalt (user)"/>
-    <w:basedOn w:val="Normal"/>
-    <w:qFormat/>
-    <w:pPr>
-      <w:widowControl w:val="false"/>
-      <w:suppressLineNumbers/>
-    </w:pPr>
-    <w:rPr/>
-  </w:style>
-  <w:style w:type="paragraph" w:styleId="Tabellenberschriftuser">
-    <w:name w:val="Tabellenüberschrift (user)"/>
-    <w:basedOn w:val="Tabelleninhaltuser"/>
-    <w:qFormat/>
-    <w:pPr>
-      <w:suppressLineNumbers/>
-      <w:jc w:val="center"/>
-    </w:pPr>
-    <w:rPr>
-      <w:b/>
-      <w:bCs/>
-    </w:rPr>
   </w:style>
   <w:style w:type="numbering" w:styleId="KeineListe" w:default="1">
     <w:name w:val="Keine Liste"/>
@@ -6306,8 +6215,8 @@
     <w:name w:val="Nummerierung 123"/>
     <w:qFormat/>
   </w:style>
-  <w:style w:type="numbering" w:styleId="Bullet">
-    <w:name w:val="Bullet •"/>
+  <w:style w:type="numbering" w:styleId="Bulletuser">
+    <w:name w:val="Bullet • (user)"/>
     <w:qFormat/>
   </w:style>
   <w:style w:type="table" w:default="1" w:styleId="NormaleTabelle">
@@ -6335,37 +6244,37 @@
         <a:srgbClr val="000000"/>
       </a:dk1>
       <a:lt1>
-        <a:srgbClr val="ffffff"/>
+        <a:srgbClr val="FFFFFF"/>
       </a:lt1>
       <a:dk2>
-        <a:srgbClr val="44546a"/>
+        <a:srgbClr val="44546A"/>
       </a:dk2>
       <a:lt2>
-        <a:srgbClr val="e7e6e6"/>
+        <a:srgbClr val="E7E6E6"/>
       </a:lt2>
       <a:accent1>
-        <a:srgbClr val="5b9bd5"/>
+        <a:srgbClr val="5B9BD5"/>
       </a:accent1>
       <a:accent2>
-        <a:srgbClr val="ed7d31"/>
+        <a:srgbClr val="ED7D31"/>
       </a:accent2>
       <a:accent3>
-        <a:srgbClr val="a5a5a5"/>
+        <a:srgbClr val="A5A5A5"/>
       </a:accent3>
       <a:accent4>
-        <a:srgbClr val="ffc000"/>
+        <a:srgbClr val="FFC000"/>
       </a:accent4>
       <a:accent5>
-        <a:srgbClr val="4472c4"/>
+        <a:srgbClr val="4472C4"/>
       </a:accent5>
       <a:accent6>
-        <a:srgbClr val="70ad47"/>
+        <a:srgbClr val="70AD47"/>
       </a:accent6>
       <a:hlink>
-        <a:srgbClr val="0563c1"/>
+        <a:srgbClr val="0563C1"/>
       </a:hlink>
       <a:folHlink>
-        <a:srgbClr val="954f72"/>
+        <a:srgbClr val="954F72"/>
       </a:folHlink>
     </a:clrScheme>
     <a:fontScheme name="Office">

</xml_diff>

<commit_message>
Started implementation of the ordere pipeline
Work in progress
</commit_message>
<xml_diff>
--- a/server/assets/templates/offer.docx
+++ b/server/assets/templates/offer.docx
@@ -108,7 +108,19 @@
               <w:rPr>
                 <w:b/>
               </w:rPr>
-              <w:t>{voucherId}</w:t>
+              <w:t>{</w:t>
+            </w:r>
+            <w:r>
+              <w:rPr>
+                <w:b/>
+              </w:rPr>
+              <w:t>quoteId</w:t>
+            </w:r>
+            <w:r>
+              <w:rPr>
+                <w:b/>
+              </w:rPr>
+              <w:t>}</w:t>
             </w:r>
           </w:p>
         </w:tc>
@@ -2091,8 +2103,8 @@
     </w:tblPr>
     <w:tblGrid>
       <w:gridCol w:w="3012"/>
-      <w:gridCol w:w="2959"/>
-      <w:gridCol w:w="4094"/>
+      <w:gridCol w:w="2958"/>
+      <w:gridCol w:w="4095"/>
     </w:tblGrid>
     <w:tr>
       <w:trPr>
@@ -2154,7 +2166,7 @@
       </w:tc>
       <w:tc>
         <w:tcPr>
-          <w:tcW w:w="2959" w:type="dxa"/>
+          <w:tcW w:w="2958" w:type="dxa"/>
           <w:tcBorders>
             <w:start w:val="single" w:sz="4" w:space="0" w:color="7F7F7F"/>
             <w:end w:val="single" w:sz="4" w:space="0" w:color="7F7F7F"/>
@@ -2213,7 +2225,7 @@
       </w:tc>
       <w:tc>
         <w:tcPr>
-          <w:tcW w:w="4094" w:type="dxa"/>
+          <w:tcW w:w="4095" w:type="dxa"/>
           <w:tcBorders>
             <w:start w:val="single" w:sz="4" w:space="0" w:color="7F7F7F"/>
           </w:tcBorders>
@@ -2328,7 +2340,7 @@
       </w:tc>
       <w:tc>
         <w:tcPr>
-          <w:tcW w:w="2959" w:type="dxa"/>
+          <w:tcW w:w="2958" w:type="dxa"/>
           <w:tcBorders>
             <w:start w:val="single" w:sz="4" w:space="0" w:color="7F7F7F"/>
             <w:end w:val="single" w:sz="4" w:space="0" w:color="7F7F7F"/>
@@ -2387,7 +2399,7 @@
       </w:tc>
       <w:tc>
         <w:tcPr>
-          <w:tcW w:w="4094" w:type="dxa"/>
+          <w:tcW w:w="4095" w:type="dxa"/>
           <w:tcBorders>
             <w:start w:val="single" w:sz="4" w:space="0" w:color="7F7F7F"/>
           </w:tcBorders>
@@ -2507,7 +2519,7 @@
       </w:tc>
       <w:tc>
         <w:tcPr>
-          <w:tcW w:w="2959" w:type="dxa"/>
+          <w:tcW w:w="2958" w:type="dxa"/>
           <w:tcBorders>
             <w:start w:val="single" w:sz="4" w:space="0" w:color="7F7F7F"/>
             <w:end w:val="single" w:sz="4" w:space="0" w:color="7F7F7F"/>
@@ -2566,7 +2578,7 @@
       </w:tc>
       <w:tc>
         <w:tcPr>
-          <w:tcW w:w="4094" w:type="dxa"/>
+          <w:tcW w:w="4095" w:type="dxa"/>
           <w:tcBorders>
             <w:start w:val="single" w:sz="4" w:space="0" w:color="7F7F7F"/>
           </w:tcBorders>
@@ -2695,7 +2707,7 @@
       </w:tc>
       <w:tc>
         <w:tcPr>
-          <w:tcW w:w="2959" w:type="dxa"/>
+          <w:tcW w:w="2958" w:type="dxa"/>
           <w:tcBorders>
             <w:start w:val="single" w:sz="4" w:space="0" w:color="7F7F7F"/>
             <w:end w:val="single" w:sz="4" w:space="0" w:color="7F7F7F"/>
@@ -2754,7 +2766,7 @@
       </w:tc>
       <w:tc>
         <w:tcPr>
-          <w:tcW w:w="4094" w:type="dxa"/>
+          <w:tcW w:w="4095" w:type="dxa"/>
           <w:tcBorders>
             <w:start w:val="single" w:sz="4" w:space="0" w:color="7F7F7F"/>
           </w:tcBorders>
@@ -2819,8 +2831,8 @@
     </w:tblPr>
     <w:tblGrid>
       <w:gridCol w:w="3012"/>
-      <w:gridCol w:w="2959"/>
-      <w:gridCol w:w="4094"/>
+      <w:gridCol w:w="2958"/>
+      <w:gridCol w:w="4095"/>
     </w:tblGrid>
     <w:tr>
       <w:trPr>
@@ -2882,7 +2894,7 @@
       </w:tc>
       <w:tc>
         <w:tcPr>
-          <w:tcW w:w="2959" w:type="dxa"/>
+          <w:tcW w:w="2958" w:type="dxa"/>
           <w:tcBorders>
             <w:start w:val="single" w:sz="4" w:space="0" w:color="7F7F7F"/>
             <w:end w:val="single" w:sz="4" w:space="0" w:color="7F7F7F"/>
@@ -2941,7 +2953,7 @@
       </w:tc>
       <w:tc>
         <w:tcPr>
-          <w:tcW w:w="4094" w:type="dxa"/>
+          <w:tcW w:w="4095" w:type="dxa"/>
           <w:tcBorders>
             <w:start w:val="single" w:sz="4" w:space="0" w:color="7F7F7F"/>
           </w:tcBorders>
@@ -3056,7 +3068,7 @@
       </w:tc>
       <w:tc>
         <w:tcPr>
-          <w:tcW w:w="2959" w:type="dxa"/>
+          <w:tcW w:w="2958" w:type="dxa"/>
           <w:tcBorders>
             <w:start w:val="single" w:sz="4" w:space="0" w:color="7F7F7F"/>
             <w:end w:val="single" w:sz="4" w:space="0" w:color="7F7F7F"/>
@@ -3115,7 +3127,7 @@
       </w:tc>
       <w:tc>
         <w:tcPr>
-          <w:tcW w:w="4094" w:type="dxa"/>
+          <w:tcW w:w="4095" w:type="dxa"/>
           <w:tcBorders>
             <w:start w:val="single" w:sz="4" w:space="0" w:color="7F7F7F"/>
           </w:tcBorders>
@@ -3235,7 +3247,7 @@
       </w:tc>
       <w:tc>
         <w:tcPr>
-          <w:tcW w:w="2959" w:type="dxa"/>
+          <w:tcW w:w="2958" w:type="dxa"/>
           <w:tcBorders>
             <w:start w:val="single" w:sz="4" w:space="0" w:color="7F7F7F"/>
             <w:end w:val="single" w:sz="4" w:space="0" w:color="7F7F7F"/>
@@ -3294,7 +3306,7 @@
       </w:tc>
       <w:tc>
         <w:tcPr>
-          <w:tcW w:w="4094" w:type="dxa"/>
+          <w:tcW w:w="4095" w:type="dxa"/>
           <w:tcBorders>
             <w:start w:val="single" w:sz="4" w:space="0" w:color="7F7F7F"/>
           </w:tcBorders>
@@ -3423,7 +3435,7 @@
       </w:tc>
       <w:tc>
         <w:tcPr>
-          <w:tcW w:w="2959" w:type="dxa"/>
+          <w:tcW w:w="2958" w:type="dxa"/>
           <w:tcBorders>
             <w:start w:val="single" w:sz="4" w:space="0" w:color="7F7F7F"/>
             <w:end w:val="single" w:sz="4" w:space="0" w:color="7F7F7F"/>
@@ -3482,7 +3494,7 @@
       </w:tc>
       <w:tc>
         <w:tcPr>
-          <w:tcW w:w="4094" w:type="dxa"/>
+          <w:tcW w:w="4095" w:type="dxa"/>
           <w:tcBorders>
             <w:start w:val="single" w:sz="4" w:space="0" w:color="7F7F7F"/>
           </w:tcBorders>
@@ -5568,8 +5580,8 @@
     <w:qFormat/>
     <w:rPr/>
   </w:style>
-  <w:style w:type="character" w:styleId="Bulletsuser">
-    <w:name w:val="Bullets (user)"/>
+  <w:style w:type="character" w:styleId="Bullets">
+    <w:name w:val="Bullets"/>
     <w:qFormat/>
     <w:rPr>
       <w:rFonts w:ascii="OpenSymbol" w:hAnsi="OpenSymbol" w:eastAsia="OpenSymbol" w:cs="OpenSymbol"/>
@@ -6170,8 +6182,8 @@
     </w:pPr>
     <w:rPr/>
   </w:style>
-  <w:style w:type="paragraph" w:styleId="FrameContentsuser">
-    <w:name w:val="Frame Contents (user)"/>
+  <w:style w:type="paragraph" w:styleId="FrameContents">
+    <w:name w:val="Frame Contents"/>
     <w:basedOn w:val="Normal"/>
     <w:qFormat/>
     <w:pPr/>
@@ -6197,8 +6209,8 @@
     <w:pPr/>
     <w:rPr/>
   </w:style>
-  <w:style w:type="paragraph" w:styleId="FrameContents">
-    <w:name w:val="Frame Contents"/>
+  <w:style w:type="paragraph" w:styleId="FrameContentsuser">
+    <w:name w:val="Frame Contents (user)"/>
     <w:basedOn w:val="Normal"/>
     <w:qFormat/>
     <w:pPr/>
@@ -6215,8 +6227,8 @@
     <w:name w:val="Nummerierung 123"/>
     <w:qFormat/>
   </w:style>
-  <w:style w:type="numbering" w:styleId="Bulletuser">
-    <w:name w:val="Bullet • (user)"/>
+  <w:style w:type="numbering" w:styleId="Bullet">
+    <w:name w:val="Bullet •"/>
     <w:qFormat/>
   </w:style>
   <w:style w:type="table" w:default="1" w:styleId="NormaleTabelle">

</xml_diff>

<commit_message>
required fields, offer template schema, Prisma.TransactionCLient
</commit_message>
<xml_diff>
--- a/server/assets/templates/offer.docx
+++ b/server/assets/templates/offer.docx
@@ -15,7 +15,7 @@
           <w:bottom w:w="0" w:type="dxa"/>
           <w:end w:w="70" w:type="dxa"/>
         </w:tblCellMar>
-        <w:tblLook w:val="0000" w:noVBand="0" w:noHBand="0" w:lastColumn="0" w:firstColumn="0" w:lastRow="0" w:firstRow="0"/>
+        <w:tblLook w:noHBand="0" w:lastColumn="0" w:firstColumn="0" w:lastRow="0" w:firstRow="0" w:noVBand="0" w:val="0000"/>
       </w:tblPr>
       <w:tblGrid>
         <w:gridCol w:w="2055"/>
@@ -108,19 +108,7 @@
               <w:rPr>
                 <w:b/>
               </w:rPr>
-              <w:t>{</w:t>
-            </w:r>
-            <w:r>
-              <w:rPr>
-                <w:b/>
-              </w:rPr>
-              <w:t>quoteId</w:t>
-            </w:r>
-            <w:r>
-              <w:rPr>
-                <w:b/>
-              </w:rPr>
-              <w:t>}</w:t>
+              <w:t>{quoteId}</w:t>
             </w:r>
           </w:p>
         </w:tc>
@@ -564,7 +552,7 @@
           <w:bottom w:w="0" w:type="dxa"/>
           <w:end w:w="108" w:type="dxa"/>
         </w:tblCellMar>
-        <w:tblLook w:val="01e0" w:noVBand="0" w:noHBand="0" w:lastColumn="1" w:firstColumn="1" w:lastRow="1" w:firstRow="1"/>
+        <w:tblLook w:noHBand="0" w:lastColumn="1" w:firstColumn="1" w:lastRow="1" w:firstRow="1" w:noVBand="0" w:val="01e0"/>
       </w:tblPr>
       <w:tblGrid>
         <w:gridCol w:w="4593"/>
@@ -889,7 +877,7 @@
           <w:b/>
           <w:bCs/>
         </w:rPr>
-        <w:t>„{contract.name}“</w:t>
+        <w:t>„{contract}“</w:t>
       </w:r>
     </w:p>
     <w:p>
@@ -910,7 +898,7 @@
           <w:b w:val="false"/>
           <w:bCs w:val="false"/>
         </w:rPr>
-        <w:t>{#contract.features}</w:t>
+        <w:t>{#features}</w:t>
       </w:r>
     </w:p>
     <w:p>
@@ -952,7 +940,7 @@
           <w:b w:val="false"/>
           <w:bCs w:val="false"/>
         </w:rPr>
-        <w:t>{/contract.features}</w:t>
+        <w:t>{/features}</w:t>
       </w:r>
     </w:p>
     <w:p>
@@ -1162,7 +1150,7 @@
           <w:bottom w:w="0" w:type="dxa"/>
           <w:end w:w="70" w:type="dxa"/>
         </w:tblCellMar>
-        <w:tblLook w:val="0000" w:noVBand="0" w:noHBand="0" w:lastColumn="0" w:firstColumn="0" w:lastRow="0" w:firstRow="0"/>
+        <w:tblLook w:noHBand="0" w:lastColumn="0" w:firstColumn="0" w:lastRow="0" w:firstRow="0" w:noVBand="0" w:val="0000"/>
       </w:tblPr>
       <w:tblGrid>
         <w:gridCol w:w="305"/>
@@ -1431,7 +1419,7 @@
       </w:tr>
       <w:tr>
         <w:trPr>
-          <w:cantSplit w:val="true"/>
+          <w:cantSplit/>
         </w:trPr>
         <w:tc>
           <w:tcPr>
@@ -1926,7 +1914,7 @@
       </w:tr>
       <w:tr>
         <w:trPr>
-          <w:cantSplit w:val="true"/>
+          <w:cantSplit/>
         </w:trPr>
         <w:tc>
           <w:tcPr>
@@ -2099,17 +2087,17 @@
         <w:bottom w:w="0" w:type="dxa"/>
         <w:end w:w="108" w:type="dxa"/>
       </w:tblCellMar>
-      <w:tblLook w:val="01e0" w:noVBand="0" w:noHBand="0" w:lastColumn="1" w:firstColumn="1" w:lastRow="1" w:firstRow="1"/>
+      <w:tblLook w:noHBand="0" w:lastColumn="1" w:firstColumn="1" w:lastRow="1" w:firstRow="1" w:noVBand="0" w:val="01e0"/>
     </w:tblPr>
     <w:tblGrid>
       <w:gridCol w:w="3012"/>
-      <w:gridCol w:w="2958"/>
-      <w:gridCol w:w="4095"/>
+      <w:gridCol w:w="2957"/>
+      <w:gridCol w:w="4096"/>
     </w:tblGrid>
     <w:tr>
       <w:trPr>
         <w:trHeight w:val="113" w:hRule="atLeast"/>
-        <w:cantSplit w:val="true"/>
+        <w:cantSplit/>
       </w:trPr>
       <w:tc>
         <w:tcPr>
@@ -2166,7 +2154,7 @@
       </w:tc>
       <w:tc>
         <w:tcPr>
-          <w:tcW w:w="2958" w:type="dxa"/>
+          <w:tcW w:w="2957" w:type="dxa"/>
           <w:tcBorders>
             <w:start w:val="single" w:sz="4" w:space="0" w:color="7F7F7F"/>
             <w:end w:val="single" w:sz="4" w:space="0" w:color="7F7F7F"/>
@@ -2225,7 +2213,7 @@
       </w:tc>
       <w:tc>
         <w:tcPr>
-          <w:tcW w:w="4095" w:type="dxa"/>
+          <w:tcW w:w="4096" w:type="dxa"/>
           <w:tcBorders>
             <w:start w:val="single" w:sz="4" w:space="0" w:color="7F7F7F"/>
           </w:tcBorders>
@@ -2277,7 +2265,7 @@
     <w:tr>
       <w:trPr>
         <w:trHeight w:val="114" w:hRule="atLeast"/>
-        <w:cantSplit w:val="true"/>
+        <w:cantSplit/>
       </w:trPr>
       <w:tc>
         <w:tcPr>
@@ -2340,7 +2328,7 @@
       </w:tc>
       <w:tc>
         <w:tcPr>
-          <w:tcW w:w="2958" w:type="dxa"/>
+          <w:tcW w:w="2957" w:type="dxa"/>
           <w:tcBorders>
             <w:start w:val="single" w:sz="4" w:space="0" w:color="7F7F7F"/>
             <w:end w:val="single" w:sz="4" w:space="0" w:color="7F7F7F"/>
@@ -2399,7 +2387,7 @@
       </w:tc>
       <w:tc>
         <w:tcPr>
-          <w:tcW w:w="4095" w:type="dxa"/>
+          <w:tcW w:w="4096" w:type="dxa"/>
           <w:tcBorders>
             <w:start w:val="single" w:sz="4" w:space="0" w:color="7F7F7F"/>
           </w:tcBorders>
@@ -2465,7 +2453,7 @@
     <w:tr>
       <w:trPr>
         <w:trHeight w:val="72" w:hRule="atLeast"/>
-        <w:cantSplit w:val="true"/>
+        <w:cantSplit/>
       </w:trPr>
       <w:tc>
         <w:tcPr>
@@ -2519,7 +2507,7 @@
       </w:tc>
       <w:tc>
         <w:tcPr>
-          <w:tcW w:w="2958" w:type="dxa"/>
+          <w:tcW w:w="2957" w:type="dxa"/>
           <w:tcBorders>
             <w:start w:val="single" w:sz="4" w:space="0" w:color="7F7F7F"/>
             <w:end w:val="single" w:sz="4" w:space="0" w:color="7F7F7F"/>
@@ -2578,7 +2566,7 @@
       </w:tc>
       <w:tc>
         <w:tcPr>
-          <w:tcW w:w="4095" w:type="dxa"/>
+          <w:tcW w:w="4096" w:type="dxa"/>
           <w:tcBorders>
             <w:start w:val="single" w:sz="4" w:space="0" w:color="7F7F7F"/>
           </w:tcBorders>
@@ -2644,7 +2632,7 @@
     <w:tr>
       <w:trPr>
         <w:trHeight w:val="20" w:hRule="atLeast"/>
-        <w:cantSplit w:val="true"/>
+        <w:cantSplit/>
       </w:trPr>
       <w:tc>
         <w:tcPr>
@@ -2707,7 +2695,7 @@
       </w:tc>
       <w:tc>
         <w:tcPr>
-          <w:tcW w:w="2958" w:type="dxa"/>
+          <w:tcW w:w="2957" w:type="dxa"/>
           <w:tcBorders>
             <w:start w:val="single" w:sz="4" w:space="0" w:color="7F7F7F"/>
             <w:end w:val="single" w:sz="4" w:space="0" w:color="7F7F7F"/>
@@ -2766,7 +2754,7 @@
       </w:tc>
       <w:tc>
         <w:tcPr>
-          <w:tcW w:w="4095" w:type="dxa"/>
+          <w:tcW w:w="4096" w:type="dxa"/>
           <w:tcBorders>
             <w:start w:val="single" w:sz="4" w:space="0" w:color="7F7F7F"/>
           </w:tcBorders>
@@ -2827,17 +2815,17 @@
         <w:bottom w:w="0" w:type="dxa"/>
         <w:end w:w="108" w:type="dxa"/>
       </w:tblCellMar>
-      <w:tblLook w:val="01e0" w:noVBand="0" w:noHBand="0" w:lastColumn="1" w:firstColumn="1" w:lastRow="1" w:firstRow="1"/>
+      <w:tblLook w:noHBand="0" w:lastColumn="1" w:firstColumn="1" w:lastRow="1" w:firstRow="1" w:noVBand="0" w:val="01e0"/>
     </w:tblPr>
     <w:tblGrid>
       <w:gridCol w:w="3012"/>
-      <w:gridCol w:w="2958"/>
-      <w:gridCol w:w="4095"/>
+      <w:gridCol w:w="2957"/>
+      <w:gridCol w:w="4096"/>
     </w:tblGrid>
     <w:tr>
       <w:trPr>
         <w:trHeight w:val="113" w:hRule="atLeast"/>
-        <w:cantSplit w:val="true"/>
+        <w:cantSplit/>
       </w:trPr>
       <w:tc>
         <w:tcPr>
@@ -2894,7 +2882,7 @@
       </w:tc>
       <w:tc>
         <w:tcPr>
-          <w:tcW w:w="2958" w:type="dxa"/>
+          <w:tcW w:w="2957" w:type="dxa"/>
           <w:tcBorders>
             <w:start w:val="single" w:sz="4" w:space="0" w:color="7F7F7F"/>
             <w:end w:val="single" w:sz="4" w:space="0" w:color="7F7F7F"/>
@@ -2953,7 +2941,7 @@
       </w:tc>
       <w:tc>
         <w:tcPr>
-          <w:tcW w:w="4095" w:type="dxa"/>
+          <w:tcW w:w="4096" w:type="dxa"/>
           <w:tcBorders>
             <w:start w:val="single" w:sz="4" w:space="0" w:color="7F7F7F"/>
           </w:tcBorders>
@@ -3005,7 +2993,7 @@
     <w:tr>
       <w:trPr>
         <w:trHeight w:val="114" w:hRule="atLeast"/>
-        <w:cantSplit w:val="true"/>
+        <w:cantSplit/>
       </w:trPr>
       <w:tc>
         <w:tcPr>
@@ -3068,7 +3056,7 @@
       </w:tc>
       <w:tc>
         <w:tcPr>
-          <w:tcW w:w="2958" w:type="dxa"/>
+          <w:tcW w:w="2957" w:type="dxa"/>
           <w:tcBorders>
             <w:start w:val="single" w:sz="4" w:space="0" w:color="7F7F7F"/>
             <w:end w:val="single" w:sz="4" w:space="0" w:color="7F7F7F"/>
@@ -3127,7 +3115,7 @@
       </w:tc>
       <w:tc>
         <w:tcPr>
-          <w:tcW w:w="4095" w:type="dxa"/>
+          <w:tcW w:w="4096" w:type="dxa"/>
           <w:tcBorders>
             <w:start w:val="single" w:sz="4" w:space="0" w:color="7F7F7F"/>
           </w:tcBorders>
@@ -3193,7 +3181,7 @@
     <w:tr>
       <w:trPr>
         <w:trHeight w:val="72" w:hRule="atLeast"/>
-        <w:cantSplit w:val="true"/>
+        <w:cantSplit/>
       </w:trPr>
       <w:tc>
         <w:tcPr>
@@ -3247,7 +3235,7 @@
       </w:tc>
       <w:tc>
         <w:tcPr>
-          <w:tcW w:w="2958" w:type="dxa"/>
+          <w:tcW w:w="2957" w:type="dxa"/>
           <w:tcBorders>
             <w:start w:val="single" w:sz="4" w:space="0" w:color="7F7F7F"/>
             <w:end w:val="single" w:sz="4" w:space="0" w:color="7F7F7F"/>
@@ -3306,7 +3294,7 @@
       </w:tc>
       <w:tc>
         <w:tcPr>
-          <w:tcW w:w="4095" w:type="dxa"/>
+          <w:tcW w:w="4096" w:type="dxa"/>
           <w:tcBorders>
             <w:start w:val="single" w:sz="4" w:space="0" w:color="7F7F7F"/>
           </w:tcBorders>
@@ -3372,7 +3360,7 @@
     <w:tr>
       <w:trPr>
         <w:trHeight w:val="20" w:hRule="atLeast"/>
-        <w:cantSplit w:val="true"/>
+        <w:cantSplit/>
       </w:trPr>
       <w:tc>
         <w:tcPr>
@@ -3435,7 +3423,7 @@
       </w:tc>
       <w:tc>
         <w:tcPr>
-          <w:tcW w:w="2958" w:type="dxa"/>
+          <w:tcW w:w="2957" w:type="dxa"/>
           <w:tcBorders>
             <w:start w:val="single" w:sz="4" w:space="0" w:color="7F7F7F"/>
             <w:end w:val="single" w:sz="4" w:space="0" w:color="7F7F7F"/>
@@ -3494,7 +3482,7 @@
       </w:tc>
       <w:tc>
         <w:tcPr>
-          <w:tcW w:w="4095" w:type="dxa"/>
+          <w:tcW w:w="4096" w:type="dxa"/>
           <w:tcBorders>
             <w:start w:val="single" w:sz="4" w:space="0" w:color="7F7F7F"/>
           </w:tcBorders>
@@ -5580,8 +5568,8 @@
     <w:qFormat/>
     <w:rPr/>
   </w:style>
-  <w:style w:type="character" w:styleId="Bullets">
-    <w:name w:val="Bullets"/>
+  <w:style w:type="character" w:styleId="Bulletsuser">
+    <w:name w:val="Bullets (user)"/>
     <w:qFormat/>
     <w:rPr>
       <w:rFonts w:ascii="OpenSymbol" w:hAnsi="OpenSymbol" w:eastAsia="OpenSymbol" w:cs="OpenSymbol"/>
@@ -6182,8 +6170,8 @@
     </w:pPr>
     <w:rPr/>
   </w:style>
-  <w:style w:type="paragraph" w:styleId="FrameContents">
-    <w:name w:val="Frame Contents"/>
+  <w:style w:type="paragraph" w:styleId="FrameContentsuser">
+    <w:name w:val="Frame Contents (user)"/>
     <w:basedOn w:val="Normal"/>
     <w:qFormat/>
     <w:pPr/>
@@ -6209,8 +6197,8 @@
     <w:pPr/>
     <w:rPr/>
   </w:style>
-  <w:style w:type="paragraph" w:styleId="FrameContentsuser">
-    <w:name w:val="Frame Contents (user)"/>
+  <w:style w:type="paragraph" w:styleId="FrameContents">
+    <w:name w:val="Frame Contents"/>
     <w:basedOn w:val="Normal"/>
     <w:qFormat/>
     <w:pPr/>
@@ -6227,8 +6215,8 @@
     <w:name w:val="Nummerierung 123"/>
     <w:qFormat/>
   </w:style>
-  <w:style w:type="numbering" w:styleId="Bullet">
-    <w:name w:val="Bullet •"/>
+  <w:style w:type="numbering" w:styleId="Bulletuser">
+    <w:name w:val="Bullet • (user)"/>
     <w:qFormat/>
   </w:style>
   <w:style w:type="table" w:default="1" w:styleId="NormaleTabelle">

</xml_diff>

<commit_message>
save. NOT WORKING PIPELINE
formatOfferData not operational!
</commit_message>
<xml_diff>
--- a/server/assets/templates/offer.docx
+++ b/server/assets/templates/offer.docx
@@ -15,7 +15,7 @@
           <w:bottom w:w="0" w:type="dxa"/>
           <w:end w:w="70" w:type="dxa"/>
         </w:tblCellMar>
-        <w:tblLook w:noHBand="0" w:lastColumn="0" w:firstColumn="0" w:lastRow="0" w:firstRow="0" w:noVBand="0" w:val="0000"/>
+        <w:tblLook w:noHBand="0" w:noVBand="0" w:firstColumn="0" w:lastRow="0" w:lastColumn="0" w:firstRow="0" w:val="0000"/>
       </w:tblPr>
       <w:tblGrid>
         <w:gridCol w:w="2055"/>
@@ -552,7 +552,7 @@
           <w:bottom w:w="0" w:type="dxa"/>
           <w:end w:w="108" w:type="dxa"/>
         </w:tblCellMar>
-        <w:tblLook w:noHBand="0" w:lastColumn="1" w:firstColumn="1" w:lastRow="1" w:firstRow="1" w:noVBand="0" w:val="01e0"/>
+        <w:tblLook w:noHBand="0" w:noVBand="0" w:firstColumn="1" w:lastRow="1" w:lastColumn="1" w:firstRow="1" w:val="01e0"/>
       </w:tblPr>
       <w:tblGrid>
         <w:gridCol w:w="4593"/>
@@ -874,7 +874,15 @@
       </w:pPr>
       <w:r>
         <w:rPr/>
-        <w:t>{#products.grouped}</w:t>
+        <w:t>{#</w:t>
+      </w:r>
+      <w:r>
+        <w:rPr/>
+        <w:t>groups</w:t>
+      </w:r>
+      <w:r>
+        <w:rPr/>
+        <w:t>}</w:t>
       </w:r>
     </w:p>
     <w:p>
@@ -1064,7 +1072,21 @@
           <w:b w:val="false"/>
           <w:bCs w:val="false"/>
         </w:rPr>
-        <w:t>{/products.grouped}</w:t>
+        <w:t>{/</w:t>
+      </w:r>
+      <w:r>
+        <w:rPr>
+          <w:b w:val="false"/>
+          <w:bCs w:val="false"/>
+        </w:rPr>
+        <w:t>groups</w:t>
+      </w:r>
+      <w:r>
+        <w:rPr>
+          <w:b w:val="false"/>
+          <w:bCs w:val="false"/>
+        </w:rPr>
+        <w:t>}</w:t>
       </w:r>
     </w:p>
     <w:p>
@@ -1094,7 +1116,15 @@
       </w:pPr>
       <w:r>
         <w:rPr/>
-        <w:t>{#products.grouped}</w:t>
+        <w:t>{#</w:t>
+      </w:r>
+      <w:r>
+        <w:rPr/>
+        <w:t>groups</w:t>
+      </w:r>
+      <w:r>
+        <w:rPr/>
+        <w:t>}</w:t>
       </w:r>
     </w:p>
     <w:p>
@@ -1258,7 +1288,15 @@
       </w:pPr>
       <w:r>
         <w:rPr/>
-        <w:t>{/products.grouped}</w:t>
+        <w:t>{/</w:t>
+      </w:r>
+      <w:r>
+        <w:rPr/>
+        <w:t>groups</w:t>
+      </w:r>
+      <w:r>
+        <w:rPr/>
+        <w:t>}</w:t>
       </w:r>
     </w:p>
     <w:p>
@@ -1287,7 +1325,7 @@
       </w:pPr>
       <w:r>
         <w:rPr/>
-        <w:t>{#products.items}{description}{/products.items}</w:t>
+        <w:t>{#products}{description}{/products}</w:t>
       </w:r>
     </w:p>
     <w:p>
@@ -1373,28 +1411,22 @@
     <w:p>
       <w:pPr>
         <w:pStyle w:val="dignumStandardvor0nach0"/>
-        <w:rPr/>
-      </w:pPr>
-      <w:r>
-        <w:rPr/>
-      </w:r>
-    </w:p>
-    <w:p>
-      <w:pPr>
-        <w:pStyle w:val="dignumStandardvor0nach0"/>
-        <w:rPr/>
-      </w:pPr>
-      <w:r>
-        <w:rPr/>
-      </w:r>
-    </w:p>
-    <w:p>
-      <w:pPr>
-        <w:pStyle w:val="dignumStandardvor0nach0"/>
-        <w:rPr/>
-      </w:pPr>
-      <w:r>
-        <w:rPr/>
+        <w:rPr>
+          <w:b/>
+          <w:bCs/>
+        </w:rPr>
+      </w:pPr>
+      <w:r>
+        <w:rPr/>
+        <w:t>{#</w:t>
+      </w:r>
+      <w:r>
+        <w:rPr/>
+        <w:t>tables</w:t>
+      </w:r>
+      <w:r>
+        <w:rPr/>
+        <w:t>}</w:t>
       </w:r>
     </w:p>
     <w:p>
@@ -1407,7 +1439,34 @@
       </w:pPr>
       <w:r>
         <w:rPr/>
-        <w:t>{#products}</w:t>
+        <w:t>{#compare}</w:t>
+      </w:r>
+    </w:p>
+    <w:p>
+      <w:pPr>
+        <w:pStyle w:val="dignumStandardvor0nach0"/>
+        <w:numPr>
+          <w:ilvl w:val="0"/>
+          <w:numId w:val="9"/>
+        </w:numPr>
+        <w:rPr/>
+      </w:pPr>
+      <w:r>
+        <w:rPr/>
+        <w:t>test {products}</w:t>
+      </w:r>
+    </w:p>
+    <w:p>
+      <w:pPr>
+        <w:pStyle w:val="dignumStandardvor0nach0"/>
+        <w:rPr>
+          <w:b/>
+          <w:bCs/>
+        </w:rPr>
+      </w:pPr>
+      <w:r>
+        <w:rPr/>
+        <w:t>{/compare}</w:t>
       </w:r>
     </w:p>
     <w:tbl>
@@ -1422,15 +1481,15 @@
           <w:bottom w:w="0" w:type="dxa"/>
           <w:end w:w="70" w:type="dxa"/>
         </w:tblCellMar>
-        <w:tblLook w:noHBand="0" w:lastColumn="0" w:firstColumn="0" w:lastRow="0" w:firstRow="0" w:noVBand="0" w:val="0000"/>
+        <w:tblLook w:noHBand="0" w:noVBand="0" w:firstColumn="0" w:lastRow="0" w:lastColumn="0" w:firstRow="0" w:val="0000"/>
       </w:tblPr>
       <w:tblGrid>
         <w:gridCol w:w="610"/>
         <w:gridCol w:w="4950"/>
-        <w:gridCol w:w="820"/>
+        <w:gridCol w:w="818"/>
         <w:gridCol w:w="992"/>
         <w:gridCol w:w="991"/>
-        <w:gridCol w:w="1202"/>
+        <w:gridCol w:w="1204"/>
       </w:tblGrid>
       <w:tr>
         <w:trPr>
@@ -1509,7 +1568,7 @@
         </w:tc>
         <w:tc>
           <w:tcPr>
-            <w:tcW w:w="820" w:type="dxa"/>
+            <w:tcW w:w="818" w:type="dxa"/>
             <w:tcBorders>
               <w:top w:val="single" w:sz="4" w:space="0" w:color="000000"/>
               <w:bottom w:val="single" w:sz="4" w:space="0" w:color="000000"/>
@@ -1706,7 +1765,7 @@
         </w:tc>
         <w:tc>
           <w:tcPr>
-            <w:tcW w:w="1202" w:type="dxa"/>
+            <w:tcW w:w="1204" w:type="dxa"/>
             <w:tcBorders>
               <w:top w:val="single" w:sz="4" w:space="0" w:color="000000"/>
               <w:bottom w:val="single" w:sz="4" w:space="0" w:color="000000"/>
@@ -1806,20 +1865,27 @@
                 <w:b/>
                 <w:lang w:val="en-US"/>
               </w:rPr>
-              <w:t xml:space="preserve">Keepit - Backup </w:t>
+              <w:t>Keepit - Backup {</w:t>
             </w:r>
             <w:r>
               <w:rPr>
                 <w:b/>
                 <w:lang w:val="en-US"/>
               </w:rPr>
-              <w:t>{names}</w:t>
+              <w:t>products</w:t>
+            </w:r>
+            <w:r>
+              <w:rPr>
+                <w:b/>
+                <w:lang w:val="en-US"/>
+              </w:rPr>
+              <w:t>}</w:t>
             </w:r>
           </w:p>
         </w:tc>
         <w:tc>
           <w:tcPr>
-            <w:tcW w:w="820" w:type="dxa"/>
+            <w:tcW w:w="818" w:type="dxa"/>
             <w:tcBorders>
               <w:top w:val="single" w:sz="4" w:space="0" w:color="7F7F7F"/>
               <w:bottom w:val="single" w:sz="4" w:space="0" w:color="7F7F7F"/>
@@ -1915,7 +1981,7 @@
         </w:tc>
         <w:tc>
           <w:tcPr>
-            <w:tcW w:w="1202" w:type="dxa"/>
+            <w:tcW w:w="1204" w:type="dxa"/>
             <w:tcBorders>
               <w:top w:val="single" w:sz="4" w:space="0" w:color="7F7F7F"/>
               <w:bottom w:val="single" w:sz="4" w:space="0" w:color="7F7F7F"/>
@@ -2029,57 +2095,13 @@
                 <w:szCs w:val="16"/>
                 <w:lang w:val="en-US"/>
               </w:rPr>
-              <w:t>{</w:t>
-            </w:r>
-            <w:r>
-              <w:rPr>
-                <w:rFonts w:cs="Arial"/>
-                <w:b w:val="false"/>
-                <w:bCs w:val="false"/>
-                <w:sz w:val="16"/>
-                <w:szCs w:val="16"/>
-                <w:lang w:val="en-US"/>
-              </w:rPr>
-              <w:t>c</w:t>
-            </w:r>
-            <w:r>
-              <w:rPr>
-                <w:rFonts w:cs="Arial"/>
-                <w:b w:val="false"/>
-                <w:bCs w:val="false"/>
-                <w:sz w:val="16"/>
-                <w:szCs w:val="16"/>
-                <w:lang w:val="en-US"/>
-              </w:rPr>
-              <w:t>o</w:t>
-            </w:r>
-            <w:r>
-              <w:rPr>
-                <w:rFonts w:cs="Arial"/>
-                <w:b w:val="false"/>
-                <w:bCs w:val="false"/>
-                <w:sz w:val="16"/>
-                <w:szCs w:val="16"/>
-                <w:lang w:val="en-US"/>
-              </w:rPr>
-              <w:t>ntent</w:t>
-            </w:r>
-            <w:r>
-              <w:rPr>
-                <w:rFonts w:cs="Arial"/>
-                <w:b w:val="false"/>
-                <w:bCs w:val="false"/>
-                <w:sz w:val="16"/>
-                <w:szCs w:val="16"/>
-                <w:lang w:val="en-US"/>
-              </w:rPr>
-              <w:t>}</w:t>
+              <w:t>{content}</w:t>
             </w:r>
           </w:p>
         </w:tc>
         <w:tc>
           <w:tcPr>
-            <w:tcW w:w="820" w:type="dxa"/>
+            <w:tcW w:w="818" w:type="dxa"/>
             <w:tcBorders>
               <w:top w:val="single" w:sz="4" w:space="0" w:color="7F7F7F"/>
               <w:bottom w:val="single" w:sz="4" w:space="0" w:color="7F7F7F"/>
@@ -2171,7 +2193,7 @@
         </w:tc>
         <w:tc>
           <w:tcPr>
-            <w:tcW w:w="1202" w:type="dxa"/>
+            <w:tcW w:w="1204" w:type="dxa"/>
             <w:tcBorders>
               <w:top w:val="single" w:sz="4" w:space="0" w:color="7F7F7F"/>
               <w:bottom w:val="single" w:sz="4" w:space="0" w:color="7F7F7F"/>
@@ -2261,16 +2283,7 @@
                 <w:sz w:val="16"/>
                 <w:szCs w:val="16"/>
               </w:rPr>
-              <w:t>{#discount}</w:t>
-            </w:r>
-            <w:r>
-              <w:rPr>
-                <w:rFonts w:cs="Arial"/>
-                <w:b/>
-                <w:sz w:val="16"/>
-                <w:szCs w:val="16"/>
-              </w:rPr>
-              <w:t>Projektrabatt</w:t>
+              <w:t>{#discount}Projektrabatt</w:t>
             </w:r>
           </w:p>
           <w:p>
@@ -2292,25 +2305,7 @@
                 <w:sz w:val="16"/>
                 <w:szCs w:val="16"/>
               </w:rPr>
-              <w:t xml:space="preserve">- erste </w:t>
-            </w:r>
-            <w:r>
-              <w:rPr>
-                <w:rFonts w:cs="Arial"/>
-                <w:bCs/>
-                <w:sz w:val="16"/>
-                <w:szCs w:val="16"/>
-              </w:rPr>
-              <w:t>{free_months}</w:t>
-            </w:r>
-            <w:r>
-              <w:rPr>
-                <w:rFonts w:cs="Arial"/>
-                <w:bCs/>
-                <w:sz w:val="16"/>
-                <w:szCs w:val="16"/>
-              </w:rPr>
-              <w:t xml:space="preserve"> Monate kostenfrei</w:t>
+              <w:t>- erste {free_months} Monate kostenfrei</w:t>
             </w:r>
           </w:p>
           <w:p>
@@ -2333,22 +2328,13 @@
                 <w:sz w:val="16"/>
                 <w:szCs w:val="16"/>
               </w:rPr>
-              <w:t xml:space="preserve">- bei einer Bestellung bis zum </w:t>
-            </w:r>
-            <w:r>
-              <w:rPr>
-                <w:rFonts w:cs="Arial"/>
-                <w:bCs/>
-                <w:sz w:val="16"/>
-                <w:szCs w:val="16"/>
-              </w:rPr>
-              <w:t>{valid_until}</w:t>
+              <w:t>- bei einer Bestellung bis zum {valid_until}</w:t>
             </w:r>
           </w:p>
         </w:tc>
         <w:tc>
           <w:tcPr>
-            <w:tcW w:w="820" w:type="dxa"/>
+            <w:tcW w:w="818" w:type="dxa"/>
             <w:tcBorders>
               <w:bottom w:val="single" w:sz="4" w:space="0" w:color="7F7F7F"/>
             </w:tcBorders>
@@ -2402,7 +2388,7 @@
                 <w:szCs w:val="16"/>
                 <w:lang w:val="en-US"/>
               </w:rPr>
-              <w:t>-1,68</w:t>
+              <w:t>{eur_user_month}</w:t>
             </w:r>
           </w:p>
         </w:tc>
@@ -2437,7 +2423,7 @@
         </w:tc>
         <w:tc>
           <w:tcPr>
-            <w:tcW w:w="1202" w:type="dxa"/>
+            <w:tcW w:w="1204" w:type="dxa"/>
             <w:tcBorders>
               <w:bottom w:val="single" w:sz="4" w:space="0" w:color="7F7F7F"/>
             </w:tcBorders>
@@ -2555,7 +2541,7 @@
         </w:tc>
         <w:tc>
           <w:tcPr>
-            <w:tcW w:w="820" w:type="dxa"/>
+            <w:tcW w:w="818" w:type="dxa"/>
             <w:tcBorders>
               <w:bottom w:val="single" w:sz="4" w:space="0" w:color="7F7F7F"/>
             </w:tcBorders>
@@ -2642,7 +2628,7 @@
         </w:tc>
         <w:tc>
           <w:tcPr>
-            <w:tcW w:w="1202" w:type="dxa"/>
+            <w:tcW w:w="1204" w:type="dxa"/>
             <w:tcBorders>
               <w:bottom w:val="single" w:sz="4" w:space="0" w:color="7F7F7F"/>
             </w:tcBorders>
@@ -2710,7 +2696,7 @@
         </w:tc>
         <w:tc>
           <w:tcPr>
-            <w:tcW w:w="1812" w:type="dxa"/>
+            <w:tcW w:w="1810" w:type="dxa"/>
             <w:gridSpan w:val="2"/>
             <w:tcBorders>
               <w:top w:val="single" w:sz="4" w:space="0" w:color="7F7F7F"/>
@@ -2778,7 +2764,7 @@
         </w:tc>
         <w:tc>
           <w:tcPr>
-            <w:tcW w:w="1202" w:type="dxa"/>
+            <w:tcW w:w="1204" w:type="dxa"/>
             <w:tcBorders>
               <w:top w:val="single" w:sz="4" w:space="0" w:color="7F7F7F"/>
               <w:bottom w:val="single" w:sz="4" w:space="0" w:color="7F7F7F"/>
@@ -2806,37 +2792,7 @@
                 <w:szCs w:val="16"/>
                 <w:lang w:val="de-DE" w:eastAsia="de-DE"/>
               </w:rPr>
-              <w:t>{</w:t>
-            </w:r>
-            <w:r>
-              <w:rPr>
-                <w:b/>
-                <w:color w:val="000000"/>
-                <w:sz w:val="16"/>
-                <w:szCs w:val="16"/>
-                <w:lang w:val="de-DE" w:eastAsia="de-DE"/>
-              </w:rPr>
-              <w:t>t</w:t>
-            </w:r>
-            <w:r>
-              <w:rPr>
-                <w:b/>
-                <w:color w:val="000000"/>
-                <w:sz w:val="16"/>
-                <w:szCs w:val="16"/>
-                <w:lang w:val="de-DE" w:eastAsia="de-DE"/>
-              </w:rPr>
-              <w:t>otal</w:t>
-            </w:r>
-            <w:r>
-              <w:rPr>
-                <w:b/>
-                <w:color w:val="000000"/>
-                <w:sz w:val="16"/>
-                <w:szCs w:val="16"/>
-                <w:lang w:val="de-DE" w:eastAsia="de-DE"/>
-              </w:rPr>
-              <w:t>}</w:t>
+              <w:t>{total}</w:t>
             </w:r>
           </w:p>
         </w:tc>
@@ -2849,7 +2805,38 @@
       </w:pPr>
       <w:r>
         <w:rPr/>
-        <w:t>{/products}</w:t>
+        <w:t>{/</w:t>
+      </w:r>
+      <w:r>
+        <w:rPr/>
+        <w:t>tables</w:t>
+      </w:r>
+      <w:r>
+        <w:rPr/>
+        <w:t>}</w:t>
+      </w:r>
+    </w:p>
+    <w:p>
+      <w:pPr>
+        <w:pStyle w:val="dignumStandardvor0nach0"/>
+        <w:rPr/>
+      </w:pPr>
+      <w:r>
+        <w:rPr/>
+      </w:r>
+    </w:p>
+    <w:p>
+      <w:pPr>
+        <w:pStyle w:val="Normal"/>
+        <w:widowControl/>
+        <w:suppressAutoHyphens w:val="true"/>
+        <w:bidi w:val="0"/>
+        <w:spacing w:lineRule="exact" w:line="240" w:before="0" w:after="80"/>
+        <w:jc w:val="start"/>
+        <w:rPr/>
+      </w:pPr>
+      <w:r>
+        <w:rPr/>
       </w:r>
     </w:p>
     <w:sectPr>
@@ -2900,12 +2887,12 @@
         <w:bottom w:w="0" w:type="dxa"/>
         <w:end w:w="108" w:type="dxa"/>
       </w:tblCellMar>
-      <w:tblLook w:noHBand="0" w:lastColumn="1" w:firstColumn="1" w:lastRow="1" w:firstRow="1" w:noVBand="0" w:val="01e0"/>
+      <w:tblLook w:noHBand="0" w:noVBand="0" w:firstColumn="1" w:lastRow="1" w:lastColumn="1" w:firstRow="1" w:val="01e0"/>
     </w:tblPr>
     <w:tblGrid>
       <w:gridCol w:w="3012"/>
-      <w:gridCol w:w="2956"/>
-      <w:gridCol w:w="4097"/>
+      <w:gridCol w:w="2954"/>
+      <w:gridCol w:w="4099"/>
     </w:tblGrid>
     <w:tr>
       <w:trPr>
@@ -2967,7 +2954,7 @@
       </w:tc>
       <w:tc>
         <w:tcPr>
-          <w:tcW w:w="2956" w:type="dxa"/>
+          <w:tcW w:w="2954" w:type="dxa"/>
           <w:tcBorders>
             <w:start w:val="single" w:sz="4" w:space="0" w:color="7F7F7F"/>
             <w:end w:val="single" w:sz="4" w:space="0" w:color="7F7F7F"/>
@@ -3026,7 +3013,7 @@
       </w:tc>
       <w:tc>
         <w:tcPr>
-          <w:tcW w:w="4097" w:type="dxa"/>
+          <w:tcW w:w="4099" w:type="dxa"/>
           <w:tcBorders>
             <w:start w:val="single" w:sz="4" w:space="0" w:color="7F7F7F"/>
           </w:tcBorders>
@@ -3141,7 +3128,7 @@
       </w:tc>
       <w:tc>
         <w:tcPr>
-          <w:tcW w:w="2956" w:type="dxa"/>
+          <w:tcW w:w="2954" w:type="dxa"/>
           <w:tcBorders>
             <w:start w:val="single" w:sz="4" w:space="0" w:color="7F7F7F"/>
             <w:end w:val="single" w:sz="4" w:space="0" w:color="7F7F7F"/>
@@ -3200,7 +3187,7 @@
       </w:tc>
       <w:tc>
         <w:tcPr>
-          <w:tcW w:w="4097" w:type="dxa"/>
+          <w:tcW w:w="4099" w:type="dxa"/>
           <w:tcBorders>
             <w:start w:val="single" w:sz="4" w:space="0" w:color="7F7F7F"/>
           </w:tcBorders>
@@ -3320,7 +3307,7 @@
       </w:tc>
       <w:tc>
         <w:tcPr>
-          <w:tcW w:w="2956" w:type="dxa"/>
+          <w:tcW w:w="2954" w:type="dxa"/>
           <w:tcBorders>
             <w:start w:val="single" w:sz="4" w:space="0" w:color="7F7F7F"/>
             <w:end w:val="single" w:sz="4" w:space="0" w:color="7F7F7F"/>
@@ -3379,7 +3366,7 @@
       </w:tc>
       <w:tc>
         <w:tcPr>
-          <w:tcW w:w="4097" w:type="dxa"/>
+          <w:tcW w:w="4099" w:type="dxa"/>
           <w:tcBorders>
             <w:start w:val="single" w:sz="4" w:space="0" w:color="7F7F7F"/>
           </w:tcBorders>
@@ -3508,7 +3495,7 @@
       </w:tc>
       <w:tc>
         <w:tcPr>
-          <w:tcW w:w="2956" w:type="dxa"/>
+          <w:tcW w:w="2954" w:type="dxa"/>
           <w:tcBorders>
             <w:start w:val="single" w:sz="4" w:space="0" w:color="7F7F7F"/>
             <w:end w:val="single" w:sz="4" w:space="0" w:color="7F7F7F"/>
@@ -3567,7 +3554,7 @@
       </w:tc>
       <w:tc>
         <w:tcPr>
-          <w:tcW w:w="4097" w:type="dxa"/>
+          <w:tcW w:w="4099" w:type="dxa"/>
           <w:tcBorders>
             <w:start w:val="single" w:sz="4" w:space="0" w:color="7F7F7F"/>
           </w:tcBorders>
@@ -3628,12 +3615,12 @@
         <w:bottom w:w="0" w:type="dxa"/>
         <w:end w:w="108" w:type="dxa"/>
       </w:tblCellMar>
-      <w:tblLook w:noHBand="0" w:lastColumn="1" w:firstColumn="1" w:lastRow="1" w:firstRow="1" w:noVBand="0" w:val="01e0"/>
+      <w:tblLook w:noHBand="0" w:noVBand="0" w:firstColumn="1" w:lastRow="1" w:lastColumn="1" w:firstRow="1" w:val="01e0"/>
     </w:tblPr>
     <w:tblGrid>
       <w:gridCol w:w="3012"/>
-      <w:gridCol w:w="2956"/>
-      <w:gridCol w:w="4097"/>
+      <w:gridCol w:w="2954"/>
+      <w:gridCol w:w="4099"/>
     </w:tblGrid>
     <w:tr>
       <w:trPr>
@@ -3695,7 +3682,7 @@
       </w:tc>
       <w:tc>
         <w:tcPr>
-          <w:tcW w:w="2956" w:type="dxa"/>
+          <w:tcW w:w="2954" w:type="dxa"/>
           <w:tcBorders>
             <w:start w:val="single" w:sz="4" w:space="0" w:color="7F7F7F"/>
             <w:end w:val="single" w:sz="4" w:space="0" w:color="7F7F7F"/>
@@ -3754,7 +3741,7 @@
       </w:tc>
       <w:tc>
         <w:tcPr>
-          <w:tcW w:w="4097" w:type="dxa"/>
+          <w:tcW w:w="4099" w:type="dxa"/>
           <w:tcBorders>
             <w:start w:val="single" w:sz="4" w:space="0" w:color="7F7F7F"/>
           </w:tcBorders>
@@ -3869,7 +3856,7 @@
       </w:tc>
       <w:tc>
         <w:tcPr>
-          <w:tcW w:w="2956" w:type="dxa"/>
+          <w:tcW w:w="2954" w:type="dxa"/>
           <w:tcBorders>
             <w:start w:val="single" w:sz="4" w:space="0" w:color="7F7F7F"/>
             <w:end w:val="single" w:sz="4" w:space="0" w:color="7F7F7F"/>
@@ -3928,7 +3915,7 @@
       </w:tc>
       <w:tc>
         <w:tcPr>
-          <w:tcW w:w="4097" w:type="dxa"/>
+          <w:tcW w:w="4099" w:type="dxa"/>
           <w:tcBorders>
             <w:start w:val="single" w:sz="4" w:space="0" w:color="7F7F7F"/>
           </w:tcBorders>
@@ -4048,7 +4035,7 @@
       </w:tc>
       <w:tc>
         <w:tcPr>
-          <w:tcW w:w="2956" w:type="dxa"/>
+          <w:tcW w:w="2954" w:type="dxa"/>
           <w:tcBorders>
             <w:start w:val="single" w:sz="4" w:space="0" w:color="7F7F7F"/>
             <w:end w:val="single" w:sz="4" w:space="0" w:color="7F7F7F"/>
@@ -4107,7 +4094,7 @@
       </w:tc>
       <w:tc>
         <w:tcPr>
-          <w:tcW w:w="4097" w:type="dxa"/>
+          <w:tcW w:w="4099" w:type="dxa"/>
           <w:tcBorders>
             <w:start w:val="single" w:sz="4" w:space="0" w:color="7F7F7F"/>
           </w:tcBorders>
@@ -4236,7 +4223,7 @@
       </w:tc>
       <w:tc>
         <w:tcPr>
-          <w:tcW w:w="2956" w:type="dxa"/>
+          <w:tcW w:w="2954" w:type="dxa"/>
           <w:tcBorders>
             <w:start w:val="single" w:sz="4" w:space="0" w:color="7F7F7F"/>
             <w:end w:val="single" w:sz="4" w:space="0" w:color="7F7F7F"/>
@@ -4295,7 +4282,7 @@
       </w:tc>
       <w:tc>
         <w:tcPr>
-          <w:tcW w:w="4097" w:type="dxa"/>
+          <w:tcW w:w="4099" w:type="dxa"/>
           <w:tcBorders>
             <w:start w:val="single" w:sz="4" w:space="0" w:color="7F7F7F"/>
           </w:tcBorders>
@@ -4460,7 +4447,7 @@
         <w:sz w:val="16"/>
         <w:szCs w:val="16"/>
       </w:rPr>
-      <w:t>2</w:t>
+      <w:t>1</w:t>
     </w:r>
     <w:r>
       <w:rPr>
@@ -4684,7 +4671,7 @@
         <w:sz w:val="16"/>
         <w:szCs w:val="16"/>
       </w:rPr>
-      <w:t>2</w:t>
+      <w:t>1</w:t>
     </w:r>
     <w:r>
       <w:rPr>
@@ -5861,6 +5848,125 @@
       </w:rPr>
     </w:lvl>
   </w:abstractNum>
+  <w:abstractNum w:abstractNumId="9">
+    <w:lvl w:ilvl="0">
+      <w:start w:val="1"/>
+      <w:numFmt w:val="upperLetter"/>
+      <w:lvlText w:val="%1)"/>
+      <w:lvlJc w:val="start"/>
+      <w:pPr>
+        <w:tabs>
+          <w:tab w:val="num" w:pos="720"/>
+        </w:tabs>
+        <w:ind w:start="720" w:hanging="360"/>
+      </w:pPr>
+      <w:rPr/>
+    </w:lvl>
+    <w:lvl w:ilvl="1">
+      <w:start w:val="1"/>
+      <w:numFmt w:val="upperLetter"/>
+      <w:lvlText w:val="%2)"/>
+      <w:lvlJc w:val="start"/>
+      <w:pPr>
+        <w:tabs>
+          <w:tab w:val="num" w:pos="1080"/>
+        </w:tabs>
+        <w:ind w:start="1080" w:hanging="360"/>
+      </w:pPr>
+      <w:rPr/>
+    </w:lvl>
+    <w:lvl w:ilvl="2">
+      <w:start w:val="1"/>
+      <w:numFmt w:val="upperLetter"/>
+      <w:lvlText w:val="%3)"/>
+      <w:lvlJc w:val="start"/>
+      <w:pPr>
+        <w:tabs>
+          <w:tab w:val="num" w:pos="1440"/>
+        </w:tabs>
+        <w:ind w:start="1440" w:hanging="360"/>
+      </w:pPr>
+      <w:rPr/>
+    </w:lvl>
+    <w:lvl w:ilvl="3">
+      <w:start w:val="1"/>
+      <w:numFmt w:val="upperLetter"/>
+      <w:lvlText w:val="%4)"/>
+      <w:lvlJc w:val="start"/>
+      <w:pPr>
+        <w:tabs>
+          <w:tab w:val="num" w:pos="1800"/>
+        </w:tabs>
+        <w:ind w:start="1800" w:hanging="360"/>
+      </w:pPr>
+      <w:rPr/>
+    </w:lvl>
+    <w:lvl w:ilvl="4">
+      <w:start w:val="1"/>
+      <w:numFmt w:val="upperLetter"/>
+      <w:lvlText w:val="%5)"/>
+      <w:lvlJc w:val="start"/>
+      <w:pPr>
+        <w:tabs>
+          <w:tab w:val="num" w:pos="2160"/>
+        </w:tabs>
+        <w:ind w:start="2160" w:hanging="360"/>
+      </w:pPr>
+      <w:rPr/>
+    </w:lvl>
+    <w:lvl w:ilvl="5">
+      <w:start w:val="1"/>
+      <w:numFmt w:val="upperLetter"/>
+      <w:lvlText w:val="%6)"/>
+      <w:lvlJc w:val="start"/>
+      <w:pPr>
+        <w:tabs>
+          <w:tab w:val="num" w:pos="2520"/>
+        </w:tabs>
+        <w:ind w:start="2520" w:hanging="360"/>
+      </w:pPr>
+      <w:rPr/>
+    </w:lvl>
+    <w:lvl w:ilvl="6">
+      <w:start w:val="1"/>
+      <w:numFmt w:val="upperLetter"/>
+      <w:lvlText w:val="%7)"/>
+      <w:lvlJc w:val="start"/>
+      <w:pPr>
+        <w:tabs>
+          <w:tab w:val="num" w:pos="2880"/>
+        </w:tabs>
+        <w:ind w:start="2880" w:hanging="360"/>
+      </w:pPr>
+      <w:rPr/>
+    </w:lvl>
+    <w:lvl w:ilvl="7">
+      <w:start w:val="1"/>
+      <w:numFmt w:val="upperLetter"/>
+      <w:lvlText w:val="%8)"/>
+      <w:lvlJc w:val="start"/>
+      <w:pPr>
+        <w:tabs>
+          <w:tab w:val="num" w:pos="3240"/>
+        </w:tabs>
+        <w:ind w:start="3240" w:hanging="360"/>
+      </w:pPr>
+      <w:rPr/>
+    </w:lvl>
+    <w:lvl w:ilvl="8">
+      <w:start w:val="1"/>
+      <w:numFmt w:val="upperLetter"/>
+      <w:lvlText w:val="%9)"/>
+      <w:lvlJc w:val="start"/>
+      <w:pPr>
+        <w:tabs>
+          <w:tab w:val="num" w:pos="3600"/>
+        </w:tabs>
+        <w:ind w:start="3600" w:hanging="360"/>
+      </w:pPr>
+      <w:rPr/>
+    </w:lvl>
+  </w:abstractNum>
   <w:num w:numId="1">
     <w:abstractNumId w:val="1"/>
   </w:num>
@@ -5884,6 +5990,9 @@
   </w:num>
   <w:num w:numId="8">
     <w:abstractNumId w:val="8"/>
+  </w:num>
+  <w:num w:numId="9">
+    <w:abstractNumId w:val="9"/>
   </w:num>
 </w:numbering>
 </file>

</xml_diff>

<commit_message>
customer schema refactored, bug fixed
</commit_message>
<xml_diff>
--- a/server/assets/templates/offer.docx
+++ b/server/assets/templates/offer.docx
@@ -304,7 +304,6 @@
             </w:pPr>
             <w:r>
               <w:rPr/>
-              <w:t>{customer.id}</w:t>
             </w:r>
           </w:p>
         </w:tc>
@@ -353,7 +352,6 @@
             </w:pPr>
             <w:r>
               <w:rPr/>
-              <w:t>{supplierId}</w:t>
             </w:r>
           </w:p>
         </w:tc>
@@ -1463,8 +1461,8 @@
         <w:gridCol w:w="4950"/>
         <w:gridCol w:w="816"/>
         <w:gridCol w:w="990"/>
-        <w:gridCol w:w="991"/>
-        <w:gridCol w:w="1208"/>
+        <w:gridCol w:w="990"/>
+        <w:gridCol w:w="1209"/>
       </w:tblGrid>
       <w:tr>
         <w:trPr>
@@ -1649,7 +1647,7 @@
         </w:tc>
         <w:tc>
           <w:tcPr>
-            <w:tcW w:w="991" w:type="dxa"/>
+            <w:tcW w:w="990" w:type="dxa"/>
             <w:tcBorders>
               <w:top w:val="single" w:sz="4" w:space="0" w:color="000000"/>
               <w:bottom w:val="single" w:sz="4" w:space="0" w:color="000000"/>
@@ -1740,7 +1738,7 @@
         </w:tc>
         <w:tc>
           <w:tcPr>
-            <w:tcW w:w="1208" w:type="dxa"/>
+            <w:tcW w:w="1209" w:type="dxa"/>
             <w:tcBorders>
               <w:top w:val="single" w:sz="4" w:space="0" w:color="000000"/>
               <w:bottom w:val="single" w:sz="4" w:space="0" w:color="000000"/>
@@ -1910,7 +1908,7 @@
         </w:tc>
         <w:tc>
           <w:tcPr>
-            <w:tcW w:w="991" w:type="dxa"/>
+            <w:tcW w:w="990" w:type="dxa"/>
             <w:tcBorders>
               <w:top w:val="single" w:sz="4" w:space="0" w:color="7F7F7F"/>
               <w:bottom w:val="single" w:sz="4" w:space="0" w:color="7F7F7F"/>
@@ -1942,7 +1940,7 @@
         </w:tc>
         <w:tc>
           <w:tcPr>
-            <w:tcW w:w="1208" w:type="dxa"/>
+            <w:tcW w:w="1209" w:type="dxa"/>
             <w:tcBorders>
               <w:top w:val="single" w:sz="4" w:space="0" w:color="7F7F7F"/>
               <w:bottom w:val="single" w:sz="4" w:space="0" w:color="7F7F7F"/>
@@ -2124,7 +2122,7 @@
         </w:tc>
         <w:tc>
           <w:tcPr>
-            <w:tcW w:w="991" w:type="dxa"/>
+            <w:tcW w:w="990" w:type="dxa"/>
             <w:tcBorders>
               <w:top w:val="single" w:sz="4" w:space="0" w:color="7F7F7F"/>
               <w:bottom w:val="single" w:sz="4" w:space="0" w:color="7F7F7F"/>
@@ -2154,7 +2152,7 @@
         </w:tc>
         <w:tc>
           <w:tcPr>
-            <w:tcW w:w="1208" w:type="dxa"/>
+            <w:tcW w:w="1209" w:type="dxa"/>
             <w:tcBorders>
               <w:top w:val="single" w:sz="4" w:space="0" w:color="7F7F7F"/>
               <w:bottom w:val="single" w:sz="4" w:space="0" w:color="7F7F7F"/>
@@ -2355,7 +2353,7 @@
         </w:tc>
         <w:tc>
           <w:tcPr>
-            <w:tcW w:w="991" w:type="dxa"/>
+            <w:tcW w:w="990" w:type="dxa"/>
             <w:tcBorders>
               <w:bottom w:val="single" w:sz="4" w:space="0" w:color="7F7F7F"/>
             </w:tcBorders>
@@ -2384,7 +2382,7 @@
         </w:tc>
         <w:tc>
           <w:tcPr>
-            <w:tcW w:w="1208" w:type="dxa"/>
+            <w:tcW w:w="1209" w:type="dxa"/>
             <w:tcBorders>
               <w:bottom w:val="single" w:sz="4" w:space="0" w:color="7F7F7F"/>
             </w:tcBorders>
@@ -2561,7 +2559,7 @@
         </w:tc>
         <w:tc>
           <w:tcPr>
-            <w:tcW w:w="991" w:type="dxa"/>
+            <w:tcW w:w="990" w:type="dxa"/>
             <w:tcBorders>
               <w:bottom w:val="single" w:sz="4" w:space="0" w:color="7F7F7F"/>
             </w:tcBorders>
@@ -2589,7 +2587,7 @@
         </w:tc>
         <w:tc>
           <w:tcPr>
-            <w:tcW w:w="1208" w:type="dxa"/>
+            <w:tcW w:w="1209" w:type="dxa"/>
             <w:tcBorders>
               <w:bottom w:val="single" w:sz="4" w:space="0" w:color="7F7F7F"/>
             </w:tcBorders>
@@ -2771,7 +2769,7 @@
         </w:tc>
         <w:tc>
           <w:tcPr>
-            <w:tcW w:w="991" w:type="dxa"/>
+            <w:tcW w:w="990" w:type="dxa"/>
             <w:tcBorders>
               <w:bottom w:val="single" w:sz="4" w:space="0" w:color="7F7F7F"/>
             </w:tcBorders>
@@ -2799,7 +2797,7 @@
         </w:tc>
         <w:tc>
           <w:tcPr>
-            <w:tcW w:w="1208" w:type="dxa"/>
+            <w:tcW w:w="1209" w:type="dxa"/>
             <w:tcBorders>
               <w:bottom w:val="single" w:sz="4" w:space="0" w:color="7F7F7F"/>
             </w:tcBorders>
@@ -2902,7 +2900,7 @@
         </w:tc>
         <w:tc>
           <w:tcPr>
-            <w:tcW w:w="991" w:type="dxa"/>
+            <w:tcW w:w="990" w:type="dxa"/>
             <w:tcBorders>
               <w:top w:val="single" w:sz="4" w:space="0" w:color="7F7F7F"/>
               <w:bottom w:val="single" w:sz="4" w:space="0" w:color="7F7F7F"/>
@@ -2935,7 +2933,7 @@
         </w:tc>
         <w:tc>
           <w:tcPr>
-            <w:tcW w:w="1208" w:type="dxa"/>
+            <w:tcW w:w="1209" w:type="dxa"/>
             <w:tcBorders>
               <w:top w:val="single" w:sz="4" w:space="0" w:color="7F7F7F"/>
               <w:bottom w:val="single" w:sz="4" w:space="0" w:color="7F7F7F"/>
@@ -3072,8 +3070,8 @@
     </w:tblPr>
     <w:tblGrid>
       <w:gridCol w:w="3012"/>
-      <w:gridCol w:w="2950"/>
-      <w:gridCol w:w="4103"/>
+      <w:gridCol w:w="2949"/>
+      <w:gridCol w:w="4104"/>
     </w:tblGrid>
     <w:tr>
       <w:trPr>
@@ -3135,7 +3133,7 @@
       </w:tc>
       <w:tc>
         <w:tcPr>
-          <w:tcW w:w="2950" w:type="dxa"/>
+          <w:tcW w:w="2949" w:type="dxa"/>
           <w:tcBorders>
             <w:start w:val="single" w:sz="4" w:space="0" w:color="7F7F7F"/>
             <w:end w:val="single" w:sz="4" w:space="0" w:color="7F7F7F"/>
@@ -3194,7 +3192,7 @@
       </w:tc>
       <w:tc>
         <w:tcPr>
-          <w:tcW w:w="4103" w:type="dxa"/>
+          <w:tcW w:w="4104" w:type="dxa"/>
           <w:tcBorders>
             <w:start w:val="single" w:sz="4" w:space="0" w:color="7F7F7F"/>
           </w:tcBorders>
@@ -3309,7 +3307,7 @@
       </w:tc>
       <w:tc>
         <w:tcPr>
-          <w:tcW w:w="2950" w:type="dxa"/>
+          <w:tcW w:w="2949" w:type="dxa"/>
           <w:tcBorders>
             <w:start w:val="single" w:sz="4" w:space="0" w:color="7F7F7F"/>
             <w:end w:val="single" w:sz="4" w:space="0" w:color="7F7F7F"/>
@@ -3368,7 +3366,7 @@
       </w:tc>
       <w:tc>
         <w:tcPr>
-          <w:tcW w:w="4103" w:type="dxa"/>
+          <w:tcW w:w="4104" w:type="dxa"/>
           <w:tcBorders>
             <w:start w:val="single" w:sz="4" w:space="0" w:color="7F7F7F"/>
           </w:tcBorders>
@@ -3488,7 +3486,7 @@
       </w:tc>
       <w:tc>
         <w:tcPr>
-          <w:tcW w:w="2950" w:type="dxa"/>
+          <w:tcW w:w="2949" w:type="dxa"/>
           <w:tcBorders>
             <w:start w:val="single" w:sz="4" w:space="0" w:color="7F7F7F"/>
             <w:end w:val="single" w:sz="4" w:space="0" w:color="7F7F7F"/>
@@ -3547,7 +3545,7 @@
       </w:tc>
       <w:tc>
         <w:tcPr>
-          <w:tcW w:w="4103" w:type="dxa"/>
+          <w:tcW w:w="4104" w:type="dxa"/>
           <w:tcBorders>
             <w:start w:val="single" w:sz="4" w:space="0" w:color="7F7F7F"/>
           </w:tcBorders>
@@ -3676,7 +3674,7 @@
       </w:tc>
       <w:tc>
         <w:tcPr>
-          <w:tcW w:w="2950" w:type="dxa"/>
+          <w:tcW w:w="2949" w:type="dxa"/>
           <w:tcBorders>
             <w:start w:val="single" w:sz="4" w:space="0" w:color="7F7F7F"/>
             <w:end w:val="single" w:sz="4" w:space="0" w:color="7F7F7F"/>
@@ -3735,7 +3733,7 @@
       </w:tc>
       <w:tc>
         <w:tcPr>
-          <w:tcW w:w="4103" w:type="dxa"/>
+          <w:tcW w:w="4104" w:type="dxa"/>
           <w:tcBorders>
             <w:start w:val="single" w:sz="4" w:space="0" w:color="7F7F7F"/>
           </w:tcBorders>
@@ -3800,8 +3798,8 @@
     </w:tblPr>
     <w:tblGrid>
       <w:gridCol w:w="3012"/>
-      <w:gridCol w:w="2950"/>
-      <w:gridCol w:w="4103"/>
+      <w:gridCol w:w="2949"/>
+      <w:gridCol w:w="4104"/>
     </w:tblGrid>
     <w:tr>
       <w:trPr>
@@ -3863,7 +3861,7 @@
       </w:tc>
       <w:tc>
         <w:tcPr>
-          <w:tcW w:w="2950" w:type="dxa"/>
+          <w:tcW w:w="2949" w:type="dxa"/>
           <w:tcBorders>
             <w:start w:val="single" w:sz="4" w:space="0" w:color="7F7F7F"/>
             <w:end w:val="single" w:sz="4" w:space="0" w:color="7F7F7F"/>
@@ -3922,7 +3920,7 @@
       </w:tc>
       <w:tc>
         <w:tcPr>
-          <w:tcW w:w="4103" w:type="dxa"/>
+          <w:tcW w:w="4104" w:type="dxa"/>
           <w:tcBorders>
             <w:start w:val="single" w:sz="4" w:space="0" w:color="7F7F7F"/>
           </w:tcBorders>
@@ -4037,7 +4035,7 @@
       </w:tc>
       <w:tc>
         <w:tcPr>
-          <w:tcW w:w="2950" w:type="dxa"/>
+          <w:tcW w:w="2949" w:type="dxa"/>
           <w:tcBorders>
             <w:start w:val="single" w:sz="4" w:space="0" w:color="7F7F7F"/>
             <w:end w:val="single" w:sz="4" w:space="0" w:color="7F7F7F"/>
@@ -4096,7 +4094,7 @@
       </w:tc>
       <w:tc>
         <w:tcPr>
-          <w:tcW w:w="4103" w:type="dxa"/>
+          <w:tcW w:w="4104" w:type="dxa"/>
           <w:tcBorders>
             <w:start w:val="single" w:sz="4" w:space="0" w:color="7F7F7F"/>
           </w:tcBorders>
@@ -4216,7 +4214,7 @@
       </w:tc>
       <w:tc>
         <w:tcPr>
-          <w:tcW w:w="2950" w:type="dxa"/>
+          <w:tcW w:w="2949" w:type="dxa"/>
           <w:tcBorders>
             <w:start w:val="single" w:sz="4" w:space="0" w:color="7F7F7F"/>
             <w:end w:val="single" w:sz="4" w:space="0" w:color="7F7F7F"/>
@@ -4275,7 +4273,7 @@
       </w:tc>
       <w:tc>
         <w:tcPr>
-          <w:tcW w:w="4103" w:type="dxa"/>
+          <w:tcW w:w="4104" w:type="dxa"/>
           <w:tcBorders>
             <w:start w:val="single" w:sz="4" w:space="0" w:color="7F7F7F"/>
           </w:tcBorders>
@@ -4404,7 +4402,7 @@
       </w:tc>
       <w:tc>
         <w:tcPr>
-          <w:tcW w:w="2950" w:type="dxa"/>
+          <w:tcW w:w="2949" w:type="dxa"/>
           <w:tcBorders>
             <w:start w:val="single" w:sz="4" w:space="0" w:color="7F7F7F"/>
             <w:end w:val="single" w:sz="4" w:space="0" w:color="7F7F7F"/>
@@ -4463,7 +4461,7 @@
       </w:tc>
       <w:tc>
         <w:tcPr>
-          <w:tcW w:w="4103" w:type="dxa"/>
+          <w:tcW w:w="4104" w:type="dxa"/>
           <w:tcBorders>
             <w:start w:val="single" w:sz="4" w:space="0" w:color="7F7F7F"/>
           </w:tcBorders>
@@ -6939,8 +6937,8 @@
     <w:qFormat/>
     <w:rPr/>
   </w:style>
-  <w:style w:type="character" w:styleId="Bullets">
-    <w:name w:val="Bullets"/>
+  <w:style w:type="character" w:styleId="Bulletsuser">
+    <w:name w:val="Bullets (user)"/>
     <w:qFormat/>
     <w:rPr>
       <w:rFonts w:ascii="OpenSymbol" w:hAnsi="OpenSymbol" w:eastAsia="OpenSymbol" w:cs="OpenSymbol"/>
@@ -7542,8 +7540,8 @@
     </w:pPr>
     <w:rPr/>
   </w:style>
-  <w:style w:type="paragraph" w:styleId="FrameContents">
-    <w:name w:val="Frame Contents"/>
+  <w:style w:type="paragraph" w:styleId="FrameContentsuser">
+    <w:name w:val="Frame Contents (user)"/>
     <w:basedOn w:val="Normal"/>
     <w:qFormat/>
     <w:pPr/>
@@ -7569,8 +7567,8 @@
     <w:pPr/>
     <w:rPr/>
   </w:style>
-  <w:style w:type="paragraph" w:styleId="FrameContentsuser">
-    <w:name w:val="Frame Contents (user)"/>
+  <w:style w:type="paragraph" w:styleId="FrameContents">
+    <w:name w:val="Frame Contents"/>
     <w:basedOn w:val="Normal"/>
     <w:qFormat/>
     <w:pPr/>
@@ -7610,8 +7608,8 @@
     <w:name w:val="Nummerierung 123"/>
     <w:qFormat/>
   </w:style>
-  <w:style w:type="numbering" w:styleId="Bullet">
-    <w:name w:val="Bullet •"/>
+  <w:style w:type="numbering" w:styleId="Bulletuser">
+    <w:name w:val="Bullet • (user)"/>
     <w:qFormat/>
   </w:style>
   <w:style w:type="table" w:default="1" w:styleId="NormaleTabelle">

</xml_diff>